<commit_message>
manuscript updated and prototypical_xai implemented
</commit_message>
<xml_diff>
--- a/segmentation/papers/research paper sample/manuscript.docx
+++ b/segmentation/papers/research paper sample/manuscript.docx
@@ -95,6 +95,7 @@
         </w:rPr>
         <w:t xml:space="preserve"> Hasan</w:t>
       </w:r>
+      <w:proofErr w:type="gramStart"/>
       <w:r>
         <w:rPr>
           <w:rFonts w:ascii="Times New Roman" w:hAnsi="Times New Roman" w:cs="Times New Roman"/>
@@ -111,37 +112,48 @@
           <w:color w:val="000000" w:themeColor="text1"/>
           <w:sz w:val="24"/>
           <w:szCs w:val="24"/>
+          <w:vertAlign w:val="superscript"/>
+        </w:rPr>
+        <w:t>,*</w:t>
+      </w:r>
+      <w:proofErr w:type="gramEnd"/>
+      <w:r>
+        <w:rPr>
+          <w:rFonts w:ascii="Times New Roman" w:hAnsi="Times New Roman" w:cs="Times New Roman"/>
+          <w:color w:val="000000" w:themeColor="text1"/>
+          <w:sz w:val="24"/>
+          <w:szCs w:val="24"/>
         </w:rPr>
         <w:t xml:space="preserve">, </w:t>
       </w:r>
-      <w:proofErr w:type="spellStart"/>
-      <w:r>
-        <w:rPr>
-          <w:rFonts w:ascii="Times New Roman" w:hAnsi="Times New Roman" w:cs="Times New Roman"/>
-          <w:color w:val="000000" w:themeColor="text1"/>
-          <w:sz w:val="24"/>
-          <w:szCs w:val="24"/>
-        </w:rPr>
-        <w:t>M</w:t>
-      </w:r>
-      <w:r>
-        <w:rPr>
-          <w:rFonts w:ascii="Times New Roman" w:hAnsi="Times New Roman" w:cs="Times New Roman"/>
-          <w:color w:val="000000" w:themeColor="text1"/>
-          <w:sz w:val="24"/>
-          <w:szCs w:val="24"/>
-        </w:rPr>
-        <w:t>usrrat</w:t>
-      </w:r>
-      <w:proofErr w:type="spellEnd"/>
-      <w:r>
-        <w:rPr>
-          <w:rFonts w:ascii="Times New Roman" w:hAnsi="Times New Roman" w:cs="Times New Roman"/>
-          <w:color w:val="000000" w:themeColor="text1"/>
-          <w:sz w:val="24"/>
-          <w:szCs w:val="24"/>
-        </w:rPr>
-        <w:t xml:space="preserve"> Ali</w:t>
+      <w:r>
+        <w:rPr>
+          <w:rFonts w:ascii="Times New Roman" w:hAnsi="Times New Roman" w:cs="Times New Roman"/>
+          <w:color w:val="000000" w:themeColor="text1"/>
+          <w:sz w:val="24"/>
+          <w:szCs w:val="24"/>
+        </w:rPr>
+        <w:t xml:space="preserve">Mohammad </w:t>
+      </w:r>
+      <w:proofErr w:type="spellStart"/>
+      <w:r>
+        <w:rPr>
+          <w:rFonts w:ascii="Times New Roman" w:hAnsi="Times New Roman" w:cs="Times New Roman"/>
+          <w:color w:val="000000" w:themeColor="text1"/>
+          <w:sz w:val="24"/>
+          <w:szCs w:val="24"/>
+        </w:rPr>
+        <w:t>Shorif</w:t>
+      </w:r>
+      <w:proofErr w:type="spellEnd"/>
+      <w:r>
+        <w:rPr>
+          <w:rFonts w:ascii="Times New Roman" w:hAnsi="Times New Roman" w:cs="Times New Roman"/>
+          <w:color w:val="000000" w:themeColor="text1"/>
+          <w:sz w:val="24"/>
+          <w:szCs w:val="24"/>
+        </w:rPr>
+        <w:t xml:space="preserve"> Uddin</w:t>
       </w:r>
       <w:r>
         <w:rPr>
@@ -169,29 +181,8 @@
           <w:sz w:val="24"/>
           <w:szCs w:val="24"/>
         </w:rPr>
-        <w:t xml:space="preserve">Mohammad </w:t>
-      </w:r>
-      <w:proofErr w:type="spellStart"/>
-      <w:r>
-        <w:rPr>
-          <w:rFonts w:ascii="Times New Roman" w:hAnsi="Times New Roman" w:cs="Times New Roman"/>
-          <w:color w:val="000000" w:themeColor="text1"/>
-          <w:sz w:val="24"/>
-          <w:szCs w:val="24"/>
-        </w:rPr>
-        <w:t>Shorif</w:t>
-      </w:r>
-      <w:proofErr w:type="spellEnd"/>
-      <w:r>
-        <w:rPr>
-          <w:rFonts w:ascii="Times New Roman" w:hAnsi="Times New Roman" w:cs="Times New Roman"/>
-          <w:color w:val="000000" w:themeColor="text1"/>
-          <w:sz w:val="24"/>
-          <w:szCs w:val="24"/>
-        </w:rPr>
-        <w:t xml:space="preserve"> Uddin</w:t>
-      </w:r>
-      <w:proofErr w:type="gramStart"/>
+        <w:t>Amina Khatun</w:t>
+      </w:r>
       <w:r>
         <w:rPr>
           <w:rFonts w:ascii="Times New Roman" w:hAnsi="Times New Roman" w:cs="Times New Roman"/>
@@ -201,26 +192,6 @@
           <w:vertAlign w:val="superscript"/>
         </w:rPr>
         <w:t>3</w:t>
-      </w:r>
-      <w:r>
-        <w:rPr>
-          <w:rFonts w:ascii="Times New Roman" w:hAnsi="Times New Roman" w:cs="Times New Roman"/>
-          <w:color w:val="000000" w:themeColor="text1"/>
-          <w:sz w:val="24"/>
-          <w:szCs w:val="24"/>
-          <w:vertAlign w:val="superscript"/>
-        </w:rPr>
-        <w:t>,*</w:t>
-      </w:r>
-      <w:proofErr w:type="gramEnd"/>
-      <w:r>
-        <w:rPr>
-          <w:rFonts w:ascii="Times New Roman" w:hAnsi="Times New Roman" w:cs="Times New Roman"/>
-          <w:color w:val="000000" w:themeColor="text1"/>
-          <w:sz w:val="24"/>
-          <w:szCs w:val="24"/>
-        </w:rPr>
-        <w:t xml:space="preserve"> </w:t>
       </w:r>
     </w:p>
     <w:p>
@@ -280,61 +251,6 @@
         <w:t>Dhaka,  Bangladesh</w:t>
       </w:r>
       <w:proofErr w:type="gramEnd"/>
-    </w:p>
-    <w:p>
-      <w:pPr>
-        <w:spacing w:after="0"/>
-        <w:jc w:val="center"/>
-        <w:rPr>
-          <w:rFonts w:ascii="Times New Roman" w:hAnsi="Times New Roman" w:cs="Times New Roman"/>
-          <w:sz w:val="20"/>
-        </w:rPr>
-      </w:pPr>
-      <w:r>
-        <w:rPr>
-          <w:rFonts w:ascii="Times New Roman" w:hAnsi="Times New Roman" w:cs="Times New Roman"/>
-          <w:sz w:val="20"/>
-          <w:vertAlign w:val="superscript"/>
-        </w:rPr>
-        <w:t>2</w:t>
-      </w:r>
-      <w:r>
-        <w:rPr>
-          <w:rFonts w:ascii="Times New Roman" w:hAnsi="Times New Roman" w:cs="Times New Roman"/>
-          <w:sz w:val="20"/>
-        </w:rPr>
-        <w:t>Dept.</w:t>
-      </w:r>
-      <w:r>
-        <w:rPr>
-          <w:rFonts w:ascii="Times New Roman" w:hAnsi="Times New Roman" w:cs="Times New Roman"/>
-          <w:sz w:val="20"/>
-        </w:rPr>
-        <w:t xml:space="preserve"> of Mathematics and Statistics, College of Science, King Faisal U</w:t>
-      </w:r>
-      <w:r>
-        <w:rPr>
-          <w:rFonts w:ascii="Times New Roman" w:hAnsi="Times New Roman" w:cs="Times New Roman"/>
-          <w:sz w:val="20"/>
-        </w:rPr>
-        <w:t xml:space="preserve">niversity, Al </w:t>
-      </w:r>
-      <w:proofErr w:type="spellStart"/>
-      <w:r>
-        <w:rPr>
-          <w:rFonts w:ascii="Times New Roman" w:hAnsi="Times New Roman" w:cs="Times New Roman"/>
-          <w:sz w:val="20"/>
-        </w:rPr>
-        <w:t>Ahsa</w:t>
-      </w:r>
-      <w:proofErr w:type="spellEnd"/>
-      <w:r>
-        <w:rPr>
-          <w:rFonts w:ascii="Times New Roman" w:hAnsi="Times New Roman" w:cs="Times New Roman"/>
-          <w:sz w:val="20"/>
-        </w:rPr>
-        <w:t xml:space="preserve"> 31982, Saudi Arabia</w:t>
-      </w:r>
       <w:r>
         <w:rPr>
           <w:rFonts w:ascii="Times New Roman" w:hAnsi="Times New Roman" w:cs="Times New Roman"/>
@@ -360,7 +276,7 @@
           <w:szCs w:val="20"/>
           <w:vertAlign w:val="superscript"/>
         </w:rPr>
-        <w:t>3</w:t>
+        <w:t>2</w:t>
       </w:r>
       <w:r>
         <w:rPr>
@@ -428,35 +344,6 @@
           <w:szCs w:val="20"/>
         </w:rPr>
         <w:t>mehadihasan.cse@diu.edu.bd</w:t>
-      </w:r>
-      <w:r>
-        <w:rPr>
-          <w:rFonts w:ascii="Times New Roman" w:hAnsi="Times New Roman" w:cs="Times New Roman"/>
-          <w:color w:val="000000" w:themeColor="text1"/>
-          <w:sz w:val="20"/>
-          <w:szCs w:val="20"/>
-        </w:rPr>
-        <w:t>,</w:t>
-      </w:r>
-      <w:r>
-        <w:rPr>
-          <w:rFonts w:ascii="Times New Roman" w:hAnsi="Times New Roman" w:cs="Times New Roman"/>
-          <w:color w:val="000000" w:themeColor="text1"/>
-          <w:sz w:val="20"/>
-          <w:szCs w:val="20"/>
-        </w:rPr>
-        <w:t xml:space="preserve"> </w:t>
-      </w:r>
-      <w:r>
-        <w:rPr>
-          <w:rStyle w:val="Hyperlink"/>
-          <w:rFonts w:ascii="Times New Roman" w:hAnsi="Times New Roman" w:cs="Times New Roman"/>
-          <w:color w:val="000000" w:themeColor="text1"/>
-          <w:sz w:val="20"/>
-          <w:szCs w:val="20"/>
-          <w:u w:val="none"/>
-        </w:rPr>
-        <w:t>mkasim@kfu.edu.sa</w:t>
       </w:r>
       <w:r>
         <w:rPr>
@@ -477,6 +364,28 @@
           <w:t>shorifuddin@juniv.edu</w:t>
         </w:r>
       </w:hyperlink>
+      <w:r>
+        <w:rPr>
+          <w:rStyle w:val="Hyperlink"/>
+          <w:rFonts w:ascii="Times New Roman" w:hAnsi="Times New Roman" w:cs="Times New Roman"/>
+          <w:color w:val="000000" w:themeColor="text1"/>
+          <w:sz w:val="20"/>
+          <w:szCs w:val="20"/>
+          <w:u w:val="none"/>
+        </w:rPr>
+        <w:t xml:space="preserve">, </w:t>
+      </w:r>
+      <w:r>
+        <w:rPr>
+          <w:rStyle w:val="Hyperlink"/>
+          <w:rFonts w:ascii="Times New Roman" w:hAnsi="Times New Roman" w:cs="Times New Roman"/>
+          <w:color w:val="000000" w:themeColor="text1"/>
+          <w:sz w:val="20"/>
+          <w:szCs w:val="20"/>
+          <w:u w:val="none"/>
+        </w:rPr>
+        <w:t>amina_bashar@juniv.edu</w:t>
+      </w:r>
     </w:p>
     <w:p>
       <w:pPr>
@@ -506,24 +415,6 @@
           <w:szCs w:val="20"/>
         </w:rPr>
         <w:t>0009-0007-0656-1764</w:t>
-      </w:r>
-      <w:r>
-        <w:rPr>
-          <w:rFonts w:ascii="Times New Roman" w:hAnsi="Times New Roman" w:cs="Times New Roman"/>
-          <w:color w:val="000000" w:themeColor="text1"/>
-          <w:sz w:val="20"/>
-          <w:szCs w:val="20"/>
-        </w:rPr>
-        <w:t xml:space="preserve">, </w:t>
-      </w:r>
-      <w:r>
-        <w:rPr>
-          <w:rFonts w:ascii="Times New Roman" w:hAnsi="Times New Roman" w:cs="Times New Roman"/>
-          <w:color w:val="000000" w:themeColor="text1"/>
-          <w:sz w:val="20"/>
-          <w:szCs w:val="20"/>
-        </w:rPr>
-        <w:t>0000-0002-4837-1850</w:t>
       </w:r>
       <w:r>
         <w:rPr>
@@ -855,18 +746,50 @@
           <w:sz w:val="24"/>
           <w:szCs w:val="24"/>
         </w:rPr>
+        <w:t>[5], autonomous driving [6</w:t>
+      </w:r>
+      <w:proofErr w:type="gramStart"/>
+      <w:r>
+        <w:rPr>
+          <w:rFonts w:ascii="Times New Roman" w:hAnsi="Times New Roman" w:cs="Times New Roman"/>
+          <w:bCs/>
+          <w:color w:val="000000" w:themeColor="text1"/>
+          <w:sz w:val="24"/>
+          <w:szCs w:val="24"/>
+        </w:rPr>
+        <w:t>],[</w:t>
+      </w:r>
+      <w:proofErr w:type="gramEnd"/>
+      <w:r>
+        <w:rPr>
+          <w:rFonts w:ascii="Times New Roman" w:hAnsi="Times New Roman" w:cs="Times New Roman"/>
+          <w:bCs/>
+          <w:color w:val="000000" w:themeColor="text1"/>
+          <w:sz w:val="24"/>
+          <w:szCs w:val="24"/>
+        </w:rPr>
+        <w:t>7],[</w:t>
+      </w:r>
+      <w:r>
+        <w:rPr>
+          <w:rFonts w:ascii="Times New Roman" w:hAnsi="Times New Roman" w:cs="Times New Roman"/>
+          <w:bCs/>
+          <w:color w:val="000000" w:themeColor="text1"/>
+          <w:sz w:val="24"/>
+          <w:szCs w:val="24"/>
+        </w:rPr>
+        <w:t xml:space="preserve">8], computational photography [9], picture search engines [10], </w:t>
+      </w:r>
+      <w:r>
+        <w:rPr>
+          <w:rFonts w:ascii="Times New Roman" w:hAnsi="Times New Roman" w:cs="Times New Roman"/>
+          <w:bCs/>
+          <w:color w:val="000000" w:themeColor="text1"/>
+          <w:sz w:val="24"/>
+          <w:szCs w:val="24"/>
+        </w:rPr>
         <w:lastRenderedPageBreak/>
-        <w:t>[5], autonomous driving [6-</w:t>
-      </w:r>
-      <w:r>
-        <w:rPr>
-          <w:rFonts w:ascii="Times New Roman" w:hAnsi="Times New Roman" w:cs="Times New Roman"/>
-          <w:bCs/>
-          <w:color w:val="000000" w:themeColor="text1"/>
-          <w:sz w:val="24"/>
-          <w:szCs w:val="24"/>
-        </w:rPr>
-        <w:t>8], computational photography [9], picture search engines [10], and augmented reality. Two typical concerns are: how to create effective feature representations to distinguish objects of different classes and how to use contextual information to guarantee pixel label consistency in order to achieve high-quality semantic segmentation [2]. Using hand-engineered features, like Scale Invariant Feature Transform (SIFT) [10] and Histograms of Oriented Gradient (HOG) [11], is advantageous for the m</w:t>
+        <w:t>and augmented reality. Two typical concerns are: how to create effective feature representations to distinguish objects of different classes and how to use contextual information to guarantee pixel label consistency in order to achieve high-quality semantic segmentation [2]. Using hand-engineered features, like Scale Invariant Feature Transform (SIFT) [10] and Histograms of Oriented Gradient (HOG) [11], is advantageous for the m</w:t>
       </w:r>
       <w:r>
         <w:rPr>
@@ -916,8 +839,20 @@
           <w:sz w:val="24"/>
           <w:szCs w:val="24"/>
         </w:rPr>
-        <w:t>ing picture classification [14-</w:t>
-      </w:r>
+        <w:t>ing picture classification [14</w:t>
+      </w:r>
+      <w:proofErr w:type="gramStart"/>
+      <w:r>
+        <w:rPr>
+          <w:rFonts w:ascii="Times New Roman" w:hAnsi="Times New Roman" w:cs="Times New Roman"/>
+          <w:bCs/>
+          <w:color w:val="000000" w:themeColor="text1"/>
+          <w:sz w:val="24"/>
+          <w:szCs w:val="24"/>
+        </w:rPr>
+        <w:t>],[</w:t>
+      </w:r>
+      <w:proofErr w:type="gramEnd"/>
       <w:r>
         <w:rPr>
           <w:rFonts w:ascii="Times New Roman" w:hAnsi="Times New Roman" w:cs="Times New Roman"/>
@@ -946,6 +881,36 @@
           <w:sz w:val="24"/>
           <w:szCs w:val="24"/>
         </w:rPr>
+        <w:t>],[</w:t>
+      </w:r>
+      <w:r>
+        <w:rPr>
+          <w:rFonts w:ascii="Times New Roman" w:hAnsi="Times New Roman" w:cs="Times New Roman"/>
+          <w:bCs/>
+          <w:color w:val="000000" w:themeColor="text1"/>
+          <w:sz w:val="24"/>
+          <w:szCs w:val="24"/>
+        </w:rPr>
+        <w:t xml:space="preserve">17]. Consequently, the learnt features have received a lot of attention lately from the </w:t>
+      </w:r>
+      <w:r>
+        <w:rPr>
+          <w:rFonts w:ascii="Times New Roman" w:hAnsi="Times New Roman" w:cs="Times New Roman"/>
+          <w:bCs/>
+          <w:color w:val="000000" w:themeColor="text1"/>
+          <w:sz w:val="24"/>
+          <w:szCs w:val="24"/>
+        </w:rPr>
+        <w:t>semantic segmentation field [18</w:t>
+      </w:r>
+      <w:r>
+        <w:rPr>
+          <w:rFonts w:ascii="Times New Roman" w:hAnsi="Times New Roman" w:cs="Times New Roman"/>
+          <w:bCs/>
+          <w:color w:val="000000" w:themeColor="text1"/>
+          <w:sz w:val="24"/>
+          <w:szCs w:val="24"/>
+        </w:rPr>
         <w:t>-</w:t>
       </w:r>
       <w:r>
@@ -956,36 +921,6 @@
           <w:sz w:val="24"/>
           <w:szCs w:val="24"/>
         </w:rPr>
-        <w:t xml:space="preserve">17]. Consequently, the learnt features have received a lot of attention lately from the </w:t>
-      </w:r>
-      <w:r>
-        <w:rPr>
-          <w:rFonts w:ascii="Times New Roman" w:hAnsi="Times New Roman" w:cs="Times New Roman"/>
-          <w:bCs/>
-          <w:color w:val="000000" w:themeColor="text1"/>
-          <w:sz w:val="24"/>
-          <w:szCs w:val="24"/>
-        </w:rPr>
-        <w:t>semantic segmentation field [18</w:t>
-      </w:r>
-      <w:r>
-        <w:rPr>
-          <w:rFonts w:ascii="Times New Roman" w:hAnsi="Times New Roman" w:cs="Times New Roman"/>
-          <w:bCs/>
-          <w:color w:val="000000" w:themeColor="text1"/>
-          <w:sz w:val="24"/>
-          <w:szCs w:val="24"/>
-        </w:rPr>
-        <w:t>-</w:t>
-      </w:r>
-      <w:r>
-        <w:rPr>
-          <w:rFonts w:ascii="Times New Roman" w:hAnsi="Times New Roman" w:cs="Times New Roman"/>
-          <w:bCs/>
-          <w:color w:val="000000" w:themeColor="text1"/>
-          <w:sz w:val="24"/>
-          <w:szCs w:val="24"/>
-        </w:rPr>
         <w:t>21], where they are typically associated with Convolutional Neural Network (CNN or Convent) [22]. Using contextual models like Con</w:t>
       </w:r>
       <w:r>
@@ -1006,7 +941,29 @@
           <w:sz w:val="24"/>
           <w:szCs w:val="24"/>
         </w:rPr>
-        <w:t>itional Random Field (CRF) [23-</w:t>
+        <w:t>itional Random Field (CRF) [23</w:t>
+      </w:r>
+      <w:proofErr w:type="gramStart"/>
+      <w:r>
+        <w:rPr>
+          <w:rFonts w:ascii="Times New Roman" w:hAnsi="Times New Roman" w:cs="Times New Roman"/>
+          <w:bCs/>
+          <w:color w:val="000000" w:themeColor="text1"/>
+          <w:sz w:val="24"/>
+          <w:szCs w:val="24"/>
+        </w:rPr>
+        <w:t>],[</w:t>
+      </w:r>
+      <w:proofErr w:type="gramEnd"/>
+      <w:r>
+        <w:rPr>
+          <w:rFonts w:ascii="Times New Roman" w:hAnsi="Times New Roman" w:cs="Times New Roman"/>
+          <w:bCs/>
+          <w:color w:val="000000" w:themeColor="text1"/>
+          <w:sz w:val="24"/>
+          <w:szCs w:val="24"/>
+        </w:rPr>
+        <w:t>24],[</w:t>
       </w:r>
       <w:r>
         <w:rPr>
@@ -1046,8 +1003,19 @@
           <w:sz w:val="24"/>
           <w:szCs w:val="24"/>
         </w:rPr>
-        <w:t>on datasets and techniques [1-</w:t>
-      </w:r>
+        <w:t>on datasets and techniques [1</w:t>
+      </w:r>
+      <w:proofErr w:type="gramStart"/>
+      <w:r>
+        <w:rPr>
+          <w:rFonts w:ascii="Times New Roman" w:hAnsi="Times New Roman" w:cs="Times New Roman"/>
+          <w:color w:val="000000" w:themeColor="text1"/>
+          <w:sz w:val="24"/>
+          <w:szCs w:val="24"/>
+        </w:rPr>
+        <w:t>],[</w:t>
+      </w:r>
+      <w:proofErr w:type="gramEnd"/>
       <w:r>
         <w:rPr>
           <w:rFonts w:ascii="Times New Roman" w:hAnsi="Times New Roman" w:cs="Times New Roman"/>
@@ -1436,6 +1404,18 @@
     </w:p>
     <w:p>
       <w:pPr>
+        <w:spacing w:after="0"/>
+        <w:jc w:val="both"/>
+        <w:rPr>
+          <w:rFonts w:ascii="Times New Roman" w:hAnsi="Times New Roman" w:cs="Times New Roman"/>
+          <w:color w:val="000000" w:themeColor="text1"/>
+          <w:sz w:val="24"/>
+          <w:szCs w:val="24"/>
+        </w:rPr>
+      </w:pPr>
+    </w:p>
+    <w:p>
+      <w:pPr>
         <w:pStyle w:val="1"/>
         <w:numPr>
           <w:ilvl w:val="0"/>
@@ -1450,8 +1430,6 @@
           <w:szCs w:val="26"/>
         </w:rPr>
       </w:pPr>
-      <w:bookmarkStart w:id="0" w:name="_GoBack"/>
-      <w:bookmarkEnd w:id="0"/>
       <w:r>
         <w:rPr>
           <w:rFonts w:ascii="Times New Roman" w:hAnsi="Times New Roman" w:cs="Times New Roman"/>
@@ -1828,7 +1806,25 @@
           <w:b w:val="0"/>
           <w:color w:val="000000" w:themeColor="text1"/>
         </w:rPr>
-        <w:t>Applying the transfer learning approach is not always simple, though. Using a pretrained network requires adherence to certain architectural requirements. Transfer learning is made possible by the fact that it is normal practice to reuse pre-existing network designs (or components) as opposed to creating entirely new ones. However, there is a small difference in the training procedure when fine-tuning as opposed to starting from fresh. Since the lower layers of the network typically contain more generic features, it is important to carefully select which layers to fine-tune. You should also choose an appropriate policy for the learning rate, which is typically smaller because the pre-trained weights are expected to be relatively good and do not require significant modification.</w:t>
+        <w:t xml:space="preserve">Applying the transfer learning approach is not always simple, though. Using a </w:t>
+      </w:r>
+      <w:proofErr w:type="spellStart"/>
+      <w:r>
+        <w:rPr>
+          <w:rFonts w:ascii="Times New Roman" w:hAnsi="Times New Roman" w:cs="Times New Roman"/>
+          <w:b w:val="0"/>
+          <w:color w:val="000000" w:themeColor="text1"/>
+        </w:rPr>
+        <w:t>pretrained</w:t>
+      </w:r>
+      <w:proofErr w:type="spellEnd"/>
+      <w:r>
+        <w:rPr>
+          <w:rFonts w:ascii="Times New Roman" w:hAnsi="Times New Roman" w:cs="Times New Roman"/>
+          <w:b w:val="0"/>
+          <w:color w:val="000000" w:themeColor="text1"/>
+        </w:rPr>
+        <w:t xml:space="preserve"> network requires adherence to certain architectural requirements. Transfer learning is made possible by the fact that it is normal practice to reuse pre-existing network designs (or components) as opposed to creating entirely new ones. However, there is a small difference in the training procedure when fine-tuning as opposed to starting from fresh. Since the lower layers of the network typically contain more generic features, it is important to carefully select which layers to fine-tune. You should also choose an appropriate policy for the learning rate, which is typically smaller because the pre-trained weights are expected to be relatively good and do not require significant modification.</w:t>
       </w:r>
     </w:p>
     <w:p>
@@ -2428,7 +2424,29 @@
           <w:sz w:val="24"/>
           <w:szCs w:val="24"/>
         </w:rPr>
-        <w:t>The picture shows a flowchart that describes how to find anti-counterfeit characteristics in an object, beginning with taking a picture of the object to be examined. Finding possible areas of the image that could include anti-counterfeit elements is the next phase. These areas are then highlighted for more examination. The algorithm then takes these candidate regions and extracts certain properties that are suggestive of anti-counterfeit measures from them. Two instances of feature extraction are presented here, where abstract forms are highlighted in various colors. Following their extraction, the features are categorized to see if they match any known anticounterfeit features. The decision</w:t>
+        <w:t xml:space="preserve">The picture shows a flowchart that describes how to find anti-counterfeit characteristics in an object, beginning with taking a picture of the object to be examined. Finding possible areas of the image that could include anti-counterfeit elements is the next phase. These areas are then highlighted for more examination. The algorithm then takes these candidate regions and extracts certain properties that are suggestive of anti-counterfeit measures from them. Two instances of feature extraction are presented here, where abstract forms are highlighted in various colors. Following their extraction, the features are categorized to see if they match any known </w:t>
+      </w:r>
+      <w:proofErr w:type="spellStart"/>
+      <w:r>
+        <w:rPr>
+          <w:rFonts w:ascii="Times New Roman" w:hAnsi="Times New Roman" w:cs="Times New Roman"/>
+          <w:bCs/>
+          <w:color w:val="000000" w:themeColor="text1"/>
+          <w:sz w:val="24"/>
+          <w:szCs w:val="24"/>
+        </w:rPr>
+        <w:t>anticounterfeit</w:t>
+      </w:r>
+      <w:proofErr w:type="spellEnd"/>
+      <w:r>
+        <w:rPr>
+          <w:rFonts w:ascii="Times New Roman" w:hAnsi="Times New Roman" w:cs="Times New Roman"/>
+          <w:bCs/>
+          <w:color w:val="000000" w:themeColor="text1"/>
+          <w:sz w:val="24"/>
+          <w:szCs w:val="24"/>
+        </w:rPr>
+        <w:t xml:space="preserve"> features. The decision</w:t>
       </w:r>
       <w:r>
         <w:rPr>
@@ -2608,7 +2626,29 @@
           <w:sz w:val="24"/>
           <w:szCs w:val="24"/>
         </w:rPr>
-        <w:t>mantic segmentation approach.[68</w:t>
+        <w:t xml:space="preserve">mantic segmentation </w:t>
+      </w:r>
+      <w:proofErr w:type="gramStart"/>
+      <w:r>
+        <w:rPr>
+          <w:rFonts w:ascii="Times New Roman" w:hAnsi="Times New Roman" w:cs="Times New Roman"/>
+          <w:bCs/>
+          <w:color w:val="000000" w:themeColor="text1"/>
+          <w:sz w:val="24"/>
+          <w:szCs w:val="24"/>
+        </w:rPr>
+        <w:t>approach.[</w:t>
+      </w:r>
+      <w:proofErr w:type="gramEnd"/>
+      <w:r>
+        <w:rPr>
+          <w:rFonts w:ascii="Times New Roman" w:hAnsi="Times New Roman" w:cs="Times New Roman"/>
+          <w:bCs/>
+          <w:color w:val="000000" w:themeColor="text1"/>
+          <w:sz w:val="24"/>
+          <w:szCs w:val="24"/>
+        </w:rPr>
+        <w:t>68</w:t>
       </w:r>
       <w:r>
         <w:rPr>
@@ -2865,7 +2905,27 @@
           <w:sz w:val="24"/>
           <w:szCs w:val="24"/>
         </w:rPr>
-        <w:t>ork under complex background.[69</w:t>
+        <w:t xml:space="preserve">ork under complex </w:t>
+      </w:r>
+      <w:proofErr w:type="gramStart"/>
+      <w:r>
+        <w:rPr>
+          <w:rFonts w:ascii="Times New Roman" w:hAnsi="Times New Roman" w:cs="Times New Roman"/>
+          <w:color w:val="000000" w:themeColor="text1"/>
+          <w:sz w:val="24"/>
+          <w:szCs w:val="24"/>
+        </w:rPr>
+        <w:t>background.[</w:t>
+      </w:r>
+      <w:proofErr w:type="gramEnd"/>
+      <w:r>
+        <w:rPr>
+          <w:rFonts w:ascii="Times New Roman" w:hAnsi="Times New Roman" w:cs="Times New Roman"/>
+          <w:color w:val="000000" w:themeColor="text1"/>
+          <w:sz w:val="24"/>
+          <w:szCs w:val="24"/>
+        </w:rPr>
+        <w:t>69</w:t>
       </w:r>
       <w:r>
         <w:rPr>
@@ -3105,9 +3165,8 @@
           <w:szCs w:val="24"/>
           <w:lang w:bidi="ar-SA"/>
         </w:rPr>
-        <w:t xml:space="preserve"> architecture makes use of cutting-edge methods to boost feature extraction and increase segmentation accuracy. </w:t>
-      </w:r>
-      <w:proofErr w:type="spellStart"/>
+        <w:t xml:space="preserve"> architecture makes use of cutting-edge methods to boost feature extraction and increase segmentation</w:t>
+      </w:r>
       <w:r>
         <w:rPr>
           <w:rFonts w:ascii="Times New Roman" w:eastAsia="Times New Roman" w:hAnsi="Times New Roman" w:cs="Times New Roman"/>
@@ -3115,6 +3174,16 @@
           <w:szCs w:val="24"/>
           <w:lang w:bidi="ar-SA"/>
         </w:rPr>
+        <w:t xml:space="preserve"> accuracy. </w:t>
+      </w:r>
+      <w:proofErr w:type="spellStart"/>
+      <w:r>
+        <w:rPr>
+          <w:rFonts w:ascii="Times New Roman" w:eastAsia="Times New Roman" w:hAnsi="Times New Roman" w:cs="Times New Roman"/>
+          <w:sz w:val="24"/>
+          <w:szCs w:val="24"/>
+          <w:lang w:bidi="ar-SA"/>
+        </w:rPr>
         <w:t>Atrous</w:t>
       </w:r>
       <w:proofErr w:type="spellEnd"/>
@@ -3145,7 +3214,16 @@
           <w:szCs w:val="24"/>
           <w:lang w:bidi="ar-SA"/>
         </w:rPr>
-        <w:t xml:space="preserve">82] is a key component of its design because it provides fine control over feature response resolution, making it possible to capture multi-scale contextual information without adding more parameters or computing power. Using numerous parallel </w:t>
+        <w:t>19</w:t>
+      </w:r>
+      <w:r>
+        <w:rPr>
+          <w:rFonts w:ascii="Times New Roman" w:eastAsia="Times New Roman" w:hAnsi="Times New Roman" w:cs="Times New Roman"/>
+          <w:sz w:val="24"/>
+          <w:szCs w:val="24"/>
+          <w:lang w:bidi="ar-SA"/>
+        </w:rPr>
+        <w:t xml:space="preserve">] is a key component of its design because it provides fine control over feature response resolution, making it possible to capture multi-scale contextual information without adding more parameters or computing power. Using numerous parallel </w:t>
       </w:r>
       <w:proofErr w:type="spellStart"/>
       <w:r>
@@ -3628,7 +3706,25 @@
           <w:b w:val="0"/>
           <w:color w:val="000000" w:themeColor="text1"/>
         </w:rPr>
-        <w:t>A sophisticated technique for semantic image segmentation called CRF-RNN (Conditional Random Fields as Recurrent Neural Networks) combines RNNs and CRFs into a single, end-to-end trainable neural network architecture. By improving pixel-by-pixel predictions and promoting smoothness in segmentation outputs—where neighboring pixels with similar appearances are more likely to share the same label—CRFs are probabilistic models that are used to enforce spatial dependencies. Traditionally, Convolutional Neural Networks (CNNs) produced the initial predictions, and then CRFs were applied as a post-processing step. On the other hand, CRF-RNN is novel in that it incorporates CRF inference as a recurrent process, enabling joint CNN and CRF training. The outputs of this integration are segmentation that is more precise and well-rounded. By using recurrent layers to update the segmentation mask iteratively, CRF-RNN is able to enhance performance on dense pixel labeling tasks and differentiate object borders more accurately. The method, which was first presented by Shuai Zheng et al. in their 2015 publication "CRF as RNN: Conditional Random Fields as Recurrent Neural Networks,"[72] has been demonstrated to perform better than standalone CNNs, particularly in datasets where accurate segmentation is crucial, such as PASCAL VOC and MS COCO.</w:t>
+        <w:t xml:space="preserve">A sophisticated technique for semantic image segmentation called CRF-RNN (Conditional Random Fields as Recurrent Neural Networks) combines RNNs and CRFs into a single, end-to-end trainable neural network architecture. By improving pixel-by-pixel predictions and promoting smoothness in segmentation outputs—where neighboring pixels with similar appearances are more likely to share the same label—CRFs are probabilistic models that are used to enforce spatial dependencies. Traditionally, Convolutional Neural Networks (CNNs) produced the initial predictions, and then CRFs were applied as a post-processing step. On the other hand, CRF-RNN is novel in that it incorporates CRF inference as a recurrent process, enabling joint CNN and CRF training. The outputs of this integration are segmentation that is more precise and well-rounded. By using recurrent layers to update the segmentation mask iteratively, CRF-RNN is able to enhance performance on dense pixel labeling tasks and differentiate object borders more accurately. The method, which was first presented by </w:t>
+      </w:r>
+      <w:proofErr w:type="spellStart"/>
+      <w:r>
+        <w:rPr>
+          <w:rFonts w:ascii="Times New Roman" w:hAnsi="Times New Roman" w:cs="Times New Roman"/>
+          <w:b w:val="0"/>
+          <w:color w:val="000000" w:themeColor="text1"/>
+        </w:rPr>
+        <w:t>Shuai</w:t>
+      </w:r>
+      <w:proofErr w:type="spellEnd"/>
+      <w:r>
+        <w:rPr>
+          <w:rFonts w:ascii="Times New Roman" w:hAnsi="Times New Roman" w:cs="Times New Roman"/>
+          <w:b w:val="0"/>
+          <w:color w:val="000000" w:themeColor="text1"/>
+        </w:rPr>
+        <w:t xml:space="preserve"> Zheng et al. in their 2015 publication "CRF as RNN: Conditional Random Fields as Recurrent Neural Networks,"[72] has been demonstrated to perform better than standalone CNNs, particularly in datasets where accurate segmentation is crucial, such as PASCAL VOC and MS COCO.</w:t>
       </w:r>
     </w:p>
     <w:p>
@@ -4016,7 +4112,27 @@
           <w:szCs w:val="24"/>
           <w:lang w:bidi="ar-SA"/>
         </w:rPr>
-        <w:t xml:space="preserve"> were first introduced for pixel-wise prediction tasks such as semantic segmentation in the paper "Fully Convolutional Networks for Semantic Segmentation" by Jonathan Long, Evan Shelhamer, and Trevor Darrell, which was presented at the 2015 IEEE Conference on Computer Vision and Pattern Recognition (CVPR). The authors enabled dense output predictions by replacing fully connected layers with convolutional ones, converting conventional convolutional neural networks (CNNs) into fully convolutional architectures that allowed the network to generate pixel-level categorization maps. By </w:t>
+        <w:t xml:space="preserve"> were first introduced for pixel-wise prediction tasks such as semantic segmentation in the paper "Fully Convolutional Networks for Semantic Segmentation" by Jonathan Long, Evan </w:t>
+      </w:r>
+      <w:proofErr w:type="spellStart"/>
+      <w:r>
+        <w:rPr>
+          <w:rFonts w:ascii="Times New Roman" w:eastAsia="Times New Roman" w:hAnsi="Times New Roman" w:cs="Times New Roman"/>
+          <w:sz w:val="24"/>
+          <w:szCs w:val="24"/>
+          <w:lang w:bidi="ar-SA"/>
+        </w:rPr>
+        <w:t>Shelhamer</w:t>
+      </w:r>
+      <w:proofErr w:type="spellEnd"/>
+      <w:r>
+        <w:rPr>
+          <w:rFonts w:ascii="Times New Roman" w:eastAsia="Times New Roman" w:hAnsi="Times New Roman" w:cs="Times New Roman"/>
+          <w:sz w:val="24"/>
+          <w:szCs w:val="24"/>
+          <w:lang w:bidi="ar-SA"/>
+        </w:rPr>
+        <w:t xml:space="preserve">, and Trevor Darrell, which was presented at the 2015 IEEE Conference on Computer Vision and Pattern Recognition (CVPR). The authors enabled dense output predictions by replacing fully connected layers with convolutional ones, converting conventional convolutional neural networks (CNNs) into fully convolutional architectures that allowed the network to generate pixel-level categorization maps. By </w:t>
       </w:r>
       <w:proofErr w:type="spellStart"/>
       <w:r>
@@ -4381,7 +4497,27 @@
           <w:sz w:val="24"/>
           <w:szCs w:val="24"/>
         </w:rPr>
-        <w:t xml:space="preserve"> improves prediction reliability by addressing both epistemic and aleatoric uncertainty (inherent noise in the data). This makes it useful for tasks that require accurate scene understanding and for directing active learning strategies in environments where the data is noisy or unclear.</w:t>
+        <w:t xml:space="preserve"> improves prediction reliability by addressing both epistemic and </w:t>
+      </w:r>
+      <w:proofErr w:type="spellStart"/>
+      <w:r>
+        <w:rPr>
+          <w:rFonts w:ascii="Times New Roman" w:hAnsi="Times New Roman" w:cs="Times New Roman"/>
+          <w:color w:val="000000" w:themeColor="text1"/>
+          <w:sz w:val="24"/>
+          <w:szCs w:val="24"/>
+        </w:rPr>
+        <w:t>aleatoric</w:t>
+      </w:r>
+      <w:proofErr w:type="spellEnd"/>
+      <w:r>
+        <w:rPr>
+          <w:rFonts w:ascii="Times New Roman" w:hAnsi="Times New Roman" w:cs="Times New Roman"/>
+          <w:color w:val="000000" w:themeColor="text1"/>
+          <w:sz w:val="24"/>
+          <w:szCs w:val="24"/>
+        </w:rPr>
+        <w:t xml:space="preserve"> uncertainty (inherent noise in the data). This makes it useful for tasks that require accurate scene understanding and for directing active learning strategies in environments where the data is noisy or unclear.</w:t>
       </w:r>
     </w:p>
     <w:p>
@@ -4472,7 +4608,47 @@
           <w:szCs w:val="24"/>
           <w:lang w:bidi="ar-SA"/>
         </w:rPr>
-        <w:t xml:space="preserve">76] are a novel technique to semantic segmentation, as presented in the paper "DAG-Recurrent Neural Networks for Scene Labeling" by B. Shuai, Z. Zuo, G. Wang, and B. Wang. By representing pixel associations as a directed acyclic graph (DAG), DAG-RNNs are engineered to capture long-range dependencies in images, in contrast to conventional Convolutional Neural Networks (CNNs) that mostly rely on local context. The fundamental idea is to multiply the ways in which contextual information spreads throughout the image, hence improving the network's understanding of global structures while preserving the local accuracy needed for pixel-level labeling. This system aggregates contextual information throughout the entire image by treating each pixel as a node in the DAG and passing information along edges between nodes. Through the use of a recurrent process, DAG-RNNs iteratively improve the accuracy of segmentation results by refining their predictions. The network performs especially well in </w:t>
+        <w:t xml:space="preserve">76] are a novel technique to semantic segmentation, as presented in the paper "DAG-Recurrent Neural Networks for Scene Labeling" by B. </w:t>
+      </w:r>
+      <w:proofErr w:type="spellStart"/>
+      <w:r>
+        <w:rPr>
+          <w:rFonts w:ascii="Times New Roman" w:eastAsia="Times New Roman" w:hAnsi="Times New Roman" w:cs="Times New Roman"/>
+          <w:sz w:val="24"/>
+          <w:szCs w:val="24"/>
+          <w:lang w:bidi="ar-SA"/>
+        </w:rPr>
+        <w:t>Shuai</w:t>
+      </w:r>
+      <w:proofErr w:type="spellEnd"/>
+      <w:r>
+        <w:rPr>
+          <w:rFonts w:ascii="Times New Roman" w:eastAsia="Times New Roman" w:hAnsi="Times New Roman" w:cs="Times New Roman"/>
+          <w:sz w:val="24"/>
+          <w:szCs w:val="24"/>
+          <w:lang w:bidi="ar-SA"/>
+        </w:rPr>
+        <w:t xml:space="preserve">, Z. </w:t>
+      </w:r>
+      <w:proofErr w:type="spellStart"/>
+      <w:r>
+        <w:rPr>
+          <w:rFonts w:ascii="Times New Roman" w:eastAsia="Times New Roman" w:hAnsi="Times New Roman" w:cs="Times New Roman"/>
+          <w:sz w:val="24"/>
+          <w:szCs w:val="24"/>
+          <w:lang w:bidi="ar-SA"/>
+        </w:rPr>
+        <w:t>Zuo</w:t>
+      </w:r>
+      <w:proofErr w:type="spellEnd"/>
+      <w:r>
+        <w:rPr>
+          <w:rFonts w:ascii="Times New Roman" w:eastAsia="Times New Roman" w:hAnsi="Times New Roman" w:cs="Times New Roman"/>
+          <w:sz w:val="24"/>
+          <w:szCs w:val="24"/>
+          <w:lang w:bidi="ar-SA"/>
+        </w:rPr>
+        <w:t xml:space="preserve">, G. Wang, and B. Wang. By representing pixel associations as a directed acyclic graph (DAG), DAG-RNNs are engineered to capture long-range dependencies in images, in contrast to conventional Convolutional Neural Networks (CNNs) that mostly rely on local context. The fundamental idea is to multiply the ways in which contextual information spreads throughout the image, hence improving the network's understanding of global structures while preserving the local accuracy needed for pixel-level labeling. This system aggregates contextual information throughout the entire image by treating each pixel as a node in the DAG and passing information along edges between nodes. Through the use of a recurrent process, DAG-RNNs iteratively improve the accuracy of segmentation results by refining their predictions. The network performs especially well in </w:t>
       </w:r>
       <w:r>
         <w:rPr>
@@ -4762,7 +4938,7 @@
           <w:szCs w:val="24"/>
           <w:lang w:bidi="ar-SA"/>
         </w:rPr>
-        <w:t xml:space="preserve"> networks is presented in the publication "Scene Labeling with LSTM Recurrent Neural Networks" by W. Byeon, T. M. </w:t>
+        <w:t xml:space="preserve"> networks is presented in the publication "Scene Labeling with LSTM Recurrent Neural Networks" by W. </w:t>
       </w:r>
       <w:proofErr w:type="spellStart"/>
       <w:r>
@@ -4772,6 +4948,26 @@
           <w:szCs w:val="24"/>
           <w:lang w:bidi="ar-SA"/>
         </w:rPr>
+        <w:t>Byeon</w:t>
+      </w:r>
+      <w:proofErr w:type="spellEnd"/>
+      <w:r>
+        <w:rPr>
+          <w:rFonts w:ascii="Times New Roman" w:eastAsia="Times New Roman" w:hAnsi="Times New Roman" w:cs="Times New Roman"/>
+          <w:sz w:val="24"/>
+          <w:szCs w:val="24"/>
+          <w:lang w:bidi="ar-SA"/>
+        </w:rPr>
+        <w:t xml:space="preserve">, T. M. </w:t>
+      </w:r>
+      <w:proofErr w:type="spellStart"/>
+      <w:r>
+        <w:rPr>
+          <w:rFonts w:ascii="Times New Roman" w:eastAsia="Times New Roman" w:hAnsi="Times New Roman" w:cs="Times New Roman"/>
+          <w:sz w:val="24"/>
+          <w:szCs w:val="24"/>
+          <w:lang w:bidi="ar-SA"/>
+        </w:rPr>
         <w:t>Breuel</w:t>
       </w:r>
       <w:proofErr w:type="spellEnd"/>
@@ -4782,7 +4978,27 @@
           <w:szCs w:val="24"/>
           <w:lang w:bidi="ar-SA"/>
         </w:rPr>
-        <w:t xml:space="preserve">, F. Raue, and M. </w:t>
+        <w:t xml:space="preserve">, F. </w:t>
+      </w:r>
+      <w:proofErr w:type="spellStart"/>
+      <w:r>
+        <w:rPr>
+          <w:rFonts w:ascii="Times New Roman" w:eastAsia="Times New Roman" w:hAnsi="Times New Roman" w:cs="Times New Roman"/>
+          <w:sz w:val="24"/>
+          <w:szCs w:val="24"/>
+          <w:lang w:bidi="ar-SA"/>
+        </w:rPr>
+        <w:t>Raue</w:t>
+      </w:r>
+      <w:proofErr w:type="spellEnd"/>
+      <w:r>
+        <w:rPr>
+          <w:rFonts w:ascii="Times New Roman" w:eastAsia="Times New Roman" w:hAnsi="Times New Roman" w:cs="Times New Roman"/>
+          <w:sz w:val="24"/>
+          <w:szCs w:val="24"/>
+          <w:lang w:bidi="ar-SA"/>
+        </w:rPr>
+        <w:t xml:space="preserve">, and M. </w:t>
       </w:r>
       <w:proofErr w:type="spellStart"/>
       <w:r>
@@ -4910,7 +5126,47 @@
           <w:szCs w:val="24"/>
           <w:lang w:bidi="ar-SA"/>
         </w:rPr>
-        <w:t xml:space="preserve">: A Deep Convolutional Encoder-Decoder Architecture for Image Segmentation" by V. Badrinarayanan, A. Kendall, and R. Cipolla. With the help of its pre-trained weights, the encoder in </w:t>
+        <w:t xml:space="preserve">: A Deep Convolutional Encoder-Decoder Architecture for Image Segmentation" by V. </w:t>
+      </w:r>
+      <w:proofErr w:type="spellStart"/>
+      <w:r>
+        <w:rPr>
+          <w:rFonts w:ascii="Times New Roman" w:eastAsia="Times New Roman" w:hAnsi="Times New Roman" w:cs="Times New Roman"/>
+          <w:sz w:val="24"/>
+          <w:szCs w:val="24"/>
+          <w:lang w:bidi="ar-SA"/>
+        </w:rPr>
+        <w:t>Badrinarayanan</w:t>
+      </w:r>
+      <w:proofErr w:type="spellEnd"/>
+      <w:r>
+        <w:rPr>
+          <w:rFonts w:ascii="Times New Roman" w:eastAsia="Times New Roman" w:hAnsi="Times New Roman" w:cs="Times New Roman"/>
+          <w:sz w:val="24"/>
+          <w:szCs w:val="24"/>
+          <w:lang w:bidi="ar-SA"/>
+        </w:rPr>
+        <w:t xml:space="preserve">, A. Kendall, and R. </w:t>
+      </w:r>
+      <w:proofErr w:type="spellStart"/>
+      <w:r>
+        <w:rPr>
+          <w:rFonts w:ascii="Times New Roman" w:eastAsia="Times New Roman" w:hAnsi="Times New Roman" w:cs="Times New Roman"/>
+          <w:sz w:val="24"/>
+          <w:szCs w:val="24"/>
+          <w:lang w:bidi="ar-SA"/>
+        </w:rPr>
+        <w:t>Cipolla</w:t>
+      </w:r>
+      <w:proofErr w:type="spellEnd"/>
+      <w:r>
+        <w:rPr>
+          <w:rFonts w:ascii="Times New Roman" w:eastAsia="Times New Roman" w:hAnsi="Times New Roman" w:cs="Times New Roman"/>
+          <w:sz w:val="24"/>
+          <w:szCs w:val="24"/>
+          <w:lang w:bidi="ar-SA"/>
+        </w:rPr>
+        <w:t xml:space="preserve">. With the help of its pre-trained weights, the encoder in </w:t>
       </w:r>
       <w:proofErr w:type="spellStart"/>
       <w:proofErr w:type="gramStart"/>
@@ -5297,7 +5553,27 @@
           <w:szCs w:val="24"/>
           <w:lang w:bidi="ar-SA"/>
         </w:rPr>
-        <w:t xml:space="preserve">, a semantic segmentation model based on an architecture based on recurrent neural networks (RNNs). It functions in an encoder-decoder architecture, where the encoder extracts high-level, coarse feature maps from input pictures using conventional convolutional neural networks (CNNs). ReSeg's decoder, which uses recurrent convolutional layers to iteratively improve the segmentation map, is its special power. Through the use of RNNs—more especially, convolutional gated recurrent units, or </w:t>
+        <w:t xml:space="preserve">, a semantic segmentation model based on an architecture based on recurrent neural networks (RNNs). It functions in an encoder-decoder architecture, where the encoder extracts high-level, coarse feature maps from input pictures using conventional convolutional neural networks (CNNs). </w:t>
+      </w:r>
+      <w:proofErr w:type="spellStart"/>
+      <w:r>
+        <w:rPr>
+          <w:rFonts w:ascii="Times New Roman" w:eastAsia="Times New Roman" w:hAnsi="Times New Roman" w:cs="Times New Roman"/>
+          <w:sz w:val="24"/>
+          <w:szCs w:val="24"/>
+          <w:lang w:bidi="ar-SA"/>
+        </w:rPr>
+        <w:t>ReSeg's</w:t>
+      </w:r>
+      <w:proofErr w:type="spellEnd"/>
+      <w:r>
+        <w:rPr>
+          <w:rFonts w:ascii="Times New Roman" w:eastAsia="Times New Roman" w:hAnsi="Times New Roman" w:cs="Times New Roman"/>
+          <w:sz w:val="24"/>
+          <w:szCs w:val="24"/>
+          <w:lang w:bidi="ar-SA"/>
+        </w:rPr>
+        <w:t xml:space="preserve"> decoder, which uses recurrent convolutional layers to iteratively improve the segmentation map, is its special power. Through the use of RNNs—more especially, convolutional gated recurrent units, or </w:t>
       </w:r>
       <w:proofErr w:type="spellStart"/>
       <w:r>
@@ -5416,6 +5692,7 @@
         </w:rPr>
         <w:t xml:space="preserve">3.13. </w:t>
       </w:r>
+      <w:proofErr w:type="spellStart"/>
       <w:r>
         <w:rPr>
           <w:rFonts w:ascii="Times New Roman" w:eastAsia="Times New Roman" w:hAnsi="Times New Roman" w:cs="Times New Roman"/>
@@ -5426,6 +5703,7 @@
         </w:rPr>
         <w:t>ENet</w:t>
       </w:r>
+      <w:proofErr w:type="spellEnd"/>
     </w:p>
     <w:p>
       <w:pPr>
@@ -5439,6 +5717,7 @@
           <w:lang w:bidi="ar-SA"/>
         </w:rPr>
       </w:pPr>
+      <w:proofErr w:type="spellStart"/>
       <w:r>
         <w:rPr>
           <w:rFonts w:ascii="Times New Roman" w:eastAsia="Times New Roman" w:hAnsi="Times New Roman" w:cs="Times New Roman"/>
@@ -5446,9 +5725,9 @@
           <w:szCs w:val="24"/>
           <w:lang w:bidi="ar-SA"/>
         </w:rPr>
-        <w:t xml:space="preserve">ENet is a deep neural network architecture that was created especially for real-time semantic segmentation, with a heavy emphasis on speed and efficiency. It was first presented by A. </w:t>
-      </w:r>
-      <w:proofErr w:type="spellStart"/>
+        <w:t>ENet</w:t>
+      </w:r>
+      <w:proofErr w:type="spellEnd"/>
       <w:r>
         <w:rPr>
           <w:rFonts w:ascii="Times New Roman" w:eastAsia="Times New Roman" w:hAnsi="Times New Roman" w:cs="Times New Roman"/>
@@ -5456,6 +5735,16 @@
           <w:szCs w:val="24"/>
           <w:lang w:bidi="ar-SA"/>
         </w:rPr>
+        <w:t xml:space="preserve"> is a deep neural network architecture that was created especially for real-time semantic segmentation, with a heavy emphasis on speed and efficiency. It was first presented by A. </w:t>
+      </w:r>
+      <w:proofErr w:type="spellStart"/>
+      <w:r>
+        <w:rPr>
+          <w:rFonts w:ascii="Times New Roman" w:eastAsia="Times New Roman" w:hAnsi="Times New Roman" w:cs="Times New Roman"/>
+          <w:sz w:val="24"/>
+          <w:szCs w:val="24"/>
+          <w:lang w:bidi="ar-SA"/>
+        </w:rPr>
         <w:t>Paszke</w:t>
       </w:r>
       <w:proofErr w:type="spellEnd"/>
@@ -5466,7 +5755,27 @@
           <w:szCs w:val="24"/>
           <w:lang w:bidi="ar-SA"/>
         </w:rPr>
-        <w:t xml:space="preserve">, A. Chaurasia, S. Kim, and E. </w:t>
+        <w:t xml:space="preserve">, A. </w:t>
+      </w:r>
+      <w:proofErr w:type="spellStart"/>
+      <w:r>
+        <w:rPr>
+          <w:rFonts w:ascii="Times New Roman" w:eastAsia="Times New Roman" w:hAnsi="Times New Roman" w:cs="Times New Roman"/>
+          <w:sz w:val="24"/>
+          <w:szCs w:val="24"/>
+          <w:lang w:bidi="ar-SA"/>
+        </w:rPr>
+        <w:t>Chaurasia</w:t>
+      </w:r>
+      <w:proofErr w:type="spellEnd"/>
+      <w:r>
+        <w:rPr>
+          <w:rFonts w:ascii="Times New Roman" w:eastAsia="Times New Roman" w:hAnsi="Times New Roman" w:cs="Times New Roman"/>
+          <w:sz w:val="24"/>
+          <w:szCs w:val="24"/>
+          <w:lang w:bidi="ar-SA"/>
+        </w:rPr>
+        <w:t xml:space="preserve">, S. Kim, and E. </w:t>
       </w:r>
       <w:proofErr w:type="spellStart"/>
       <w:proofErr w:type="gramStart"/>
@@ -5506,7 +5815,7 @@
           <w:szCs w:val="24"/>
           <w:lang w:bidi="ar-SA"/>
         </w:rPr>
-        <w:t xml:space="preserve">. In contrast to numerous other segmentation models that give precedence to accuracy over computational resources, ENet is tailored for settings with constrained processing capabilities, such real-time apps and mobile devices. In order to accomplish this, it uses an encoder-decoder structure while significantly lowering the computing burden on the encoder and decoder. The architecture minimizes the number of operations while retaining useful feature extraction by employing </w:t>
+        <w:t xml:space="preserve">. In contrast to numerous other segmentation models that give precedence to accuracy over computational resources, </w:t>
       </w:r>
       <w:proofErr w:type="spellStart"/>
       <w:r>
@@ -5516,6 +5825,26 @@
           <w:szCs w:val="24"/>
           <w:lang w:bidi="ar-SA"/>
         </w:rPr>
+        <w:t>ENet</w:t>
+      </w:r>
+      <w:proofErr w:type="spellEnd"/>
+      <w:r>
+        <w:rPr>
+          <w:rFonts w:ascii="Times New Roman" w:eastAsia="Times New Roman" w:hAnsi="Times New Roman" w:cs="Times New Roman"/>
+          <w:sz w:val="24"/>
+          <w:szCs w:val="24"/>
+          <w:lang w:bidi="ar-SA"/>
+        </w:rPr>
+        <w:t xml:space="preserve"> is tailored for settings with constrained processing capabilities, such real-time apps and mobile devices. In order to accomplish this, it uses an encoder-decoder structure while significantly lowering the computing burden on the encoder and decoder. The architecture minimizes the number of operations while retaining useful feature extraction by employing </w:t>
+      </w:r>
+      <w:proofErr w:type="spellStart"/>
+      <w:r>
+        <w:rPr>
+          <w:rFonts w:ascii="Times New Roman" w:eastAsia="Times New Roman" w:hAnsi="Times New Roman" w:cs="Times New Roman"/>
+          <w:sz w:val="24"/>
+          <w:szCs w:val="24"/>
+          <w:lang w:bidi="ar-SA"/>
+        </w:rPr>
         <w:t>downsampling</w:t>
       </w:r>
       <w:proofErr w:type="spellEnd"/>
@@ -5537,6 +5866,7 @@
         </w:rPr>
         <w:t xml:space="preserve"> </w:t>
       </w:r>
+      <w:proofErr w:type="spellStart"/>
       <w:r>
         <w:rPr>
           <w:rFonts w:ascii="Times New Roman" w:eastAsia="Times New Roman" w:hAnsi="Times New Roman" w:cs="Times New Roman"/>
@@ -5544,7 +5874,77 @@
           <w:szCs w:val="24"/>
           <w:lang w:bidi="ar-SA"/>
         </w:rPr>
-        <w:t>ENet includes several asymmetric convolutions, bottleneck modules, and dilated convolutions that efficiently collect multi-scale information without adding to computational complexity in order to further boost efficiency. PReLU (Parametric Rectified Linear Units) activations are another technique that ENet employs to improve gradient flow during training and hasten convergence. While ENet loses some accuracy when compared to larger systems, it achieves the best possible speed and performance trade-off, which makes it perfect for real-time applications where quick processing is essential. The model demonstrates its feasibility in real-world scenarios where reasonable accuracy and speed are required, by achieving state-of-the-art segmentation performance on many datasets.</w:t>
+        <w:t>ENet</w:t>
+      </w:r>
+      <w:proofErr w:type="spellEnd"/>
+      <w:r>
+        <w:rPr>
+          <w:rFonts w:ascii="Times New Roman" w:eastAsia="Times New Roman" w:hAnsi="Times New Roman" w:cs="Times New Roman"/>
+          <w:sz w:val="24"/>
+          <w:szCs w:val="24"/>
+          <w:lang w:bidi="ar-SA"/>
+        </w:rPr>
+        <w:t xml:space="preserve"> includes several asymmetric convolutions, bottleneck modules, and dilated convolutions that efficiently collect multi-scale information without adding to computational complexity in order to further boost efficiency. </w:t>
+      </w:r>
+      <w:proofErr w:type="spellStart"/>
+      <w:r>
+        <w:rPr>
+          <w:rFonts w:ascii="Times New Roman" w:eastAsia="Times New Roman" w:hAnsi="Times New Roman" w:cs="Times New Roman"/>
+          <w:sz w:val="24"/>
+          <w:szCs w:val="24"/>
+          <w:lang w:bidi="ar-SA"/>
+        </w:rPr>
+        <w:t>PReLU</w:t>
+      </w:r>
+      <w:proofErr w:type="spellEnd"/>
+      <w:r>
+        <w:rPr>
+          <w:rFonts w:ascii="Times New Roman" w:eastAsia="Times New Roman" w:hAnsi="Times New Roman" w:cs="Times New Roman"/>
+          <w:sz w:val="24"/>
+          <w:szCs w:val="24"/>
+          <w:lang w:bidi="ar-SA"/>
+        </w:rPr>
+        <w:t xml:space="preserve"> (Parametric Rectified Linear Units) activations are another technique that </w:t>
+      </w:r>
+      <w:proofErr w:type="spellStart"/>
+      <w:r>
+        <w:rPr>
+          <w:rFonts w:ascii="Times New Roman" w:eastAsia="Times New Roman" w:hAnsi="Times New Roman" w:cs="Times New Roman"/>
+          <w:sz w:val="24"/>
+          <w:szCs w:val="24"/>
+          <w:lang w:bidi="ar-SA"/>
+        </w:rPr>
+        <w:t>ENet</w:t>
+      </w:r>
+      <w:proofErr w:type="spellEnd"/>
+      <w:r>
+        <w:rPr>
+          <w:rFonts w:ascii="Times New Roman" w:eastAsia="Times New Roman" w:hAnsi="Times New Roman" w:cs="Times New Roman"/>
+          <w:sz w:val="24"/>
+          <w:szCs w:val="24"/>
+          <w:lang w:bidi="ar-SA"/>
+        </w:rPr>
+        <w:t xml:space="preserve"> employs to improve gradient flow during training and hasten convergence. While </w:t>
+      </w:r>
+      <w:proofErr w:type="spellStart"/>
+      <w:r>
+        <w:rPr>
+          <w:rFonts w:ascii="Times New Roman" w:eastAsia="Times New Roman" w:hAnsi="Times New Roman" w:cs="Times New Roman"/>
+          <w:sz w:val="24"/>
+          <w:szCs w:val="24"/>
+          <w:lang w:bidi="ar-SA"/>
+        </w:rPr>
+        <w:t>ENet</w:t>
+      </w:r>
+      <w:proofErr w:type="spellEnd"/>
+      <w:r>
+        <w:rPr>
+          <w:rFonts w:ascii="Times New Roman" w:eastAsia="Times New Roman" w:hAnsi="Times New Roman" w:cs="Times New Roman"/>
+          <w:sz w:val="24"/>
+          <w:szCs w:val="24"/>
+          <w:lang w:bidi="ar-SA"/>
+        </w:rPr>
+        <w:t xml:space="preserve"> loses some accuracy when compared to larger systems, it achieves the best possible speed and performance trade-off, which makes it perfect for real-time applications where quick processing is essential. The model demonstrates its feasibility in real-world scenarios where reasonable accuracy and speed are required, by achieving state-of-the-art segmentation performance on many datasets.</w:t>
       </w:r>
     </w:p>
     <w:p>
@@ -6817,7 +7217,7 @@
           <w:sz w:val="24"/>
           <w:szCs w:val="24"/>
         </w:rPr>
-        <w:t>8 categories, the Cityscapes [48</w:t>
+        <w:t>8 categories, the Cityscapes [6</w:t>
       </w:r>
       <w:r>
         <w:rPr>
@@ -7069,7 +7469,7 @@
           <w:sz w:val="24"/>
           <w:szCs w:val="24"/>
         </w:rPr>
-        <w:t>ota Technological Institute) [51</w:t>
+        <w:t>ota Technological Institute) [7</w:t>
       </w:r>
       <w:r>
         <w:rPr>
@@ -7553,7 +7953,27 @@
           <w:sz w:val="24"/>
           <w:szCs w:val="24"/>
         </w:rPr>
-        <w:t xml:space="preserve">] is a set of 715 outdoor images with pixel-level annotations for both semantic and geometric classes. The images are roughly 320 by 240 pixels in size, and each image has at least one foreground object and the location of the horizon. The images are taken from four publicly available datasets, which are LabelMe, MSRC, PASCAL VOC, and Geometric Context; the semantic classes are sky, tree, road, grass, water, building, mountain, and foreground object; the geometric classes are sky, horizontal, and vertical; the dataset also includes distinct image regions and the horizon position for each image. The dataset is intended to be used for evaluating techniques for both geometric and semantic scene understanding. </w:t>
+        <w:t xml:space="preserve">] is a set of 715 outdoor images with pixel-level annotations for both semantic and geometric classes. The images are roughly 320 by 240 pixels in size, and each image has at least one foreground object and the location of the horizon. The images are taken from four publicly available datasets, which are </w:t>
+      </w:r>
+      <w:proofErr w:type="spellStart"/>
+      <w:r>
+        <w:rPr>
+          <w:rFonts w:ascii="Times New Roman" w:hAnsi="Times New Roman" w:cs="Times New Roman"/>
+          <w:color w:val="000000" w:themeColor="text1"/>
+          <w:sz w:val="24"/>
+          <w:szCs w:val="24"/>
+        </w:rPr>
+        <w:t>LabelMe</w:t>
+      </w:r>
+      <w:proofErr w:type="spellEnd"/>
+      <w:r>
+        <w:rPr>
+          <w:rFonts w:ascii="Times New Roman" w:hAnsi="Times New Roman" w:cs="Times New Roman"/>
+          <w:color w:val="000000" w:themeColor="text1"/>
+          <w:sz w:val="24"/>
+          <w:szCs w:val="24"/>
+        </w:rPr>
+        <w:t xml:space="preserve">, MSRC, PASCAL VOC, and Geometric Context; the semantic classes are sky, tree, road, grass, water, building, mountain, and foreground object; the geometric classes are sky, horizontal, and vertical; the dataset also includes distinct image regions and the horizon position for each image. The dataset is intended to be used for evaluating techniques for both geometric and semantic scene understanding. </w:t>
       </w:r>
     </w:p>
     <w:p>
@@ -7829,7 +8249,18 @@
           <w:sz w:val="24"/>
           <w:szCs w:val="24"/>
         </w:rPr>
-        <w:t>1: Popular large-scale segmentation datasets[1]</w:t>
+        <w:t>1: Popular large</w:t>
+      </w:r>
+      <w:bookmarkStart w:id="0" w:name="_GoBack"/>
+      <w:bookmarkEnd w:id="0"/>
+      <w:r>
+        <w:rPr>
+          <w:rFonts w:ascii="Times New Roman" w:hAnsi="Times New Roman" w:cs="Times New Roman"/>
+          <w:color w:val="000000" w:themeColor="text1"/>
+          <w:sz w:val="24"/>
+          <w:szCs w:val="24"/>
+        </w:rPr>
+        <w:t>-scale segmentation datasets[1]</w:t>
       </w:r>
       <w:r>
         <w:rPr>
@@ -8933,7 +9364,29 @@
           <w:sz w:val="24"/>
           <w:szCs w:val="24"/>
         </w:rPr>
-        <w:t xml:space="preserve"> is a popular metric for assessing image segmentation models; it is often referred to as the Jaccard Index. The overlap between the ground truth and the anticipated segmentation is measured. By dividing the amount of overlap between the ground truth and predicted </w:t>
+        <w:t xml:space="preserve"> is a popular metric for assessing image segmentation models; it is often referred to as the </w:t>
+      </w:r>
+      <w:proofErr w:type="spellStart"/>
+      <w:r>
+        <w:rPr>
+          <w:rFonts w:ascii="Times New Roman" w:hAnsi="Times New Roman" w:cs="Times New Roman"/>
+          <w:bCs/>
+          <w:color w:val="000000" w:themeColor="text1"/>
+          <w:sz w:val="24"/>
+          <w:szCs w:val="24"/>
+        </w:rPr>
+        <w:t>Jaccard</w:t>
+      </w:r>
+      <w:proofErr w:type="spellEnd"/>
+      <w:r>
+        <w:rPr>
+          <w:rFonts w:ascii="Times New Roman" w:hAnsi="Times New Roman" w:cs="Times New Roman"/>
+          <w:bCs/>
+          <w:color w:val="000000" w:themeColor="text1"/>
+          <w:sz w:val="24"/>
+          <w:szCs w:val="24"/>
+        </w:rPr>
+        <w:t xml:space="preserve"> Index. The overlap between the ground truth and the anticipated segmentation is measured. By dividing the amount of overlap between the ground truth and predicted </w:t>
       </w:r>
       <w:r>
         <w:rPr>
@@ -9109,7 +9562,31 @@
           <w:sz w:val="24"/>
           <w:szCs w:val="24"/>
         </w:rPr>
-        <w:t>Mean Intersection over Union (MIoU)</w:t>
+        <w:t>Mean Intersection over Union (</w:t>
+      </w:r>
+      <w:proofErr w:type="spellStart"/>
+      <w:r>
+        <w:rPr>
+          <w:rFonts w:ascii="Times New Roman" w:hAnsi="Times New Roman" w:cs="Times New Roman"/>
+          <w:b/>
+          <w:bCs/>
+          <w:color w:val="000000" w:themeColor="text1"/>
+          <w:sz w:val="24"/>
+          <w:szCs w:val="24"/>
+        </w:rPr>
+        <w:t>MIoU</w:t>
+      </w:r>
+      <w:proofErr w:type="spellEnd"/>
+      <w:r>
+        <w:rPr>
+          <w:rFonts w:ascii="Times New Roman" w:hAnsi="Times New Roman" w:cs="Times New Roman"/>
+          <w:b/>
+          <w:bCs/>
+          <w:color w:val="000000" w:themeColor="text1"/>
+          <w:sz w:val="24"/>
+          <w:szCs w:val="24"/>
+        </w:rPr>
+        <w:t>)</w:t>
       </w:r>
     </w:p>
     <w:p>
@@ -9132,7 +9609,29 @@
           <w:sz w:val="24"/>
           <w:szCs w:val="24"/>
         </w:rPr>
-        <w:t>When evaluating image segmentation tasks, Mean Intersection over Union (MIoU) is a frequently used metric. Calculating the gap between the predicted segmentation regions and the ground truth allows one to assess a segmentation model's accuracy. More specifically, it shows the proportion of the union (all pixels that are part of either the ground truth or predicted regions) to the intersection (pixels that are successfully predicted).</w:t>
+        <w:t>When evaluating image segmentation tasks, Mean Intersection over Union (</w:t>
+      </w:r>
+      <w:proofErr w:type="spellStart"/>
+      <w:r>
+        <w:rPr>
+          <w:rFonts w:ascii="Times New Roman" w:hAnsi="Times New Roman" w:cs="Times New Roman"/>
+          <w:bCs/>
+          <w:color w:val="000000" w:themeColor="text1"/>
+          <w:sz w:val="24"/>
+          <w:szCs w:val="24"/>
+        </w:rPr>
+        <w:t>MIoU</w:t>
+      </w:r>
+      <w:proofErr w:type="spellEnd"/>
+      <w:r>
+        <w:rPr>
+          <w:rFonts w:ascii="Times New Roman" w:hAnsi="Times New Roman" w:cs="Times New Roman"/>
+          <w:bCs/>
+          <w:color w:val="000000" w:themeColor="text1"/>
+          <w:sz w:val="24"/>
+          <w:szCs w:val="24"/>
+        </w:rPr>
+        <w:t>) is a frequently used metric. Calculating the gap between the predicted segmentation regions and the ground truth allows one to assess a segmentation model's accuracy. More specifically, it shows the proportion of the union (all pixels that are part of either the ground truth or predicted regions) to the intersection (pixels that are successfully predicted).</w:t>
       </w:r>
     </w:p>
     <w:p>
@@ -9489,7 +9988,29 @@
           <w:sz w:val="24"/>
           <w:szCs w:val="24"/>
         </w:rPr>
-        <w:t>An improved form of Mean Intersection over Union (MIoU) that takes into consideration the frequency of each class's occurrence in the dataset is called Frequency Weighted Intersection over Union (</w:t>
+        <w:t>An improved form of Mean Intersection over Union (</w:t>
+      </w:r>
+      <w:proofErr w:type="spellStart"/>
+      <w:r>
+        <w:rPr>
+          <w:rFonts w:ascii="Times New Roman" w:hAnsi="Times New Roman" w:cs="Times New Roman"/>
+          <w:bCs/>
+          <w:color w:val="000000" w:themeColor="text1"/>
+          <w:sz w:val="24"/>
+          <w:szCs w:val="24"/>
+        </w:rPr>
+        <w:t>MIoU</w:t>
+      </w:r>
+      <w:proofErr w:type="spellEnd"/>
+      <w:r>
+        <w:rPr>
+          <w:rFonts w:ascii="Times New Roman" w:hAnsi="Times New Roman" w:cs="Times New Roman"/>
+          <w:bCs/>
+          <w:color w:val="000000" w:themeColor="text1"/>
+          <w:sz w:val="24"/>
+          <w:szCs w:val="24"/>
+        </w:rPr>
+        <w:t>) that takes into consideration the frequency of each class's occurrence in the dataset is called Frequency Weighted Intersection over Union (</w:t>
       </w:r>
       <w:proofErr w:type="spellStart"/>
       <w:r>
@@ -11223,6 +11744,7 @@
                 <w:szCs w:val="24"/>
               </w:rPr>
             </w:pPr>
+            <w:proofErr w:type="spellStart"/>
             <w:r>
               <w:rPr>
                 <w:rFonts w:ascii="Times New Roman" w:hAnsi="Times New Roman" w:cs="Times New Roman"/>
@@ -11232,6 +11754,7 @@
               </w:rPr>
               <w:t>ENet</w:t>
             </w:r>
+            <w:proofErr w:type="spellEnd"/>
             <w:r>
               <w:rPr>
                 <w:rFonts w:ascii="Times New Roman" w:hAnsi="Times New Roman" w:cs="Times New Roman"/>
@@ -12117,6 +12640,7 @@
                 <w:szCs w:val="24"/>
               </w:rPr>
             </w:pPr>
+            <w:proofErr w:type="spellStart"/>
             <w:r>
               <w:rPr>
                 <w:rFonts w:ascii="Times New Roman" w:hAnsi="Times New Roman" w:cs="Times New Roman"/>
@@ -12126,6 +12650,7 @@
               </w:rPr>
               <w:t>ENet</w:t>
             </w:r>
+            <w:proofErr w:type="spellEnd"/>
             <w:r>
               <w:rPr>
                 <w:rFonts w:ascii="Times New Roman" w:hAnsi="Times New Roman" w:cs="Times New Roman"/>
@@ -12820,13 +13345,13 @@
         <w:tblLook w:val="04A0" w:firstRow="1" w:lastRow="0" w:firstColumn="1" w:lastColumn="0" w:noHBand="0" w:noVBand="1"/>
       </w:tblPr>
       <w:tblGrid>
-        <w:gridCol w:w="2131"/>
-        <w:gridCol w:w="1433"/>
+        <w:gridCol w:w="1863"/>
+        <w:gridCol w:w="1482"/>
         <w:gridCol w:w="1027"/>
         <w:gridCol w:w="1072"/>
         <w:gridCol w:w="972"/>
-        <w:gridCol w:w="895"/>
-        <w:gridCol w:w="2029"/>
+        <w:gridCol w:w="930"/>
+        <w:gridCol w:w="2213"/>
       </w:tblGrid>
       <w:tr>
         <w:trPr>
@@ -13185,60 +13710,6 @@
               </w:rPr>
               <w:t xml:space="preserve"> </w:t>
             </w:r>
-            <w:proofErr w:type="spellStart"/>
-            <w:r>
-              <w:rPr>
-                <w:rFonts w:ascii="Times New Roman" w:hAnsi="Times New Roman" w:cs="Times New Roman"/>
-                <w:sz w:val="20"/>
-                <w:szCs w:val="20"/>
-              </w:rPr>
-              <w:t>autjor</w:t>
-            </w:r>
-            <w:proofErr w:type="spellEnd"/>
-            <w:r>
-              <w:rPr>
-                <w:rFonts w:ascii="Times New Roman" w:hAnsi="Times New Roman" w:cs="Times New Roman"/>
-                <w:sz w:val="20"/>
-                <w:szCs w:val="20"/>
-              </w:rPr>
-              <w:t xml:space="preserve"> name </w:t>
-            </w:r>
-            <w:proofErr w:type="spellStart"/>
-            <w:r>
-              <w:rPr>
-                <w:rFonts w:ascii="Times New Roman" w:hAnsi="Times New Roman" w:cs="Times New Roman"/>
-                <w:sz w:val="20"/>
-                <w:szCs w:val="20"/>
-              </w:rPr>
-              <w:t>dite</w:t>
-            </w:r>
-            <w:proofErr w:type="spellEnd"/>
-            <w:r>
-              <w:rPr>
-                <w:rFonts w:ascii="Times New Roman" w:hAnsi="Times New Roman" w:cs="Times New Roman"/>
-                <w:sz w:val="20"/>
-                <w:szCs w:val="20"/>
-              </w:rPr>
-              <w:t xml:space="preserve"> </w:t>
-            </w:r>
-            <w:proofErr w:type="spellStart"/>
-            <w:r>
-              <w:rPr>
-                <w:rFonts w:ascii="Times New Roman" w:hAnsi="Times New Roman" w:cs="Times New Roman"/>
-                <w:sz w:val="20"/>
-                <w:szCs w:val="20"/>
-              </w:rPr>
-              <w:t>hobe</w:t>
-            </w:r>
-            <w:proofErr w:type="spellEnd"/>
-            <w:r>
-              <w:rPr>
-                <w:rFonts w:ascii="Times New Roman" w:hAnsi="Times New Roman" w:cs="Times New Roman"/>
-                <w:sz w:val="20"/>
-                <w:szCs w:val="20"/>
-              </w:rPr>
-              <w:t xml:space="preserve"> then reference</w:t>
-            </w:r>
             <w:r>
               <w:rPr>
                 <w:rFonts w:ascii="Times New Roman" w:hAnsi="Times New Roman" w:cs="Times New Roman"/>
@@ -14435,6 +14906,7 @@
                 <w:szCs w:val="20"/>
               </w:rPr>
             </w:pPr>
+            <w:proofErr w:type="spellStart"/>
             <w:r>
               <w:rPr>
                 <w:rFonts w:ascii="Times New Roman" w:hAnsi="Times New Roman" w:cs="Times New Roman"/>
@@ -14442,7 +14914,17 @@
                 <w:sz w:val="20"/>
                 <w:szCs w:val="20"/>
               </w:rPr>
-              <w:t>ENet[81]</w:t>
+              <w:t>ENet</w:t>
+            </w:r>
+            <w:proofErr w:type="spellEnd"/>
+            <w:r>
+              <w:rPr>
+                <w:rFonts w:ascii="Times New Roman" w:hAnsi="Times New Roman" w:cs="Times New Roman"/>
+                <w:color w:val="000000" w:themeColor="text1"/>
+                <w:sz w:val="20"/>
+                <w:szCs w:val="20"/>
+              </w:rPr>
+              <w:t>[81]</w:t>
             </w:r>
           </w:p>
         </w:tc>
@@ -14462,6 +14944,7 @@
                 <w:szCs w:val="20"/>
               </w:rPr>
             </w:pPr>
+            <w:proofErr w:type="spellStart"/>
             <w:r>
               <w:rPr>
                 <w:rFonts w:ascii="Times New Roman" w:hAnsi="Times New Roman" w:cs="Times New Roman"/>
@@ -14469,7 +14952,17 @@
                 <w:sz w:val="20"/>
                 <w:szCs w:val="20"/>
               </w:rPr>
-              <w:t>ENet bottleneck</w:t>
+              <w:t>ENet</w:t>
+            </w:r>
+            <w:proofErr w:type="spellEnd"/>
+            <w:r>
+              <w:rPr>
+                <w:rFonts w:ascii="Times New Roman" w:hAnsi="Times New Roman" w:cs="Times New Roman"/>
+                <w:color w:val="000000" w:themeColor="text1"/>
+                <w:sz w:val="20"/>
+                <w:szCs w:val="20"/>
+              </w:rPr>
+              <w:t xml:space="preserve"> bottleneck</w:t>
             </w:r>
           </w:p>
         </w:tc>
@@ -16639,7 +17132,29 @@
           <w:sz w:val="24"/>
           <w:szCs w:val="24"/>
         </w:rPr>
-        <w:t xml:space="preserve">Hierarchical features are extracted from the input image by the encoder using a pretrained CNN backbone, such as </w:t>
+        <w:t xml:space="preserve">Hierarchical features are extracted from the input image by the encoder using a </w:t>
+      </w:r>
+      <w:proofErr w:type="spellStart"/>
+      <w:r>
+        <w:rPr>
+          <w:rFonts w:ascii="Times New Roman" w:hAnsi="Times New Roman" w:cs="Times New Roman"/>
+          <w:bCs/>
+          <w:color w:val="000000" w:themeColor="text1"/>
+          <w:sz w:val="24"/>
+          <w:szCs w:val="24"/>
+        </w:rPr>
+        <w:t>pretrained</w:t>
+      </w:r>
+      <w:proofErr w:type="spellEnd"/>
+      <w:r>
+        <w:rPr>
+          <w:rFonts w:ascii="Times New Roman" w:hAnsi="Times New Roman" w:cs="Times New Roman"/>
+          <w:bCs/>
+          <w:color w:val="000000" w:themeColor="text1"/>
+          <w:sz w:val="24"/>
+          <w:szCs w:val="24"/>
+        </w:rPr>
+        <w:t xml:space="preserve"> CNN backbone, such as </w:t>
       </w:r>
       <w:proofErr w:type="spellStart"/>
       <w:r>
@@ -16683,7 +17198,29 @@
           <w:sz w:val="24"/>
           <w:szCs w:val="24"/>
         </w:rPr>
-        <w:t>.  While deeper layers capture semantic characteristics and global context, first layers catch fine textures and edges.  To increase the receptive field while maintaining spatial resolution, dilated convolutions might be employed.</w:t>
+        <w:t xml:space="preserve">.  While deeper </w:t>
+      </w:r>
+      <w:proofErr w:type="gramStart"/>
+      <w:r>
+        <w:rPr>
+          <w:rFonts w:ascii="Times New Roman" w:hAnsi="Times New Roman" w:cs="Times New Roman"/>
+          <w:bCs/>
+          <w:color w:val="000000" w:themeColor="text1"/>
+          <w:sz w:val="24"/>
+          <w:szCs w:val="24"/>
+        </w:rPr>
+        <w:t>layers</w:t>
+      </w:r>
+      <w:proofErr w:type="gramEnd"/>
+      <w:r>
+        <w:rPr>
+          <w:rFonts w:ascii="Times New Roman" w:hAnsi="Times New Roman" w:cs="Times New Roman"/>
+          <w:bCs/>
+          <w:color w:val="000000" w:themeColor="text1"/>
+          <w:sz w:val="24"/>
+          <w:szCs w:val="24"/>
+        </w:rPr>
+        <w:t xml:space="preserve"> capture semantic characteristics and global context, first layers catch fine textures and edges.  To increase the receptive field while maintaining spatial resolution, dilated convolutions might be employed.</w:t>
       </w:r>
     </w:p>
     <w:p>
@@ -17241,10 +17778,10 @@
           <w:lang w:bidi="ar-SA"/>
         </w:rPr>
         <w:drawing>
-          <wp:inline distT="0" distB="0" distL="0" distR="0" wp14:anchorId="3B7AE704" wp14:editId="24650CC4">
-            <wp:extent cx="5372100" cy="2432368"/>
-            <wp:effectExtent l="0" t="0" r="0" b="6350"/>
-            <wp:docPr id="2" name="Picture 2"/>
+          <wp:inline distT="0" distB="0" distL="0" distR="0" wp14:anchorId="378A720D" wp14:editId="7D827E48">
+            <wp:extent cx="5402580" cy="2819400"/>
+            <wp:effectExtent l="0" t="0" r="7620" b="0"/>
+            <wp:docPr id="4" name="Picture 4"/>
             <wp:cNvGraphicFramePr>
               <a:graphicFrameLocks xmlns:a="http://schemas.openxmlformats.org/drawingml/2006/main" noChangeAspect="1"/>
             </wp:cNvGraphicFramePr>
@@ -17252,7 +17789,7 @@
               <a:graphicData uri="http://schemas.openxmlformats.org/drawingml/2006/picture">
                 <pic:pic xmlns:pic="http://schemas.openxmlformats.org/drawingml/2006/picture">
                   <pic:nvPicPr>
-                    <pic:cNvPr id="2" name="proposed architecture.png"/>
+                    <pic:cNvPr id="4" name="Gemini_Generated_Image_q89kl2q89kl2q89k.png"/>
                     <pic:cNvPicPr/>
                   </pic:nvPicPr>
                   <pic:blipFill>
@@ -17270,7 +17807,7 @@
                   <pic:spPr>
                     <a:xfrm>
                       <a:off x="0" y="0"/>
-                      <a:ext cx="5381240" cy="2436507"/>
+                      <a:ext cx="5402580" cy="2819400"/>
                     </a:xfrm>
                     <a:prstGeom prst="rect">
                       <a:avLst/>
@@ -17503,7 +18040,16 @@
           <w:b w:val="0"/>
           <w:color w:val="000000" w:themeColor="text1"/>
         </w:rPr>
-        <w:t xml:space="preserve"> In order to segment images for biomedical applications, the research [59] presents the U-Net architecture, a deep convolutional network. Lack of labeled training data is one of the primary challenges in image processing, particularly in the biomedical domain. The authors offer a training approach that effectively utilizes the existing annotated examples by relying mostly on data augmentation in order to overcome this difficulty. Using training pictures with elastic deformations, the network may learn to be invariant to these transformations without requiring a large amount of annotated data.</w:t>
+        <w:t xml:space="preserve"> In order to segment images for biomedical applications, the research [59] presents the U-Net architecture, a deep convolutional network. Lack of labeled training data is one of the primary challenges in image processing, particularly in the biomedical domain. The authors offer a training approach that effectively utilizes the existing annotated examples by relying mostly on data augmentation in order to overcome </w:t>
+      </w:r>
+      <w:r>
+        <w:rPr>
+          <w:rFonts w:ascii="Times New Roman" w:hAnsi="Times New Roman" w:cs="Times New Roman"/>
+          <w:b w:val="0"/>
+          <w:color w:val="000000" w:themeColor="text1"/>
+        </w:rPr>
+        <w:lastRenderedPageBreak/>
+        <w:t>this difficulty. Using training pictures with elastic deformations, the network may learn to be invariant to these transformations without requiring a large amount of annotated data.</w:t>
       </w:r>
     </w:p>
     <w:p>
@@ -17526,7 +18072,6 @@
           <w:rFonts w:ascii="Times New Roman" w:hAnsi="Times New Roman" w:cs="Times New Roman"/>
           <w:color w:val="000000" w:themeColor="text1"/>
         </w:rPr>
-        <w:lastRenderedPageBreak/>
         <w:t>Context Understanding:</w:t>
       </w:r>
       <w:r>
@@ -17728,7 +18273,16 @@
           <w:b w:val="0"/>
           <w:color w:val="000000" w:themeColor="text1"/>
         </w:rPr>
-        <w:t xml:space="preserve"> Semantic segmentation involves many obstacles, particularly when dealing with objects of different sizes and shapes. One model cannot fully segment all of the variables in natural settings due to the wide range of sizes and forms of items. It is crucial, but difficult, to capture contextual information at various resolutions since it calls for advanced multi scale feature extraction techniques. Complexity also arises from the need to dynamically modify receptive fields to different sizes and forms using methods such as deformable convolutions. Robust data augmentation procedures are necessary for training models to be resilient to scale fluctuations, but they can be challenging to put into practice. An additional layer of complexity is introduced by using Region Proposal Networks (RPNs) to generate precise item suggestions of various sizes. </w:t>
+        <w:t xml:space="preserve"> Semantic segmentation involves many obstacles, particularly when dealing with objects of different sizes and shapes. One model cannot fully segment all of the variables in natural settings due to the wide range of sizes and forms of items. It is crucial, but difficult, to capture contextual information at various resolutions since it calls for advanced multi scale feature extraction techniques. Complexity also arises from the need to dynamically modify receptive fields to different sizes and forms using methods such as deformable convolutions. Robust data augmentation procedures are necessary for training models to be resilient to scale fluctuations, but they can be challenging to put into practice. An additional layer of complexity is introduced by </w:t>
+      </w:r>
+      <w:r>
+        <w:rPr>
+          <w:rFonts w:ascii="Times New Roman" w:hAnsi="Times New Roman" w:cs="Times New Roman"/>
+          <w:b w:val="0"/>
+          <w:color w:val="000000" w:themeColor="text1"/>
+        </w:rPr>
+        <w:lastRenderedPageBreak/>
+        <w:t xml:space="preserve">using Region Proposal Networks (RPNs) to generate precise item suggestions of various sizes. </w:t>
       </w:r>
     </w:p>
     <w:p>
@@ -17751,7 +18305,6 @@
           <w:rFonts w:ascii="Times New Roman" w:hAnsi="Times New Roman" w:cs="Times New Roman"/>
           <w:color w:val="000000" w:themeColor="text1"/>
         </w:rPr>
-        <w:lastRenderedPageBreak/>
         <w:t>Managing Overlapping Objects and O</w:t>
       </w:r>
       <w:r>
@@ -18046,28 +18599,42 @@
           <w:sz w:val="24"/>
           <w:szCs w:val="24"/>
         </w:rPr>
-        <w:t>Edge Computing and IoT Applications</w:t>
-      </w:r>
-      <w:r>
-        <w:rPr>
-          <w:rFonts w:ascii="Times New Roman" w:hAnsi="Times New Roman" w:cs="Times New Roman"/>
-          <w:bCs/>
-          <w:color w:val="000000" w:themeColor="text1"/>
-          <w:sz w:val="24"/>
-          <w:szCs w:val="24"/>
-        </w:rPr>
-        <w:t xml:space="preserve"> [65]: Optimizing segmentation models for constrained computational and memory resources is necessary for deploying them on edge </w:t>
-      </w:r>
-      <w:r>
-        <w:rPr>
-          <w:rFonts w:ascii="Times New Roman" w:hAnsi="Times New Roman" w:cs="Times New Roman"/>
-          <w:bCs/>
-          <w:color w:val="000000" w:themeColor="text1"/>
-          <w:sz w:val="24"/>
-          <w:szCs w:val="24"/>
-        </w:rPr>
         <w:lastRenderedPageBreak/>
-        <w:t xml:space="preserve">devices for Internet of Things applications. This facilitates applications like smart surveillance and industrial automation by enabling real-time analysis and decision-making in smart cameras, drones, and other linked devices. </w:t>
+        <w:t xml:space="preserve">Edge Computing and </w:t>
+      </w:r>
+      <w:proofErr w:type="spellStart"/>
+      <w:r>
+        <w:rPr>
+          <w:rFonts w:ascii="Times New Roman" w:hAnsi="Times New Roman" w:cs="Times New Roman"/>
+          <w:b/>
+          <w:bCs/>
+          <w:color w:val="000000" w:themeColor="text1"/>
+          <w:sz w:val="24"/>
+          <w:szCs w:val="24"/>
+        </w:rPr>
+        <w:t>IoT</w:t>
+      </w:r>
+      <w:proofErr w:type="spellEnd"/>
+      <w:r>
+        <w:rPr>
+          <w:rFonts w:ascii="Times New Roman" w:hAnsi="Times New Roman" w:cs="Times New Roman"/>
+          <w:b/>
+          <w:bCs/>
+          <w:color w:val="000000" w:themeColor="text1"/>
+          <w:sz w:val="24"/>
+          <w:szCs w:val="24"/>
+        </w:rPr>
+        <w:t xml:space="preserve"> Applications</w:t>
+      </w:r>
+      <w:r>
+        <w:rPr>
+          <w:rFonts w:ascii="Times New Roman" w:hAnsi="Times New Roman" w:cs="Times New Roman"/>
+          <w:bCs/>
+          <w:color w:val="000000" w:themeColor="text1"/>
+          <w:sz w:val="24"/>
+          <w:szCs w:val="24"/>
+        </w:rPr>
+        <w:t xml:space="preserve"> [65]: Optimizing segmentation models for constrained computational and memory resources is necessary for deploying them on edge devices for Internet of Things applications. This facilitates applications like smart surveillance and industrial automation by enabling real-time analysis and decision-making in smart cameras, drones, and other linked devices. </w:t>
       </w:r>
     </w:p>
     <w:p>
@@ -18302,7 +18869,7 @@
           <w:sz w:val="24"/>
           <w:szCs w:val="24"/>
         </w:rPr>
-        <w:t xml:space="preserve">, and unsupervised learning strategies is another exciting avenue. These methods are essential for democratizing the availability of strong segmentation models, particularly in fields where annotated data is hard to come by or prohibitively expensive. Furthermore, the development of real-time segmentation techniques is critical for applications like robotics and mobile computers that require fast and effective processing. Future studies should concentrate on strengthening segmentation models’ resistance to hostile attacks and domain shifts in order to guarantee </w:t>
+        <w:t xml:space="preserve">, and unsupervised learning strategies is another exciting avenue. These methods are essential for democratizing the availability of strong segmentation models, particularly in fields where annotated data is hard to come by or prohibitively expensive. Furthermore, the development of real-time segmentation techniques is critical for applications like robotics and mobile computers </w:t>
       </w:r>
       <w:r>
         <w:rPr>
@@ -18311,7 +18878,7 @@
           <w:szCs w:val="24"/>
         </w:rPr>
         <w:lastRenderedPageBreak/>
-        <w:t>dependability in a variety of uncertain real-world scenarios. Furthermore, more comprehensive and adaptable systems may result from improving model interpretability and combining segmentation with other computer vision tasks.</w:t>
+        <w:t>that require fast and effective processing. Future studies should concentrate on strengthening segmentation models’ resistance to hostile attacks and domain shifts in order to guarantee dependability in a variety of uncertain real-world scenarios. Furthermore, more comprehensive and adaptable systems may result from improving model interpretability and combining segmentation with other computer vision tasks.</w:t>
       </w:r>
     </w:p>
     <w:p>
@@ -18495,6 +19062,106 @@
           <w:color w:val="000000" w:themeColor="text1"/>
         </w:rPr>
         <w:t xml:space="preserve"> authors have contributed equally and given consent to publish the manuscript.</w:t>
+      </w:r>
+    </w:p>
+    <w:p>
+      <w:pPr>
+        <w:pStyle w:val="1"/>
+        <w:spacing w:before="240" w:after="120"/>
+        <w:ind w:leftChars="0" w:left="0"/>
+        <w:rPr>
+          <w:rFonts w:ascii="Times New Roman" w:hAnsi="Times New Roman" w:cs="Times New Roman"/>
+          <w:bCs/>
+          <w:color w:val="000000" w:themeColor="text1"/>
+        </w:rPr>
+      </w:pPr>
+      <w:r>
+        <w:rPr>
+          <w:rFonts w:ascii="Times New Roman" w:hAnsi="Times New Roman" w:cs="Times New Roman"/>
+          <w:bCs/>
+          <w:color w:val="000000" w:themeColor="text1"/>
+        </w:rPr>
+        <w:t xml:space="preserve">AI Disclosure Statement </w:t>
+      </w:r>
+    </w:p>
+    <w:p>
+      <w:pPr>
+        <w:pStyle w:val="1"/>
+        <w:spacing w:beforeLines="0" w:afterLines="0" w:after="0" w:line="276" w:lineRule="auto"/>
+        <w:ind w:leftChars="0" w:left="0"/>
+        <w:rPr>
+          <w:rFonts w:ascii="Times New Roman" w:hAnsi="Times New Roman" w:cs="Times New Roman"/>
+          <w:b w:val="0"/>
+          <w:bCs/>
+          <w:color w:val="000000" w:themeColor="text1"/>
+        </w:rPr>
+      </w:pPr>
+      <w:r>
+        <w:rPr>
+          <w:rFonts w:ascii="Times New Roman" w:hAnsi="Times New Roman" w:cs="Times New Roman"/>
+          <w:b w:val="0"/>
+          <w:bCs/>
+          <w:color w:val="000000" w:themeColor="text1"/>
+        </w:rPr>
+        <w:t xml:space="preserve">During the preparation of this work, the authors used </w:t>
+      </w:r>
+      <w:proofErr w:type="spellStart"/>
+      <w:r>
+        <w:rPr>
+          <w:rFonts w:ascii="Times New Roman" w:hAnsi="Times New Roman" w:cs="Times New Roman"/>
+          <w:bCs/>
+          <w:color w:val="000000" w:themeColor="text1"/>
+        </w:rPr>
+        <w:t>ChatGPT</w:t>
+      </w:r>
+      <w:proofErr w:type="spellEnd"/>
+      <w:r>
+        <w:rPr>
+          <w:rFonts w:ascii="Times New Roman" w:hAnsi="Times New Roman" w:cs="Times New Roman"/>
+          <w:b w:val="0"/>
+          <w:bCs/>
+          <w:color w:val="000000" w:themeColor="text1"/>
+        </w:rPr>
+        <w:t xml:space="preserve"> (</w:t>
+      </w:r>
+      <w:proofErr w:type="spellStart"/>
+      <w:r>
+        <w:rPr>
+          <w:rFonts w:ascii="Times New Roman" w:hAnsi="Times New Roman" w:cs="Times New Roman"/>
+          <w:b w:val="0"/>
+          <w:bCs/>
+          <w:color w:val="000000" w:themeColor="text1"/>
+        </w:rPr>
+        <w:t>OpenAI</w:t>
+      </w:r>
+      <w:proofErr w:type="spellEnd"/>
+      <w:r>
+        <w:rPr>
+          <w:rFonts w:ascii="Times New Roman" w:hAnsi="Times New Roman" w:cs="Times New Roman"/>
+          <w:b w:val="0"/>
+          <w:bCs/>
+          <w:color w:val="000000" w:themeColor="text1"/>
+        </w:rPr>
+        <w:t xml:space="preserve">) and </w:t>
+      </w:r>
+      <w:proofErr w:type="spellStart"/>
+      <w:r>
+        <w:rPr>
+          <w:rFonts w:ascii="Times New Roman" w:hAnsi="Times New Roman" w:cs="Times New Roman"/>
+          <w:bCs/>
+          <w:color w:val="000000" w:themeColor="text1"/>
+        </w:rPr>
+        <w:t>QuillBot</w:t>
+      </w:r>
+      <w:proofErr w:type="spellEnd"/>
+      <w:r>
+        <w:rPr>
+          <w:rFonts w:ascii="Times New Roman" w:hAnsi="Times New Roman" w:cs="Times New Roman"/>
+          <w:b w:val="0"/>
+          <w:bCs/>
+          <w:color w:val="000000" w:themeColor="text1"/>
+        </w:rPr>
+        <w:t xml:space="preserve"> to improve readability, polish prose, and enhance language fluency. After using these tools, the authors reviewed and edited the content as needed and take full responsibility for the publication's content.</w:t>
       </w:r>
     </w:p>
     <w:p>
@@ -18562,7 +19229,55 @@
           <w:rFonts w:ascii="Times New Roman" w:hAnsi="Times New Roman" w:cs="Times New Roman"/>
           <w:szCs w:val="22"/>
         </w:rPr>
-        <w:t xml:space="preserve">A. Garcia-Garcia, S. Orts-Escolano, S. Oprea, V. Villena-Martinez, and J. Garcia-Rodriguez, “A review on deep learning techniques applied to semantic segmentation,” 2017. </w:t>
+        <w:t>A. Garcia-Garcia, S. Orts-</w:t>
+      </w:r>
+      <w:proofErr w:type="spellStart"/>
+      <w:r>
+        <w:rPr>
+          <w:rFonts w:ascii="Times New Roman" w:hAnsi="Times New Roman" w:cs="Times New Roman"/>
+          <w:szCs w:val="22"/>
+        </w:rPr>
+        <w:t>Escolano</w:t>
+      </w:r>
+      <w:proofErr w:type="spellEnd"/>
+      <w:r>
+        <w:rPr>
+          <w:rFonts w:ascii="Times New Roman" w:hAnsi="Times New Roman" w:cs="Times New Roman"/>
+          <w:szCs w:val="22"/>
+        </w:rPr>
+        <w:t xml:space="preserve">, S. </w:t>
+      </w:r>
+      <w:proofErr w:type="spellStart"/>
+      <w:r>
+        <w:rPr>
+          <w:rFonts w:ascii="Times New Roman" w:hAnsi="Times New Roman" w:cs="Times New Roman"/>
+          <w:szCs w:val="22"/>
+        </w:rPr>
+        <w:t>Oprea</w:t>
+      </w:r>
+      <w:proofErr w:type="spellEnd"/>
+      <w:r>
+        <w:rPr>
+          <w:rFonts w:ascii="Times New Roman" w:hAnsi="Times New Roman" w:cs="Times New Roman"/>
+          <w:szCs w:val="22"/>
+        </w:rPr>
+        <w:t xml:space="preserve">, V. </w:t>
+      </w:r>
+      <w:proofErr w:type="spellStart"/>
+      <w:r>
+        <w:rPr>
+          <w:rFonts w:ascii="Times New Roman" w:hAnsi="Times New Roman" w:cs="Times New Roman"/>
+          <w:szCs w:val="22"/>
+        </w:rPr>
+        <w:t>Villena</w:t>
+      </w:r>
+      <w:proofErr w:type="spellEnd"/>
+      <w:r>
+        <w:rPr>
+          <w:rFonts w:ascii="Times New Roman" w:hAnsi="Times New Roman" w:cs="Times New Roman"/>
+          <w:szCs w:val="22"/>
+        </w:rPr>
+        <w:t xml:space="preserve">-Martinez, and J. Garcia-Rodriguez, “A review on deep learning techniques applied to semantic segmentation,” 2017. </w:t>
       </w:r>
     </w:p>
     <w:p>
@@ -18645,7 +19360,87 @@
           <w:rFonts w:ascii="Times New Roman" w:hAnsi="Times New Roman" w:cs="Times New Roman"/>
           <w:szCs w:val="22"/>
         </w:rPr>
-        <w:t xml:space="preserve">B. Emek Soylu, M. S. Guzel, G. E. Bostanci, F. Ekinci, T. </w:t>
+        <w:t xml:space="preserve">B. </w:t>
+      </w:r>
+      <w:proofErr w:type="spellStart"/>
+      <w:r>
+        <w:rPr>
+          <w:rFonts w:ascii="Times New Roman" w:hAnsi="Times New Roman" w:cs="Times New Roman"/>
+          <w:szCs w:val="22"/>
+        </w:rPr>
+        <w:t>Emek</w:t>
+      </w:r>
+      <w:proofErr w:type="spellEnd"/>
+      <w:r>
+        <w:rPr>
+          <w:rFonts w:ascii="Times New Roman" w:hAnsi="Times New Roman" w:cs="Times New Roman"/>
+          <w:szCs w:val="22"/>
+        </w:rPr>
+        <w:t xml:space="preserve"> </w:t>
+      </w:r>
+      <w:proofErr w:type="spellStart"/>
+      <w:r>
+        <w:rPr>
+          <w:rFonts w:ascii="Times New Roman" w:hAnsi="Times New Roman" w:cs="Times New Roman"/>
+          <w:szCs w:val="22"/>
+        </w:rPr>
+        <w:t>Soylu</w:t>
+      </w:r>
+      <w:proofErr w:type="spellEnd"/>
+      <w:r>
+        <w:rPr>
+          <w:rFonts w:ascii="Times New Roman" w:hAnsi="Times New Roman" w:cs="Times New Roman"/>
+          <w:szCs w:val="22"/>
+        </w:rPr>
+        <w:t xml:space="preserve">, M. S. </w:t>
+      </w:r>
+      <w:proofErr w:type="spellStart"/>
+      <w:r>
+        <w:rPr>
+          <w:rFonts w:ascii="Times New Roman" w:hAnsi="Times New Roman" w:cs="Times New Roman"/>
+          <w:szCs w:val="22"/>
+        </w:rPr>
+        <w:t>Guzel</w:t>
+      </w:r>
+      <w:proofErr w:type="spellEnd"/>
+      <w:r>
+        <w:rPr>
+          <w:rFonts w:ascii="Times New Roman" w:hAnsi="Times New Roman" w:cs="Times New Roman"/>
+          <w:szCs w:val="22"/>
+        </w:rPr>
+        <w:t xml:space="preserve">, G. E. </w:t>
+      </w:r>
+      <w:proofErr w:type="spellStart"/>
+      <w:r>
+        <w:rPr>
+          <w:rFonts w:ascii="Times New Roman" w:hAnsi="Times New Roman" w:cs="Times New Roman"/>
+          <w:szCs w:val="22"/>
+        </w:rPr>
+        <w:t>Bostanci</w:t>
+      </w:r>
+      <w:proofErr w:type="spellEnd"/>
+      <w:r>
+        <w:rPr>
+          <w:rFonts w:ascii="Times New Roman" w:hAnsi="Times New Roman" w:cs="Times New Roman"/>
+          <w:szCs w:val="22"/>
+        </w:rPr>
+        <w:t xml:space="preserve">, F. </w:t>
+      </w:r>
+      <w:proofErr w:type="spellStart"/>
+      <w:r>
+        <w:rPr>
+          <w:rFonts w:ascii="Times New Roman" w:hAnsi="Times New Roman" w:cs="Times New Roman"/>
+          <w:szCs w:val="22"/>
+        </w:rPr>
+        <w:t>Ekinci</w:t>
+      </w:r>
+      <w:proofErr w:type="spellEnd"/>
+      <w:r>
+        <w:rPr>
+          <w:rFonts w:ascii="Times New Roman" w:hAnsi="Times New Roman" w:cs="Times New Roman"/>
+          <w:szCs w:val="22"/>
+        </w:rPr>
+        <w:t xml:space="preserve">, T. </w:t>
       </w:r>
       <w:proofErr w:type="spellStart"/>
       <w:r>
@@ -18706,7 +19501,23 @@
           <w:rFonts w:ascii="Times New Roman" w:hAnsi="Times New Roman" w:cs="Times New Roman"/>
           <w:szCs w:val="22"/>
         </w:rPr>
-        <w:t>Y. Guo, Y. Liu, T. Georgiou, and M. Lew, “A review of semantic segmentation using deep neural networks,” International Journal of Multimedia Information Retrieval, vol. 7, 06 2018.</w:t>
+        <w:t xml:space="preserve">Y. </w:t>
+      </w:r>
+      <w:proofErr w:type="spellStart"/>
+      <w:r>
+        <w:rPr>
+          <w:rFonts w:ascii="Times New Roman" w:hAnsi="Times New Roman" w:cs="Times New Roman"/>
+          <w:szCs w:val="22"/>
+        </w:rPr>
+        <w:t>Guo</w:t>
+      </w:r>
+      <w:proofErr w:type="spellEnd"/>
+      <w:r>
+        <w:rPr>
+          <w:rFonts w:ascii="Times New Roman" w:hAnsi="Times New Roman" w:cs="Times New Roman"/>
+          <w:szCs w:val="22"/>
+        </w:rPr>
+        <w:t>, Y. Liu, T. Georgiou, and M. Lew, “A review of semantic segmentation using deep neural networks,” International Journal of Multimedia Information Retrieval, vol. 7, 06 2018.</w:t>
       </w:r>
     </w:p>
     <w:p>
@@ -18760,7 +19571,23 @@
           <w:rFonts w:ascii="Times New Roman" w:hAnsi="Times New Roman" w:cs="Times New Roman"/>
           <w:szCs w:val="22"/>
         </w:rPr>
-        <w:t xml:space="preserve">, and V. Lepetit, “Hands deep in deep learning for hand pose estimation,” 2016. </w:t>
+        <w:t xml:space="preserve">, and V. </w:t>
+      </w:r>
+      <w:proofErr w:type="spellStart"/>
+      <w:r>
+        <w:rPr>
+          <w:rFonts w:ascii="Times New Roman" w:hAnsi="Times New Roman" w:cs="Times New Roman"/>
+          <w:szCs w:val="22"/>
+        </w:rPr>
+        <w:t>Lepetit</w:t>
+      </w:r>
+      <w:proofErr w:type="spellEnd"/>
+      <w:r>
+        <w:rPr>
+          <w:rFonts w:ascii="Times New Roman" w:hAnsi="Times New Roman" w:cs="Times New Roman"/>
+          <w:szCs w:val="22"/>
+        </w:rPr>
+        <w:t xml:space="preserve">, “Hands deep in deep learning for hand pose estimation,” 2016. </w:t>
       </w:r>
     </w:p>
     <w:p>
@@ -18782,7 +19609,103 @@
           <w:rFonts w:ascii="Times New Roman" w:hAnsi="Times New Roman" w:cs="Times New Roman"/>
           <w:szCs w:val="22"/>
         </w:rPr>
-        <w:t>M. Cordts, M. Omran, S. Ramos, T. Rehfeld, M. Enzweiler, R. Benenson, U. Franke, S. Roth, and B. Schiele, “The cityscapes dataset for semantic ur</w:t>
+        <w:t xml:space="preserve">M. </w:t>
+      </w:r>
+      <w:proofErr w:type="spellStart"/>
+      <w:r>
+        <w:rPr>
+          <w:rFonts w:ascii="Times New Roman" w:hAnsi="Times New Roman" w:cs="Times New Roman"/>
+          <w:szCs w:val="22"/>
+        </w:rPr>
+        <w:t>Cordts</w:t>
+      </w:r>
+      <w:proofErr w:type="spellEnd"/>
+      <w:r>
+        <w:rPr>
+          <w:rFonts w:ascii="Times New Roman" w:hAnsi="Times New Roman" w:cs="Times New Roman"/>
+          <w:szCs w:val="22"/>
+        </w:rPr>
+        <w:t xml:space="preserve">, M. </w:t>
+      </w:r>
+      <w:proofErr w:type="spellStart"/>
+      <w:r>
+        <w:rPr>
+          <w:rFonts w:ascii="Times New Roman" w:hAnsi="Times New Roman" w:cs="Times New Roman"/>
+          <w:szCs w:val="22"/>
+        </w:rPr>
+        <w:t>Omran</w:t>
+      </w:r>
+      <w:proofErr w:type="spellEnd"/>
+      <w:r>
+        <w:rPr>
+          <w:rFonts w:ascii="Times New Roman" w:hAnsi="Times New Roman" w:cs="Times New Roman"/>
+          <w:szCs w:val="22"/>
+        </w:rPr>
+        <w:t xml:space="preserve">, S. Ramos, T. </w:t>
+      </w:r>
+      <w:proofErr w:type="spellStart"/>
+      <w:r>
+        <w:rPr>
+          <w:rFonts w:ascii="Times New Roman" w:hAnsi="Times New Roman" w:cs="Times New Roman"/>
+          <w:szCs w:val="22"/>
+        </w:rPr>
+        <w:t>Rehfeld</w:t>
+      </w:r>
+      <w:proofErr w:type="spellEnd"/>
+      <w:r>
+        <w:rPr>
+          <w:rFonts w:ascii="Times New Roman" w:hAnsi="Times New Roman" w:cs="Times New Roman"/>
+          <w:szCs w:val="22"/>
+        </w:rPr>
+        <w:t xml:space="preserve">, M. </w:t>
+      </w:r>
+      <w:proofErr w:type="spellStart"/>
+      <w:r>
+        <w:rPr>
+          <w:rFonts w:ascii="Times New Roman" w:hAnsi="Times New Roman" w:cs="Times New Roman"/>
+          <w:szCs w:val="22"/>
+        </w:rPr>
+        <w:t>Enzweiler</w:t>
+      </w:r>
+      <w:proofErr w:type="spellEnd"/>
+      <w:r>
+        <w:rPr>
+          <w:rFonts w:ascii="Times New Roman" w:hAnsi="Times New Roman" w:cs="Times New Roman"/>
+          <w:szCs w:val="22"/>
+        </w:rPr>
+        <w:t xml:space="preserve">, R. </w:t>
+      </w:r>
+      <w:proofErr w:type="spellStart"/>
+      <w:r>
+        <w:rPr>
+          <w:rFonts w:ascii="Times New Roman" w:hAnsi="Times New Roman" w:cs="Times New Roman"/>
+          <w:szCs w:val="22"/>
+        </w:rPr>
+        <w:t>Benenson</w:t>
+      </w:r>
+      <w:proofErr w:type="spellEnd"/>
+      <w:r>
+        <w:rPr>
+          <w:rFonts w:ascii="Times New Roman" w:hAnsi="Times New Roman" w:cs="Times New Roman"/>
+          <w:szCs w:val="22"/>
+        </w:rPr>
+        <w:t xml:space="preserve">, U. Franke, S. Roth, and B. </w:t>
+      </w:r>
+      <w:proofErr w:type="spellStart"/>
+      <w:r>
+        <w:rPr>
+          <w:rFonts w:ascii="Times New Roman" w:hAnsi="Times New Roman" w:cs="Times New Roman"/>
+          <w:szCs w:val="22"/>
+        </w:rPr>
+        <w:t>Schiele</w:t>
+      </w:r>
+      <w:proofErr w:type="spellEnd"/>
+      <w:r>
+        <w:rPr>
+          <w:rFonts w:ascii="Times New Roman" w:hAnsi="Times New Roman" w:cs="Times New Roman"/>
+          <w:szCs w:val="22"/>
+        </w:rPr>
+        <w:t>, “The cityscapes dataset for semantic ur</w:t>
       </w:r>
       <w:r>
         <w:rPr>
@@ -18811,7 +19734,24 @@
           <w:rFonts w:ascii="Times New Roman" w:hAnsi="Times New Roman" w:cs="Times New Roman"/>
           <w:szCs w:val="22"/>
         </w:rPr>
-        <w:t xml:space="preserve">A. Geiger, P. Lenz, and R. Urtasun, “Are we ready for autonomous driving? the </w:t>
+        <w:lastRenderedPageBreak/>
+        <w:t xml:space="preserve">A. Geiger, P. Lenz, and R. </w:t>
+      </w:r>
+      <w:proofErr w:type="spellStart"/>
+      <w:r>
+        <w:rPr>
+          <w:rFonts w:ascii="Times New Roman" w:hAnsi="Times New Roman" w:cs="Times New Roman"/>
+          <w:szCs w:val="22"/>
+        </w:rPr>
+        <w:t>Urtasun</w:t>
+      </w:r>
+      <w:proofErr w:type="spellEnd"/>
+      <w:r>
+        <w:rPr>
+          <w:rFonts w:ascii="Times New Roman" w:hAnsi="Times New Roman" w:cs="Times New Roman"/>
+          <w:szCs w:val="22"/>
+        </w:rPr>
+        <w:t xml:space="preserve">, “Are we ready for autonomous driving? the </w:t>
       </w:r>
       <w:proofErr w:type="spellStart"/>
       <w:r>
@@ -18856,7 +19796,55 @@
           <w:rFonts w:ascii="Times New Roman" w:hAnsi="Times New Roman" w:cs="Times New Roman"/>
           <w:szCs w:val="22"/>
         </w:rPr>
-        <w:t xml:space="preserve">A. Ess, T. Mueller, H. Grabner, and L. Van Gool, “Segmentation-based urban traffic scene understanding.” in BMVC, vol. 1. </w:t>
+        <w:t xml:space="preserve">A. </w:t>
+      </w:r>
+      <w:proofErr w:type="spellStart"/>
+      <w:r>
+        <w:rPr>
+          <w:rFonts w:ascii="Times New Roman" w:hAnsi="Times New Roman" w:cs="Times New Roman"/>
+          <w:szCs w:val="22"/>
+        </w:rPr>
+        <w:t>Ess</w:t>
+      </w:r>
+      <w:proofErr w:type="spellEnd"/>
+      <w:r>
+        <w:rPr>
+          <w:rFonts w:ascii="Times New Roman" w:hAnsi="Times New Roman" w:cs="Times New Roman"/>
+          <w:szCs w:val="22"/>
+        </w:rPr>
+        <w:t xml:space="preserve">, T. Mueller, H. </w:t>
+      </w:r>
+      <w:proofErr w:type="spellStart"/>
+      <w:r>
+        <w:rPr>
+          <w:rFonts w:ascii="Times New Roman" w:hAnsi="Times New Roman" w:cs="Times New Roman"/>
+          <w:szCs w:val="22"/>
+        </w:rPr>
+        <w:t>Grabner</w:t>
+      </w:r>
+      <w:proofErr w:type="spellEnd"/>
+      <w:r>
+        <w:rPr>
+          <w:rFonts w:ascii="Times New Roman" w:hAnsi="Times New Roman" w:cs="Times New Roman"/>
+          <w:szCs w:val="22"/>
+        </w:rPr>
+        <w:t xml:space="preserve">, and L. Van </w:t>
+      </w:r>
+      <w:proofErr w:type="spellStart"/>
+      <w:r>
+        <w:rPr>
+          <w:rFonts w:ascii="Times New Roman" w:hAnsi="Times New Roman" w:cs="Times New Roman"/>
+          <w:szCs w:val="22"/>
+        </w:rPr>
+        <w:t>Gool</w:t>
+      </w:r>
+      <w:proofErr w:type="spellEnd"/>
+      <w:r>
+        <w:rPr>
+          <w:rFonts w:ascii="Times New Roman" w:hAnsi="Times New Roman" w:cs="Times New Roman"/>
+          <w:szCs w:val="22"/>
+        </w:rPr>
+        <w:t xml:space="preserve">, “Segmentation-based urban traffic scene understanding.” in BMVC, vol. 1. </w:t>
       </w:r>
       <w:proofErr w:type="spellStart"/>
       <w:r>
@@ -18917,7 +19905,23 @@
           <w:rFonts w:ascii="Times New Roman" w:hAnsi="Times New Roman" w:cs="Times New Roman"/>
           <w:szCs w:val="22"/>
         </w:rPr>
-        <w:t>, J.-Y. Lee, and I. So Kweon, “Learning a deep convolutional network for light-field image super-resolution,” in Proceedings of the IEEE international conference on computer vision workshops, 2015, pp. 24–32.</w:t>
+        <w:t xml:space="preserve">, J.-Y. Lee, and I. So </w:t>
+      </w:r>
+      <w:proofErr w:type="spellStart"/>
+      <w:r>
+        <w:rPr>
+          <w:rFonts w:ascii="Times New Roman" w:hAnsi="Times New Roman" w:cs="Times New Roman"/>
+          <w:szCs w:val="22"/>
+        </w:rPr>
+        <w:t>Kweon</w:t>
+      </w:r>
+      <w:proofErr w:type="spellEnd"/>
+      <w:r>
+        <w:rPr>
+          <w:rFonts w:ascii="Times New Roman" w:hAnsi="Times New Roman" w:cs="Times New Roman"/>
+          <w:szCs w:val="22"/>
+        </w:rPr>
+        <w:t>, “Learning a deep convolutional network for light-field image super-resolution,” in Proceedings of the IEEE international conference on computer vision workshops, 2015, pp. 24–32.</w:t>
       </w:r>
       <w:r>
         <w:rPr>
@@ -18968,8 +19972,39 @@
           <w:rFonts w:ascii="Times New Roman" w:hAnsi="Times New Roman" w:cs="Times New Roman"/>
           <w:szCs w:val="22"/>
         </w:rPr>
-        <w:lastRenderedPageBreak/>
-        <w:t>N. Dalal and B. Triggs, “Histograms of oriented gradients for human detection,” in 2005 IEEE Computer Society Conference on Computer Vision and Pattern Recognition (CVPR’05), vol. 1, 2005, pp. 886–893 vol. 1.</w:t>
+        <w:t xml:space="preserve">N. </w:t>
+      </w:r>
+      <w:proofErr w:type="spellStart"/>
+      <w:r>
+        <w:rPr>
+          <w:rFonts w:ascii="Times New Roman" w:hAnsi="Times New Roman" w:cs="Times New Roman"/>
+          <w:szCs w:val="22"/>
+        </w:rPr>
+        <w:t>Dalal</w:t>
+      </w:r>
+      <w:proofErr w:type="spellEnd"/>
+      <w:r>
+        <w:rPr>
+          <w:rFonts w:ascii="Times New Roman" w:hAnsi="Times New Roman" w:cs="Times New Roman"/>
+          <w:szCs w:val="22"/>
+        </w:rPr>
+        <w:t xml:space="preserve"> and B. </w:t>
+      </w:r>
+      <w:proofErr w:type="spellStart"/>
+      <w:r>
+        <w:rPr>
+          <w:rFonts w:ascii="Times New Roman" w:hAnsi="Times New Roman" w:cs="Times New Roman"/>
+          <w:szCs w:val="22"/>
+        </w:rPr>
+        <w:t>Triggs</w:t>
+      </w:r>
+      <w:proofErr w:type="spellEnd"/>
+      <w:r>
+        <w:rPr>
+          <w:rFonts w:ascii="Times New Roman" w:hAnsi="Times New Roman" w:cs="Times New Roman"/>
+          <w:szCs w:val="22"/>
+        </w:rPr>
+        <w:t>, “Histograms of oriented gradients for human detection,” in 2005 IEEE Computer Society Conference on Computer Vision and Pattern Recognition (CVPR’05), vol. 1, 2005, pp. 886–893 vol. 1.</w:t>
       </w:r>
     </w:p>
     <w:p>
@@ -19013,7 +20048,23 @@
           <w:rFonts w:ascii="Times New Roman" w:hAnsi="Times New Roman" w:cs="Times New Roman"/>
           <w:szCs w:val="22"/>
         </w:rPr>
-        <w:t xml:space="preserve">S. Gupta, P. Arbelaez, and J. Malik, “Perceptual organization and recognition ´ of indoor scenes from </w:t>
+        <w:t xml:space="preserve">S. Gupta, P. </w:t>
+      </w:r>
+      <w:proofErr w:type="spellStart"/>
+      <w:r>
+        <w:rPr>
+          <w:rFonts w:ascii="Times New Roman" w:hAnsi="Times New Roman" w:cs="Times New Roman"/>
+          <w:szCs w:val="22"/>
+        </w:rPr>
+        <w:t>Arbelaez</w:t>
+      </w:r>
+      <w:proofErr w:type="spellEnd"/>
+      <w:r>
+        <w:rPr>
+          <w:rFonts w:ascii="Times New Roman" w:hAnsi="Times New Roman" w:cs="Times New Roman"/>
+          <w:szCs w:val="22"/>
+        </w:rPr>
+        <w:t xml:space="preserve">, and J. Malik, “Perceptual organization and recognition ´ of indoor scenes from </w:t>
       </w:r>
       <w:proofErr w:type="spellStart"/>
       <w:r>
@@ -19137,7 +20188,23 @@
           <w:rFonts w:ascii="Times New Roman" w:hAnsi="Times New Roman" w:cs="Times New Roman"/>
           <w:szCs w:val="22"/>
         </w:rPr>
-        <w:t xml:space="preserve">K. Simonyan and A. Zisserman, “Very deep convolutional networks for large-scale image recognition,” 2015. </w:t>
+        <w:t xml:space="preserve">K. </w:t>
+      </w:r>
+      <w:proofErr w:type="spellStart"/>
+      <w:r>
+        <w:rPr>
+          <w:rFonts w:ascii="Times New Roman" w:hAnsi="Times New Roman" w:cs="Times New Roman"/>
+          <w:szCs w:val="22"/>
+        </w:rPr>
+        <w:t>Simonyan</w:t>
+      </w:r>
+      <w:proofErr w:type="spellEnd"/>
+      <w:r>
+        <w:rPr>
+          <w:rFonts w:ascii="Times New Roman" w:hAnsi="Times New Roman" w:cs="Times New Roman"/>
+          <w:szCs w:val="22"/>
+        </w:rPr>
+        <w:t xml:space="preserve"> and A. Zisserman, “Very deep convolutional networks for large-scale image recognition,” 2015. </w:t>
       </w:r>
     </w:p>
     <w:p>
@@ -19338,7 +20405,23 @@
           <w:rFonts w:ascii="Times New Roman" w:hAnsi="Times New Roman" w:cs="Times New Roman"/>
           <w:szCs w:val="22"/>
         </w:rPr>
-        <w:t xml:space="preserve">, L. Najman, and Y. </w:t>
+        <w:t xml:space="preserve">, L. </w:t>
+      </w:r>
+      <w:proofErr w:type="spellStart"/>
+      <w:r>
+        <w:rPr>
+          <w:rFonts w:ascii="Times New Roman" w:hAnsi="Times New Roman" w:cs="Times New Roman"/>
+          <w:szCs w:val="22"/>
+        </w:rPr>
+        <w:t>Najman</w:t>
+      </w:r>
+      <w:proofErr w:type="spellEnd"/>
+      <w:r>
+        <w:rPr>
+          <w:rFonts w:ascii="Times New Roman" w:hAnsi="Times New Roman" w:cs="Times New Roman"/>
+          <w:szCs w:val="22"/>
+        </w:rPr>
+        <w:t xml:space="preserve">, and Y. </w:t>
       </w:r>
       <w:proofErr w:type="spellStart"/>
       <w:r>
@@ -19376,7 +20459,23 @@
           <w:rFonts w:ascii="Times New Roman" w:hAnsi="Times New Roman" w:cs="Times New Roman"/>
           <w:szCs w:val="22"/>
         </w:rPr>
-        <w:t>L.-C. Chen, G. Papandreou, I. Kokkinos, K. Murphy, and A. L. Yuille, “Semantic image segmentation with deep convolutional nets a</w:t>
+        <w:t xml:space="preserve">L.-C. Chen, G. Papandreou, I. Kokkinos, K. Murphy, and A. L. </w:t>
+      </w:r>
+      <w:proofErr w:type="spellStart"/>
+      <w:r>
+        <w:rPr>
+          <w:rFonts w:ascii="Times New Roman" w:hAnsi="Times New Roman" w:cs="Times New Roman"/>
+          <w:szCs w:val="22"/>
+        </w:rPr>
+        <w:t>Yuille</w:t>
+      </w:r>
+      <w:proofErr w:type="spellEnd"/>
+      <w:r>
+        <w:rPr>
+          <w:rFonts w:ascii="Times New Roman" w:hAnsi="Times New Roman" w:cs="Times New Roman"/>
+          <w:szCs w:val="22"/>
+        </w:rPr>
+        <w:t>, “Semantic image segmentation with deep convolutional nets a</w:t>
       </w:r>
       <w:r>
         <w:rPr>
@@ -19545,7 +20644,23 @@
           <w:rFonts w:ascii="Times New Roman" w:hAnsi="Times New Roman" w:cs="Times New Roman"/>
           <w:szCs w:val="22"/>
         </w:rPr>
-        <w:t>, and P. Haffner, “Gradient-based learning applied to document recognition,” Proceedings of the IEEE, vol. 86, no. 11, pp. 2278– 2324, 1998.</w:t>
+        <w:t xml:space="preserve">, and P. </w:t>
+      </w:r>
+      <w:proofErr w:type="spellStart"/>
+      <w:r>
+        <w:rPr>
+          <w:rFonts w:ascii="Times New Roman" w:hAnsi="Times New Roman" w:cs="Times New Roman"/>
+          <w:szCs w:val="22"/>
+        </w:rPr>
+        <w:t>Haffner</w:t>
+      </w:r>
+      <w:proofErr w:type="spellEnd"/>
+      <w:r>
+        <w:rPr>
+          <w:rFonts w:ascii="Times New Roman" w:hAnsi="Times New Roman" w:cs="Times New Roman"/>
+          <w:szCs w:val="22"/>
+        </w:rPr>
+        <w:t>, “Gradient-based learning applied to document recognition,” Proceedings of the IEEE, vol. 86, no. 11, pp. 2278– 2324, 1998.</w:t>
       </w:r>
     </w:p>
     <w:p>
@@ -19567,7 +20682,39 @@
           <w:rFonts w:ascii="Times New Roman" w:hAnsi="Times New Roman" w:cs="Times New Roman"/>
           <w:szCs w:val="22"/>
         </w:rPr>
-        <w:t xml:space="preserve">J. Shotton, J. Winn, C. Rother, and A. </w:t>
+        <w:t xml:space="preserve">J. </w:t>
+      </w:r>
+      <w:proofErr w:type="spellStart"/>
+      <w:r>
+        <w:rPr>
+          <w:rFonts w:ascii="Times New Roman" w:hAnsi="Times New Roman" w:cs="Times New Roman"/>
+          <w:szCs w:val="22"/>
+        </w:rPr>
+        <w:t>Shotton</w:t>
+      </w:r>
+      <w:proofErr w:type="spellEnd"/>
+      <w:r>
+        <w:rPr>
+          <w:rFonts w:ascii="Times New Roman" w:hAnsi="Times New Roman" w:cs="Times New Roman"/>
+          <w:szCs w:val="22"/>
+        </w:rPr>
+        <w:t xml:space="preserve">, J. Winn, C. </w:t>
+      </w:r>
+      <w:proofErr w:type="spellStart"/>
+      <w:r>
+        <w:rPr>
+          <w:rFonts w:ascii="Times New Roman" w:hAnsi="Times New Roman" w:cs="Times New Roman"/>
+          <w:szCs w:val="22"/>
+        </w:rPr>
+        <w:t>Rother</w:t>
+      </w:r>
+      <w:proofErr w:type="spellEnd"/>
+      <w:r>
+        <w:rPr>
+          <w:rFonts w:ascii="Times New Roman" w:hAnsi="Times New Roman" w:cs="Times New Roman"/>
+          <w:szCs w:val="22"/>
+        </w:rPr>
+        <w:t xml:space="preserve">, and A. </w:t>
       </w:r>
       <w:proofErr w:type="spellStart"/>
       <w:r>
@@ -19621,7 +20768,23 @@
           <w:rFonts w:ascii="Times New Roman" w:hAnsi="Times New Roman" w:cs="Times New Roman"/>
           <w:szCs w:val="22"/>
         </w:rPr>
-        <w:t xml:space="preserve">P. Kohli, L. </w:t>
+        <w:t xml:space="preserve">P. </w:t>
+      </w:r>
+      <w:proofErr w:type="spellStart"/>
+      <w:r>
+        <w:rPr>
+          <w:rFonts w:ascii="Times New Roman" w:hAnsi="Times New Roman" w:cs="Times New Roman"/>
+          <w:szCs w:val="22"/>
+        </w:rPr>
+        <w:t>Kohli</w:t>
+      </w:r>
+      <w:proofErr w:type="spellEnd"/>
+      <w:r>
+        <w:rPr>
+          <w:rFonts w:ascii="Times New Roman" w:hAnsi="Times New Roman" w:cs="Times New Roman"/>
+          <w:szCs w:val="22"/>
+        </w:rPr>
+        <w:t xml:space="preserve">, L. </w:t>
       </w:r>
       <w:proofErr w:type="spellStart"/>
       <w:r>
@@ -19637,7 +20800,23 @@
           <w:rFonts w:ascii="Times New Roman" w:hAnsi="Times New Roman" w:cs="Times New Roman"/>
           <w:szCs w:val="22"/>
         </w:rPr>
-        <w:t xml:space="preserve">, and P. Torr, “Robust higher order potentials for enforcing ´ label consistency,” International Journal of Computer Vision, vol. 82, pp. 302– 324, 05 2009. </w:t>
+        <w:t xml:space="preserve">, and P. </w:t>
+      </w:r>
+      <w:proofErr w:type="spellStart"/>
+      <w:r>
+        <w:rPr>
+          <w:rFonts w:ascii="Times New Roman" w:hAnsi="Times New Roman" w:cs="Times New Roman"/>
+          <w:szCs w:val="22"/>
+        </w:rPr>
+        <w:t>Torr</w:t>
+      </w:r>
+      <w:proofErr w:type="spellEnd"/>
+      <w:r>
+        <w:rPr>
+          <w:rFonts w:ascii="Times New Roman" w:hAnsi="Times New Roman" w:cs="Times New Roman"/>
+          <w:szCs w:val="22"/>
+        </w:rPr>
+        <w:t xml:space="preserve">, “Robust higher order potentials for enforcing ´ label consistency,” International Journal of Computer Vision, vol. 82, pp. 302– 324, 05 2009. </w:t>
       </w:r>
     </w:p>
     <w:p>
@@ -19675,7 +20854,23 @@
           <w:rFonts w:ascii="Times New Roman" w:hAnsi="Times New Roman" w:cs="Times New Roman"/>
           <w:szCs w:val="22"/>
         </w:rPr>
-        <w:t xml:space="preserve">, C. Russell, P. Kohli, and P. </w:t>
+        <w:t xml:space="preserve">, C. Russell, P. </w:t>
+      </w:r>
+      <w:proofErr w:type="spellStart"/>
+      <w:r>
+        <w:rPr>
+          <w:rFonts w:ascii="Times New Roman" w:hAnsi="Times New Roman" w:cs="Times New Roman"/>
+          <w:szCs w:val="22"/>
+        </w:rPr>
+        <w:t>Kohli</w:t>
+      </w:r>
+      <w:proofErr w:type="spellEnd"/>
+      <w:r>
+        <w:rPr>
+          <w:rFonts w:ascii="Times New Roman" w:hAnsi="Times New Roman" w:cs="Times New Roman"/>
+          <w:szCs w:val="22"/>
+        </w:rPr>
+        <w:t xml:space="preserve">, and P. </w:t>
       </w:r>
       <w:proofErr w:type="spellStart"/>
       <w:r>
@@ -19729,7 +20924,39 @@
           <w:rFonts w:ascii="Times New Roman" w:hAnsi="Times New Roman" w:cs="Times New Roman"/>
           <w:szCs w:val="22"/>
         </w:rPr>
-        <w:t xml:space="preserve">J. Verbeek and B. Triggs, “Region classification with </w:t>
+        <w:t xml:space="preserve">J. </w:t>
+      </w:r>
+      <w:proofErr w:type="spellStart"/>
+      <w:r>
+        <w:rPr>
+          <w:rFonts w:ascii="Times New Roman" w:hAnsi="Times New Roman" w:cs="Times New Roman"/>
+          <w:szCs w:val="22"/>
+        </w:rPr>
+        <w:t>Verbeek</w:t>
+      </w:r>
+      <w:proofErr w:type="spellEnd"/>
+      <w:r>
+        <w:rPr>
+          <w:rFonts w:ascii="Times New Roman" w:hAnsi="Times New Roman" w:cs="Times New Roman"/>
+          <w:szCs w:val="22"/>
+        </w:rPr>
+        <w:t xml:space="preserve"> and B. </w:t>
+      </w:r>
+      <w:proofErr w:type="spellStart"/>
+      <w:r>
+        <w:rPr>
+          <w:rFonts w:ascii="Times New Roman" w:hAnsi="Times New Roman" w:cs="Times New Roman"/>
+          <w:szCs w:val="22"/>
+        </w:rPr>
+        <w:t>Triggs</w:t>
+      </w:r>
+      <w:proofErr w:type="spellEnd"/>
+      <w:r>
+        <w:rPr>
+          <w:rFonts w:ascii="Times New Roman" w:hAnsi="Times New Roman" w:cs="Times New Roman"/>
+          <w:szCs w:val="22"/>
+        </w:rPr>
+        <w:t xml:space="preserve">, “Region classification with </w:t>
       </w:r>
       <w:proofErr w:type="spellStart"/>
       <w:r>
@@ -19799,7 +21026,23 @@
           <w:rFonts w:ascii="Times New Roman" w:hAnsi="Times New Roman" w:cs="Times New Roman"/>
           <w:szCs w:val="22"/>
         </w:rPr>
-        <w:t xml:space="preserve">, I. Laptev, and J. Sivic, “Learning and transferring mid-level image representations using convolutional neural networks,” in Proceedings of the IEEE Conference on Computer Vision and Pattern Recognition (CVPR), June 2014. </w:t>
+        <w:t xml:space="preserve">, I. Laptev, and J. </w:t>
+      </w:r>
+      <w:proofErr w:type="spellStart"/>
+      <w:r>
+        <w:rPr>
+          <w:rFonts w:ascii="Times New Roman" w:hAnsi="Times New Roman" w:cs="Times New Roman"/>
+          <w:szCs w:val="22"/>
+        </w:rPr>
+        <w:t>Sivic</w:t>
+      </w:r>
+      <w:proofErr w:type="spellEnd"/>
+      <w:r>
+        <w:rPr>
+          <w:rFonts w:ascii="Times New Roman" w:hAnsi="Times New Roman" w:cs="Times New Roman"/>
+          <w:szCs w:val="22"/>
+        </w:rPr>
+        <w:t xml:space="preserve">, “Learning and transferring mid-level image representations using convolutional neural networks,” in Proceedings of the IEEE Conference on Computer Vision and Pattern Recognition (CVPR), June 2014. </w:t>
       </w:r>
     </w:p>
     <w:p>
@@ -19821,6 +21064,7 @@
           <w:rFonts w:ascii="Times New Roman" w:hAnsi="Times New Roman" w:cs="Times New Roman"/>
           <w:szCs w:val="22"/>
         </w:rPr>
+        <w:lastRenderedPageBreak/>
         <w:t xml:space="preserve">J. </w:t>
       </w:r>
       <w:proofErr w:type="spellStart"/>
@@ -19837,7 +21081,23 @@
           <w:rFonts w:ascii="Times New Roman" w:hAnsi="Times New Roman" w:cs="Times New Roman"/>
           <w:szCs w:val="22"/>
         </w:rPr>
-        <w:t xml:space="preserve">, J. Clune, Y. </w:t>
+        <w:t xml:space="preserve">, J. </w:t>
+      </w:r>
+      <w:proofErr w:type="spellStart"/>
+      <w:r>
+        <w:rPr>
+          <w:rFonts w:ascii="Times New Roman" w:hAnsi="Times New Roman" w:cs="Times New Roman"/>
+          <w:szCs w:val="22"/>
+        </w:rPr>
+        <w:t>Clune</w:t>
+      </w:r>
+      <w:proofErr w:type="spellEnd"/>
+      <w:r>
+        <w:rPr>
+          <w:rFonts w:ascii="Times New Roman" w:hAnsi="Times New Roman" w:cs="Times New Roman"/>
+          <w:szCs w:val="22"/>
+        </w:rPr>
+        <w:t xml:space="preserve">, Y. </w:t>
       </w:r>
       <w:proofErr w:type="spellStart"/>
       <w:r>
@@ -19943,30 +21203,39 @@
           <w:rFonts w:ascii="Times New Roman" w:hAnsi="Times New Roman" w:cs="Times New Roman"/>
           <w:szCs w:val="22"/>
         </w:rPr>
-        <w:t xml:space="preserve">O. </w:t>
-      </w:r>
-      <w:proofErr w:type="spellStart"/>
-      <w:r>
-        <w:rPr>
-          <w:rFonts w:ascii="Times New Roman" w:hAnsi="Times New Roman" w:cs="Times New Roman"/>
-          <w:szCs w:val="22"/>
-        </w:rPr>
-        <w:t>Ronneberger</w:t>
-      </w:r>
-      <w:proofErr w:type="spellEnd"/>
-      <w:r>
-        <w:rPr>
-          <w:rFonts w:ascii="Times New Roman" w:hAnsi="Times New Roman" w:cs="Times New Roman"/>
-          <w:szCs w:val="22"/>
-        </w:rPr>
-        <w:t>, P. Fischer, and T. Brox, “U-net: Convolutional networks for biomed</w:t>
-      </w:r>
-      <w:r>
-        <w:rPr>
-          <w:rFonts w:ascii="Times New Roman" w:hAnsi="Times New Roman" w:cs="Times New Roman"/>
-          <w:szCs w:val="22"/>
-        </w:rPr>
-        <w:t>ical image segmentation,” 2015.</w:t>
+        <w:t xml:space="preserve">A. </w:t>
+      </w:r>
+      <w:proofErr w:type="spellStart"/>
+      <w:r>
+        <w:rPr>
+          <w:rFonts w:ascii="Times New Roman" w:hAnsi="Times New Roman" w:cs="Times New Roman"/>
+          <w:szCs w:val="22"/>
+        </w:rPr>
+        <w:t>Dosovitskiy</w:t>
+      </w:r>
+      <w:proofErr w:type="spellEnd"/>
+      <w:r>
+        <w:rPr>
+          <w:rFonts w:ascii="Times New Roman" w:hAnsi="Times New Roman" w:cs="Times New Roman"/>
+          <w:szCs w:val="22"/>
+        </w:rPr>
+        <w:t xml:space="preserve"> et al., "An Image is Worth 16x16 Words: Transformers for Image Recognition at Scale," in </w:t>
+      </w:r>
+      <w:r>
+        <w:rPr>
+          <w:rFonts w:ascii="Times New Roman" w:hAnsi="Times New Roman" w:cs="Times New Roman"/>
+          <w:i/>
+          <w:iCs/>
+          <w:szCs w:val="22"/>
+        </w:rPr>
+        <w:t>ICLR</w:t>
+      </w:r>
+      <w:r>
+        <w:rPr>
+          <w:rFonts w:ascii="Times New Roman" w:hAnsi="Times New Roman" w:cs="Times New Roman"/>
+          <w:szCs w:val="22"/>
+        </w:rPr>
+        <w:t>, 2021.</w:t>
       </w:r>
     </w:p>
     <w:p>
@@ -19988,30 +21257,99 @@
           <w:rFonts w:ascii="Times New Roman" w:hAnsi="Times New Roman" w:cs="Times New Roman"/>
           <w:szCs w:val="22"/>
         </w:rPr>
-        <w:t xml:space="preserve">J. Huang, G. Liu, and B. Wang, “Semantic Segmentation under a Complex Background for Machine Vision Detection Based on Modified </w:t>
-      </w:r>
-      <w:proofErr w:type="spellStart"/>
-      <w:r>
-        <w:rPr>
-          <w:rFonts w:ascii="Times New Roman" w:hAnsi="Times New Roman" w:cs="Times New Roman"/>
-          <w:szCs w:val="22"/>
-        </w:rPr>
-        <w:t>UPerNet</w:t>
-      </w:r>
-      <w:proofErr w:type="spellEnd"/>
-      <w:r>
-        <w:rPr>
-          <w:rFonts w:ascii="Times New Roman" w:hAnsi="Times New Roman" w:cs="Times New Roman"/>
-          <w:szCs w:val="22"/>
-        </w:rPr>
-        <w:t xml:space="preserve"> with Component Analysis Modules,” Mathematical Problems in Engineering, vol. </w:t>
-      </w:r>
-      <w:r>
-        <w:rPr>
-          <w:rFonts w:ascii="Times New Roman" w:hAnsi="Times New Roman" w:cs="Times New Roman"/>
-          <w:szCs w:val="22"/>
-        </w:rPr>
-        <w:t>2020, pp. 1–13, September 2020.</w:t>
+        <w:t xml:space="preserve">M. Ali, M. </w:t>
+      </w:r>
+      <w:proofErr w:type="spellStart"/>
+      <w:r>
+        <w:rPr>
+          <w:rFonts w:ascii="Times New Roman" w:hAnsi="Times New Roman" w:cs="Times New Roman"/>
+          <w:szCs w:val="22"/>
+        </w:rPr>
+        <w:t>Javaid</w:t>
+      </w:r>
+      <w:proofErr w:type="spellEnd"/>
+      <w:r>
+        <w:rPr>
+          <w:rFonts w:ascii="Times New Roman" w:hAnsi="Times New Roman" w:cs="Times New Roman"/>
+          <w:szCs w:val="22"/>
+        </w:rPr>
+        <w:t xml:space="preserve">, M. Noman, M. </w:t>
+      </w:r>
+      <w:proofErr w:type="spellStart"/>
+      <w:r>
+        <w:rPr>
+          <w:rFonts w:ascii="Times New Roman" w:hAnsi="Times New Roman" w:cs="Times New Roman"/>
+          <w:szCs w:val="22"/>
+        </w:rPr>
+        <w:t>Fiaz</w:t>
+      </w:r>
+      <w:proofErr w:type="spellEnd"/>
+      <w:r>
+        <w:rPr>
+          <w:rFonts w:ascii="Times New Roman" w:hAnsi="Times New Roman" w:cs="Times New Roman"/>
+          <w:szCs w:val="22"/>
+        </w:rPr>
+        <w:t xml:space="preserve">, and S. Khan, </w:t>
+      </w:r>
+      <w:r>
+        <w:rPr>
+          <w:rFonts w:ascii="Times New Roman" w:hAnsi="Times New Roman" w:cs="Times New Roman"/>
+          <w:iCs/>
+          <w:szCs w:val="22"/>
+        </w:rPr>
+        <w:t>“</w:t>
+      </w:r>
+      <w:proofErr w:type="spellStart"/>
+      <w:r>
+        <w:rPr>
+          <w:rFonts w:ascii="Times New Roman" w:hAnsi="Times New Roman" w:cs="Times New Roman"/>
+          <w:iCs/>
+          <w:szCs w:val="22"/>
+        </w:rPr>
+        <w:t>FANet</w:t>
+      </w:r>
+      <w:proofErr w:type="spellEnd"/>
+      <w:r>
+        <w:rPr>
+          <w:rFonts w:ascii="Times New Roman" w:hAnsi="Times New Roman" w:cs="Times New Roman"/>
+          <w:iCs/>
+          <w:szCs w:val="22"/>
+        </w:rPr>
+        <w:t>: Feature Amplification Network for Semantic Segmentation in Cluttered Backgrounds,”</w:t>
+      </w:r>
+      <w:r>
+        <w:rPr>
+          <w:rFonts w:ascii="Times New Roman" w:hAnsi="Times New Roman" w:cs="Times New Roman"/>
+          <w:szCs w:val="22"/>
+        </w:rPr>
+        <w:t xml:space="preserve"> </w:t>
+      </w:r>
+      <w:proofErr w:type="spellStart"/>
+      <w:r>
+        <w:rPr>
+          <w:rFonts w:ascii="Times New Roman" w:hAnsi="Times New Roman" w:cs="Times New Roman"/>
+          <w:b/>
+          <w:bCs/>
+          <w:szCs w:val="22"/>
+        </w:rPr>
+        <w:t>arXiv</w:t>
+      </w:r>
+      <w:proofErr w:type="spellEnd"/>
+      <w:r>
+        <w:rPr>
+          <w:rFonts w:ascii="Times New Roman" w:hAnsi="Times New Roman" w:cs="Times New Roman"/>
+          <w:b/>
+          <w:bCs/>
+          <w:szCs w:val="22"/>
+        </w:rPr>
+        <w:t xml:space="preserve"> preprint</w:t>
+      </w:r>
+      <w:r>
+        <w:rPr>
+          <w:rFonts w:ascii="Times New Roman" w:hAnsi="Times New Roman" w:cs="Times New Roman"/>
+          <w:szCs w:val="22"/>
+        </w:rPr>
+        <w:t>, Jul. 2024.</w:t>
       </w:r>
     </w:p>
     <w:p>
@@ -20033,7 +21371,6 @@
           <w:rFonts w:ascii="Times New Roman" w:hAnsi="Times New Roman" w:cs="Times New Roman"/>
           <w:szCs w:val="22"/>
         </w:rPr>
-        <w:lastRenderedPageBreak/>
         <w:t>K. He, X. Zhang, S. Ren, and J. Sun, “Deep residual learning for image recognition,” in 2016 IEEE Conference on Computer Vision and Pattern Recognition (CVPR), 2016, pp. 770–778.</w:t>
       </w:r>
     </w:p>
@@ -20056,7 +21393,39 @@
           <w:rFonts w:ascii="Times New Roman" w:hAnsi="Times New Roman" w:cs="Times New Roman"/>
           <w:szCs w:val="22"/>
         </w:rPr>
-        <w:t xml:space="preserve">J. Pont-Tuset, P. Arbelaez, J. </w:t>
+        <w:t>J. Pont-</w:t>
+      </w:r>
+      <w:proofErr w:type="spellStart"/>
+      <w:r>
+        <w:rPr>
+          <w:rFonts w:ascii="Times New Roman" w:hAnsi="Times New Roman" w:cs="Times New Roman"/>
+          <w:szCs w:val="22"/>
+        </w:rPr>
+        <w:t>Tuset</w:t>
+      </w:r>
+      <w:proofErr w:type="spellEnd"/>
+      <w:r>
+        <w:rPr>
+          <w:rFonts w:ascii="Times New Roman" w:hAnsi="Times New Roman" w:cs="Times New Roman"/>
+          <w:szCs w:val="22"/>
+        </w:rPr>
+        <w:t xml:space="preserve">, P. </w:t>
+      </w:r>
+      <w:proofErr w:type="spellStart"/>
+      <w:r>
+        <w:rPr>
+          <w:rFonts w:ascii="Times New Roman" w:hAnsi="Times New Roman" w:cs="Times New Roman"/>
+          <w:szCs w:val="22"/>
+        </w:rPr>
+        <w:t>Arbelaez</w:t>
+      </w:r>
+      <w:proofErr w:type="spellEnd"/>
+      <w:r>
+        <w:rPr>
+          <w:rFonts w:ascii="Times New Roman" w:hAnsi="Times New Roman" w:cs="Times New Roman"/>
+          <w:szCs w:val="22"/>
+        </w:rPr>
+        <w:t xml:space="preserve">, J. </w:t>
       </w:r>
       <w:proofErr w:type="spellStart"/>
       <w:proofErr w:type="gramStart"/>
@@ -20103,14 +21472,87 @@
           <w:rFonts w:ascii="Times New Roman" w:hAnsi="Times New Roman" w:cs="Times New Roman"/>
           <w:szCs w:val="22"/>
         </w:rPr>
-        <w:t>K. Simonyan and A. Zisserman, “Very deep convolutional networks for large-</w:t>
-      </w:r>
-      <w:r>
-        <w:rPr>
-          <w:rFonts w:ascii="Times New Roman" w:hAnsi="Times New Roman" w:cs="Times New Roman"/>
-          <w:szCs w:val="22"/>
-        </w:rPr>
-        <w:t>scale image recognition,” 2015.</w:t>
+        <w:t xml:space="preserve">Z. Liu, H. Mao, C. Wu, C. </w:t>
+      </w:r>
+      <w:proofErr w:type="spellStart"/>
+      <w:r>
+        <w:rPr>
+          <w:rFonts w:ascii="Times New Roman" w:hAnsi="Times New Roman" w:cs="Times New Roman"/>
+          <w:szCs w:val="22"/>
+        </w:rPr>
+        <w:t>Feichtenhofer</w:t>
+      </w:r>
+      <w:proofErr w:type="spellEnd"/>
+      <w:r>
+        <w:rPr>
+          <w:rFonts w:ascii="Times New Roman" w:hAnsi="Times New Roman" w:cs="Times New Roman"/>
+          <w:szCs w:val="22"/>
+        </w:rPr>
+        <w:t xml:space="preserve">, T. Darrell, and S. </w:t>
+      </w:r>
+      <w:proofErr w:type="spellStart"/>
+      <w:r>
+        <w:rPr>
+          <w:rFonts w:ascii="Times New Roman" w:hAnsi="Times New Roman" w:cs="Times New Roman"/>
+          <w:szCs w:val="22"/>
+        </w:rPr>
+        <w:t>Xie</w:t>
+      </w:r>
+      <w:proofErr w:type="spellEnd"/>
+      <w:r>
+        <w:rPr>
+          <w:rFonts w:ascii="Times New Roman" w:hAnsi="Times New Roman" w:cs="Times New Roman"/>
+          <w:szCs w:val="22"/>
+        </w:rPr>
+        <w:t xml:space="preserve">, </w:t>
+      </w:r>
+      <w:r>
+        <w:rPr>
+          <w:rFonts w:ascii="Times New Roman" w:hAnsi="Times New Roman" w:cs="Times New Roman"/>
+          <w:iCs/>
+          <w:szCs w:val="22"/>
+        </w:rPr>
+        <w:t xml:space="preserve">“A </w:t>
+      </w:r>
+      <w:proofErr w:type="spellStart"/>
+      <w:r>
+        <w:rPr>
+          <w:rFonts w:ascii="Times New Roman" w:hAnsi="Times New Roman" w:cs="Times New Roman"/>
+          <w:iCs/>
+          <w:szCs w:val="22"/>
+        </w:rPr>
+        <w:t>ConvNet</w:t>
+      </w:r>
+      <w:proofErr w:type="spellEnd"/>
+      <w:r>
+        <w:rPr>
+          <w:rFonts w:ascii="Times New Roman" w:hAnsi="Times New Roman" w:cs="Times New Roman"/>
+          <w:iCs/>
+          <w:szCs w:val="22"/>
+        </w:rPr>
+        <w:t xml:space="preserve"> for the 2020s,”</w:t>
+      </w:r>
+      <w:r>
+        <w:rPr>
+          <w:rFonts w:ascii="Times New Roman" w:hAnsi="Times New Roman" w:cs="Times New Roman"/>
+          <w:szCs w:val="22"/>
+        </w:rPr>
+        <w:t xml:space="preserve"> </w:t>
+      </w:r>
+      <w:r>
+        <w:rPr>
+          <w:rFonts w:ascii="Times New Roman" w:hAnsi="Times New Roman" w:cs="Times New Roman"/>
+          <w:bCs/>
+          <w:szCs w:val="22"/>
+        </w:rPr>
+        <w:t>in Proc. IEEE/CVF Conference on Computer Vision and Pattern Recognition (CVPR)</w:t>
+      </w:r>
+      <w:r>
+        <w:rPr>
+          <w:rFonts w:ascii="Times New Roman" w:hAnsi="Times New Roman" w:cs="Times New Roman"/>
+          <w:szCs w:val="22"/>
+        </w:rPr>
+        <w:t>, 2022, pp. 11976–11986.</w:t>
       </w:r>
     </w:p>
     <w:p>
@@ -20132,7 +21574,39 @@
           <w:rFonts w:ascii="Times New Roman" w:hAnsi="Times New Roman" w:cs="Times New Roman"/>
           <w:szCs w:val="22"/>
         </w:rPr>
-        <w:t xml:space="preserve">C. Szegedy, W. Liu, Y. Jia, P. </w:t>
+        <w:t xml:space="preserve">C. </w:t>
+      </w:r>
+      <w:proofErr w:type="spellStart"/>
+      <w:r>
+        <w:rPr>
+          <w:rFonts w:ascii="Times New Roman" w:hAnsi="Times New Roman" w:cs="Times New Roman"/>
+          <w:szCs w:val="22"/>
+        </w:rPr>
+        <w:t>Szegedy</w:t>
+      </w:r>
+      <w:proofErr w:type="spellEnd"/>
+      <w:r>
+        <w:rPr>
+          <w:rFonts w:ascii="Times New Roman" w:hAnsi="Times New Roman" w:cs="Times New Roman"/>
+          <w:szCs w:val="22"/>
+        </w:rPr>
+        <w:t xml:space="preserve">, W. Liu, Y. </w:t>
+      </w:r>
+      <w:proofErr w:type="spellStart"/>
+      <w:r>
+        <w:rPr>
+          <w:rFonts w:ascii="Times New Roman" w:hAnsi="Times New Roman" w:cs="Times New Roman"/>
+          <w:szCs w:val="22"/>
+        </w:rPr>
+        <w:t>Jia</w:t>
+      </w:r>
+      <w:proofErr w:type="spellEnd"/>
+      <w:r>
+        <w:rPr>
+          <w:rFonts w:ascii="Times New Roman" w:hAnsi="Times New Roman" w:cs="Times New Roman"/>
+          <w:szCs w:val="22"/>
+        </w:rPr>
+        <w:t xml:space="preserve">, P. </w:t>
       </w:r>
       <w:proofErr w:type="spellStart"/>
       <w:r>
@@ -20148,7 +21622,39 @@
           <w:rFonts w:ascii="Times New Roman" w:hAnsi="Times New Roman" w:cs="Times New Roman"/>
           <w:szCs w:val="22"/>
         </w:rPr>
-        <w:t xml:space="preserve">, S. Reed, D. Anguelov, D. Erhan, V. </w:t>
+        <w:t xml:space="preserve">, S. Reed, D. </w:t>
+      </w:r>
+      <w:proofErr w:type="spellStart"/>
+      <w:r>
+        <w:rPr>
+          <w:rFonts w:ascii="Times New Roman" w:hAnsi="Times New Roman" w:cs="Times New Roman"/>
+          <w:szCs w:val="22"/>
+        </w:rPr>
+        <w:t>Anguelov</w:t>
+      </w:r>
+      <w:proofErr w:type="spellEnd"/>
+      <w:r>
+        <w:rPr>
+          <w:rFonts w:ascii="Times New Roman" w:hAnsi="Times New Roman" w:cs="Times New Roman"/>
+          <w:szCs w:val="22"/>
+        </w:rPr>
+        <w:t xml:space="preserve">, D. </w:t>
+      </w:r>
+      <w:proofErr w:type="spellStart"/>
+      <w:r>
+        <w:rPr>
+          <w:rFonts w:ascii="Times New Roman" w:hAnsi="Times New Roman" w:cs="Times New Roman"/>
+          <w:szCs w:val="22"/>
+        </w:rPr>
+        <w:t>Erhan</w:t>
+      </w:r>
+      <w:proofErr w:type="spellEnd"/>
+      <w:r>
+        <w:rPr>
+          <w:rFonts w:ascii="Times New Roman" w:hAnsi="Times New Roman" w:cs="Times New Roman"/>
+          <w:szCs w:val="22"/>
+        </w:rPr>
+        <w:t xml:space="preserve">, V. </w:t>
       </w:r>
       <w:proofErr w:type="spellStart"/>
       <w:r>
@@ -20164,7 +21670,23 @@
           <w:rFonts w:ascii="Times New Roman" w:hAnsi="Times New Roman" w:cs="Times New Roman"/>
           <w:szCs w:val="22"/>
         </w:rPr>
-        <w:t>, and A. Rabinovich, “Going deeper with convolutions,” 2014.</w:t>
+        <w:t xml:space="preserve">, and A. </w:t>
+      </w:r>
+      <w:proofErr w:type="spellStart"/>
+      <w:r>
+        <w:rPr>
+          <w:rFonts w:ascii="Times New Roman" w:hAnsi="Times New Roman" w:cs="Times New Roman"/>
+          <w:szCs w:val="22"/>
+        </w:rPr>
+        <w:t>Rabinovich</w:t>
+      </w:r>
+      <w:proofErr w:type="spellEnd"/>
+      <w:r>
+        <w:rPr>
+          <w:rFonts w:ascii="Times New Roman" w:hAnsi="Times New Roman" w:cs="Times New Roman"/>
+          <w:szCs w:val="22"/>
+        </w:rPr>
+        <w:t>, “Going deeper with convolutions,” 2014.</w:t>
       </w:r>
       <w:r>
         <w:rPr>
@@ -20193,7 +21715,39 @@
           <w:rFonts w:ascii="Times New Roman" w:hAnsi="Times New Roman" w:cs="Times New Roman"/>
           <w:szCs w:val="22"/>
         </w:rPr>
-        <w:t xml:space="preserve">B. Zhou, H. Zhao, X. Puig, S. Fidler, A. </w:t>
+        <w:t xml:space="preserve">B. Zhou, H. Zhao, X. </w:t>
+      </w:r>
+      <w:proofErr w:type="spellStart"/>
+      <w:r>
+        <w:rPr>
+          <w:rFonts w:ascii="Times New Roman" w:hAnsi="Times New Roman" w:cs="Times New Roman"/>
+          <w:szCs w:val="22"/>
+        </w:rPr>
+        <w:t>Puig</w:t>
+      </w:r>
+      <w:proofErr w:type="spellEnd"/>
+      <w:r>
+        <w:rPr>
+          <w:rFonts w:ascii="Times New Roman" w:hAnsi="Times New Roman" w:cs="Times New Roman"/>
+          <w:szCs w:val="22"/>
+        </w:rPr>
+        <w:t xml:space="preserve">, S. </w:t>
+      </w:r>
+      <w:proofErr w:type="spellStart"/>
+      <w:r>
+        <w:rPr>
+          <w:rFonts w:ascii="Times New Roman" w:hAnsi="Times New Roman" w:cs="Times New Roman"/>
+          <w:szCs w:val="22"/>
+        </w:rPr>
+        <w:t>Fidler</w:t>
+      </w:r>
+      <w:proofErr w:type="spellEnd"/>
+      <w:r>
+        <w:rPr>
+          <w:rFonts w:ascii="Times New Roman" w:hAnsi="Times New Roman" w:cs="Times New Roman"/>
+          <w:szCs w:val="22"/>
+        </w:rPr>
+        <w:t xml:space="preserve">, A. </w:t>
       </w:r>
       <w:proofErr w:type="spellStart"/>
       <w:r>
@@ -20209,7 +21763,23 @@
           <w:rFonts w:ascii="Times New Roman" w:hAnsi="Times New Roman" w:cs="Times New Roman"/>
           <w:szCs w:val="22"/>
         </w:rPr>
-        <w:t>, and A. Torralba, “Scene parsing through ade20k dataset,” in Proceedings of the IEEE Conference on Computer Vision and Pattern Recognition (CVPR), July 2017.</w:t>
+        <w:t xml:space="preserve">, and A. </w:t>
+      </w:r>
+      <w:proofErr w:type="spellStart"/>
+      <w:r>
+        <w:rPr>
+          <w:rFonts w:ascii="Times New Roman" w:hAnsi="Times New Roman" w:cs="Times New Roman"/>
+          <w:szCs w:val="22"/>
+        </w:rPr>
+        <w:t>Torralba</w:t>
+      </w:r>
+      <w:proofErr w:type="spellEnd"/>
+      <w:r>
+        <w:rPr>
+          <w:rFonts w:ascii="Times New Roman" w:hAnsi="Times New Roman" w:cs="Times New Roman"/>
+          <w:szCs w:val="22"/>
+        </w:rPr>
+        <w:t>, “Scene parsing through ade20k dataset,” in Proceedings of the IEEE Conference on Computer Vision and Pattern Recognition (CVPR), July 2017.</w:t>
       </w:r>
     </w:p>
     <w:p>
@@ -20269,7 +21839,71 @@
           <w:rFonts w:ascii="Times New Roman" w:hAnsi="Times New Roman" w:cs="Times New Roman"/>
           <w:szCs w:val="22"/>
         </w:rPr>
-        <w:t>M. Everingham, S. A. Eslami, L. Van Gool, C. K. Williams, J. Winn, and A. Zisserman, “The pascal visual object classes challenge: A retrospective,” International journal of computer vision, vol. 111, pp. 98–136, 2015.</w:t>
+        <w:t xml:space="preserve">M. </w:t>
+      </w:r>
+      <w:proofErr w:type="spellStart"/>
+      <w:r>
+        <w:rPr>
+          <w:rFonts w:ascii="Times New Roman" w:hAnsi="Times New Roman" w:cs="Times New Roman"/>
+          <w:szCs w:val="22"/>
+        </w:rPr>
+        <w:t>Everingham</w:t>
+      </w:r>
+      <w:proofErr w:type="spellEnd"/>
+      <w:r>
+        <w:rPr>
+          <w:rFonts w:ascii="Times New Roman" w:hAnsi="Times New Roman" w:cs="Times New Roman"/>
+          <w:szCs w:val="22"/>
+        </w:rPr>
+        <w:t xml:space="preserve">, S. A. </w:t>
+      </w:r>
+      <w:proofErr w:type="spellStart"/>
+      <w:r>
+        <w:rPr>
+          <w:rFonts w:ascii="Times New Roman" w:hAnsi="Times New Roman" w:cs="Times New Roman"/>
+          <w:szCs w:val="22"/>
+        </w:rPr>
+        <w:t>Eslami</w:t>
+      </w:r>
+      <w:proofErr w:type="spellEnd"/>
+      <w:r>
+        <w:rPr>
+          <w:rFonts w:ascii="Times New Roman" w:hAnsi="Times New Roman" w:cs="Times New Roman"/>
+          <w:szCs w:val="22"/>
+        </w:rPr>
+        <w:t xml:space="preserve">, L. Van </w:t>
+      </w:r>
+      <w:proofErr w:type="spellStart"/>
+      <w:r>
+        <w:rPr>
+          <w:rFonts w:ascii="Times New Roman" w:hAnsi="Times New Roman" w:cs="Times New Roman"/>
+          <w:szCs w:val="22"/>
+        </w:rPr>
+        <w:t>Gool</w:t>
+      </w:r>
+      <w:proofErr w:type="spellEnd"/>
+      <w:r>
+        <w:rPr>
+          <w:rFonts w:ascii="Times New Roman" w:hAnsi="Times New Roman" w:cs="Times New Roman"/>
+          <w:szCs w:val="22"/>
+        </w:rPr>
+        <w:t xml:space="preserve">, C. K. Williams, J. Winn, and A. Zisserman, “The </w:t>
+      </w:r>
+      <w:proofErr w:type="spellStart"/>
+      <w:r>
+        <w:rPr>
+          <w:rFonts w:ascii="Times New Roman" w:hAnsi="Times New Roman" w:cs="Times New Roman"/>
+          <w:szCs w:val="22"/>
+        </w:rPr>
+        <w:t>pascal</w:t>
+      </w:r>
+      <w:proofErr w:type="spellEnd"/>
+      <w:r>
+        <w:rPr>
+          <w:rFonts w:ascii="Times New Roman" w:hAnsi="Times New Roman" w:cs="Times New Roman"/>
+          <w:szCs w:val="22"/>
+        </w:rPr>
+        <w:t xml:space="preserve"> visual object classes challenge: A retrospective,” International journal of computer vision, vol. 111, pp. 98–136, 2015.</w:t>
       </w:r>
     </w:p>
     <w:p>
@@ -20307,7 +21941,55 @@
           <w:rFonts w:ascii="Times New Roman" w:hAnsi="Times New Roman" w:cs="Times New Roman"/>
           <w:szCs w:val="22"/>
         </w:rPr>
-        <w:t xml:space="preserve">, X. Chen, X. Liu, N.-G. Cho, S.-W. Lee, S. Fidler, R. Urtasun, and A. Yuille, “The role of context for object detection and semantic segmentation in the wild,” in Proceedings of the IEEE conference on computer vision and pattern recognition, 2014, pp. 891–898. </w:t>
+        <w:t xml:space="preserve">, X. Chen, X. Liu, N.-G. Cho, S.-W. Lee, S. </w:t>
+      </w:r>
+      <w:proofErr w:type="spellStart"/>
+      <w:r>
+        <w:rPr>
+          <w:rFonts w:ascii="Times New Roman" w:hAnsi="Times New Roman" w:cs="Times New Roman"/>
+          <w:szCs w:val="22"/>
+        </w:rPr>
+        <w:t>Fidler</w:t>
+      </w:r>
+      <w:proofErr w:type="spellEnd"/>
+      <w:r>
+        <w:rPr>
+          <w:rFonts w:ascii="Times New Roman" w:hAnsi="Times New Roman" w:cs="Times New Roman"/>
+          <w:szCs w:val="22"/>
+        </w:rPr>
+        <w:t xml:space="preserve">, R. </w:t>
+      </w:r>
+      <w:proofErr w:type="spellStart"/>
+      <w:r>
+        <w:rPr>
+          <w:rFonts w:ascii="Times New Roman" w:hAnsi="Times New Roman" w:cs="Times New Roman"/>
+          <w:szCs w:val="22"/>
+        </w:rPr>
+        <w:t>Urtasun</w:t>
+      </w:r>
+      <w:proofErr w:type="spellEnd"/>
+      <w:r>
+        <w:rPr>
+          <w:rFonts w:ascii="Times New Roman" w:hAnsi="Times New Roman" w:cs="Times New Roman"/>
+          <w:szCs w:val="22"/>
+        </w:rPr>
+        <w:t xml:space="preserve">, and A. </w:t>
+      </w:r>
+      <w:proofErr w:type="spellStart"/>
+      <w:r>
+        <w:rPr>
+          <w:rFonts w:ascii="Times New Roman" w:hAnsi="Times New Roman" w:cs="Times New Roman"/>
+          <w:szCs w:val="22"/>
+        </w:rPr>
+        <w:t>Yuille</w:t>
+      </w:r>
+      <w:proofErr w:type="spellEnd"/>
+      <w:r>
+        <w:rPr>
+          <w:rFonts w:ascii="Times New Roman" w:hAnsi="Times New Roman" w:cs="Times New Roman"/>
+          <w:szCs w:val="22"/>
+        </w:rPr>
+        <w:t xml:space="preserve">, “The role of context for object detection and semantic segmentation in the wild,” in Proceedings of the IEEE conference on computer vision and pattern recognition, 2014, pp. 891–898. </w:t>
       </w:r>
     </w:p>
     <w:p>
@@ -20345,7 +22027,55 @@
           <w:rFonts w:ascii="Times New Roman" w:hAnsi="Times New Roman" w:cs="Times New Roman"/>
           <w:szCs w:val="22"/>
         </w:rPr>
-        <w:t>, X. Liu, S. Fidler, R. Urtasun, and A. Yuille, “Detect what you can: Detecting and representing objects using holisti</w:t>
+        <w:t xml:space="preserve">, X. Liu, S. </w:t>
+      </w:r>
+      <w:proofErr w:type="spellStart"/>
+      <w:r>
+        <w:rPr>
+          <w:rFonts w:ascii="Times New Roman" w:hAnsi="Times New Roman" w:cs="Times New Roman"/>
+          <w:szCs w:val="22"/>
+        </w:rPr>
+        <w:t>Fidler</w:t>
+      </w:r>
+      <w:proofErr w:type="spellEnd"/>
+      <w:r>
+        <w:rPr>
+          <w:rFonts w:ascii="Times New Roman" w:hAnsi="Times New Roman" w:cs="Times New Roman"/>
+          <w:szCs w:val="22"/>
+        </w:rPr>
+        <w:t xml:space="preserve">, R. </w:t>
+      </w:r>
+      <w:proofErr w:type="spellStart"/>
+      <w:r>
+        <w:rPr>
+          <w:rFonts w:ascii="Times New Roman" w:hAnsi="Times New Roman" w:cs="Times New Roman"/>
+          <w:szCs w:val="22"/>
+        </w:rPr>
+        <w:t>Urtasun</w:t>
+      </w:r>
+      <w:proofErr w:type="spellEnd"/>
+      <w:r>
+        <w:rPr>
+          <w:rFonts w:ascii="Times New Roman" w:hAnsi="Times New Roman" w:cs="Times New Roman"/>
+          <w:szCs w:val="22"/>
+        </w:rPr>
+        <w:t xml:space="preserve">, and A. </w:t>
+      </w:r>
+      <w:proofErr w:type="spellStart"/>
+      <w:r>
+        <w:rPr>
+          <w:rFonts w:ascii="Times New Roman" w:hAnsi="Times New Roman" w:cs="Times New Roman"/>
+          <w:szCs w:val="22"/>
+        </w:rPr>
+        <w:t>Yuille</w:t>
+      </w:r>
+      <w:proofErr w:type="spellEnd"/>
+      <w:r>
+        <w:rPr>
+          <w:rFonts w:ascii="Times New Roman" w:hAnsi="Times New Roman" w:cs="Times New Roman"/>
+          <w:szCs w:val="22"/>
+        </w:rPr>
+        <w:t>, “Detect what you can: Detecting and representing objects using holisti</w:t>
       </w:r>
       <w:r>
         <w:rPr>
@@ -20390,7 +22120,23 @@
           <w:rFonts w:ascii="Times New Roman" w:hAnsi="Times New Roman" w:cs="Times New Roman"/>
           <w:szCs w:val="22"/>
         </w:rPr>
-        <w:t xml:space="preserve">, P. Kohli, and R. Fergus, “Indoor segmentation and support inference from </w:t>
+        <w:t xml:space="preserve">, P. </w:t>
+      </w:r>
+      <w:proofErr w:type="spellStart"/>
+      <w:r>
+        <w:rPr>
+          <w:rFonts w:ascii="Times New Roman" w:hAnsi="Times New Roman" w:cs="Times New Roman"/>
+          <w:szCs w:val="22"/>
+        </w:rPr>
+        <w:t>Kohli</w:t>
+      </w:r>
+      <w:proofErr w:type="spellEnd"/>
+      <w:r>
+        <w:rPr>
+          <w:rFonts w:ascii="Times New Roman" w:hAnsi="Times New Roman" w:cs="Times New Roman"/>
+          <w:szCs w:val="22"/>
+        </w:rPr>
+        <w:t xml:space="preserve">, and R. Fergus, “Indoor segmentation and support inference from </w:t>
       </w:r>
       <w:proofErr w:type="spellStart"/>
       <w:r>
@@ -20489,7 +22235,23 @@
           <w:rFonts w:ascii="Times New Roman" w:hAnsi="Times New Roman" w:cs="Times New Roman"/>
           <w:szCs w:val="22"/>
         </w:rPr>
-        <w:t xml:space="preserve">J. Xiao, A. Owens, and A. Torralba, “Sun3d: A database of big spaces reconstructed using </w:t>
+        <w:t xml:space="preserve">J. Xiao, A. Owens, and A. </w:t>
+      </w:r>
+      <w:proofErr w:type="spellStart"/>
+      <w:r>
+        <w:rPr>
+          <w:rFonts w:ascii="Times New Roman" w:hAnsi="Times New Roman" w:cs="Times New Roman"/>
+          <w:szCs w:val="22"/>
+        </w:rPr>
+        <w:t>Torralba</w:t>
+      </w:r>
+      <w:proofErr w:type="spellEnd"/>
+      <w:r>
+        <w:rPr>
+          <w:rFonts w:ascii="Times New Roman" w:hAnsi="Times New Roman" w:cs="Times New Roman"/>
+          <w:szCs w:val="22"/>
+        </w:rPr>
+        <w:t xml:space="preserve">, “Sun3d: A database of big spaces reconstructed using </w:t>
       </w:r>
       <w:proofErr w:type="spellStart"/>
       <w:r>
@@ -20527,7 +22289,39 @@
           <w:rFonts w:ascii="Times New Roman" w:hAnsi="Times New Roman" w:cs="Times New Roman"/>
           <w:szCs w:val="22"/>
         </w:rPr>
-        <w:t xml:space="preserve">B. Hariharan, P. Arbelaez, L. </w:t>
+        <w:t xml:space="preserve">B. </w:t>
+      </w:r>
+      <w:proofErr w:type="spellStart"/>
+      <w:r>
+        <w:rPr>
+          <w:rFonts w:ascii="Times New Roman" w:hAnsi="Times New Roman" w:cs="Times New Roman"/>
+          <w:szCs w:val="22"/>
+        </w:rPr>
+        <w:t>Hariharan</w:t>
+      </w:r>
+      <w:proofErr w:type="spellEnd"/>
+      <w:r>
+        <w:rPr>
+          <w:rFonts w:ascii="Times New Roman" w:hAnsi="Times New Roman" w:cs="Times New Roman"/>
+          <w:szCs w:val="22"/>
+        </w:rPr>
+        <w:t xml:space="preserve">, P. </w:t>
+      </w:r>
+      <w:proofErr w:type="spellStart"/>
+      <w:r>
+        <w:rPr>
+          <w:rFonts w:ascii="Times New Roman" w:hAnsi="Times New Roman" w:cs="Times New Roman"/>
+          <w:szCs w:val="22"/>
+        </w:rPr>
+        <w:t>Arbelaez</w:t>
+      </w:r>
+      <w:proofErr w:type="spellEnd"/>
+      <w:r>
+        <w:rPr>
+          <w:rFonts w:ascii="Times New Roman" w:hAnsi="Times New Roman" w:cs="Times New Roman"/>
+          <w:szCs w:val="22"/>
+        </w:rPr>
+        <w:t xml:space="preserve">, L. </w:t>
       </w:r>
       <w:proofErr w:type="spellStart"/>
       <w:r>
@@ -20543,7 +22337,23 @@
           <w:rFonts w:ascii="Times New Roman" w:hAnsi="Times New Roman" w:cs="Times New Roman"/>
           <w:szCs w:val="22"/>
         </w:rPr>
-        <w:t>, S. Maji, and J. Malik, “Semantic contours ´ from inverse detectors,” in 2011 International Conference on Computer Vision, 2011, pp. 991–998.</w:t>
+        <w:t xml:space="preserve">, S. </w:t>
+      </w:r>
+      <w:proofErr w:type="spellStart"/>
+      <w:r>
+        <w:rPr>
+          <w:rFonts w:ascii="Times New Roman" w:hAnsi="Times New Roman" w:cs="Times New Roman"/>
+          <w:szCs w:val="22"/>
+        </w:rPr>
+        <w:t>Maji</w:t>
+      </w:r>
+      <w:proofErr w:type="spellEnd"/>
+      <w:r>
+        <w:rPr>
+          <w:rFonts w:ascii="Times New Roman" w:hAnsi="Times New Roman" w:cs="Times New Roman"/>
+          <w:szCs w:val="22"/>
+        </w:rPr>
+        <w:t>, and J. Malik, “Semantic contours ´ from inverse detectors,” in 2011 International Conference on Computer Vision, 2011, pp. 991–998.</w:t>
       </w:r>
     </w:p>
     <w:p>
@@ -20565,7 +22375,39 @@
           <w:rFonts w:ascii="Times New Roman" w:hAnsi="Times New Roman" w:cs="Times New Roman"/>
           <w:szCs w:val="22"/>
         </w:rPr>
-        <w:t xml:space="preserve">G. Ros, L. Sellart, J. </w:t>
+        <w:t xml:space="preserve">G. </w:t>
+      </w:r>
+      <w:proofErr w:type="spellStart"/>
+      <w:r>
+        <w:rPr>
+          <w:rFonts w:ascii="Times New Roman" w:hAnsi="Times New Roman" w:cs="Times New Roman"/>
+          <w:szCs w:val="22"/>
+        </w:rPr>
+        <w:t>Ros</w:t>
+      </w:r>
+      <w:proofErr w:type="spellEnd"/>
+      <w:r>
+        <w:rPr>
+          <w:rFonts w:ascii="Times New Roman" w:hAnsi="Times New Roman" w:cs="Times New Roman"/>
+          <w:szCs w:val="22"/>
+        </w:rPr>
+        <w:t xml:space="preserve">, L. </w:t>
+      </w:r>
+      <w:proofErr w:type="spellStart"/>
+      <w:r>
+        <w:rPr>
+          <w:rFonts w:ascii="Times New Roman" w:hAnsi="Times New Roman" w:cs="Times New Roman"/>
+          <w:szCs w:val="22"/>
+        </w:rPr>
+        <w:t>Sellart</w:t>
+      </w:r>
+      <w:proofErr w:type="spellEnd"/>
+      <w:r>
+        <w:rPr>
+          <w:rFonts w:ascii="Times New Roman" w:hAnsi="Times New Roman" w:cs="Times New Roman"/>
+          <w:szCs w:val="22"/>
+        </w:rPr>
+        <w:t xml:space="preserve">, J. </w:t>
       </w:r>
       <w:proofErr w:type="spellStart"/>
       <w:r>
@@ -20619,7 +22461,23 @@
           <w:rFonts w:ascii="Times New Roman" w:hAnsi="Times New Roman" w:cs="Times New Roman"/>
           <w:szCs w:val="22"/>
         </w:rPr>
-        <w:t>F. Yu, H. Chen, X. Wang, W. Xian, Y. Chen, F. Liu, V. Madhavan, and T. Darrell, “Bdd100k: A diverse driving dataset for heterogen</w:t>
+        <w:t xml:space="preserve">F. Yu, H. Chen, X. Wang, W. Xian, Y. Chen, F. Liu, V. </w:t>
+      </w:r>
+      <w:proofErr w:type="spellStart"/>
+      <w:r>
+        <w:rPr>
+          <w:rFonts w:ascii="Times New Roman" w:hAnsi="Times New Roman" w:cs="Times New Roman"/>
+          <w:szCs w:val="22"/>
+        </w:rPr>
+        <w:t>Madhavan</w:t>
+      </w:r>
+      <w:proofErr w:type="spellEnd"/>
+      <w:r>
+        <w:rPr>
+          <w:rFonts w:ascii="Times New Roman" w:hAnsi="Times New Roman" w:cs="Times New Roman"/>
+          <w:szCs w:val="22"/>
+        </w:rPr>
+        <w:t>, and T. Darrell, “Bdd100k: A diverse driving dataset for heterogen</w:t>
       </w:r>
       <w:r>
         <w:rPr>
@@ -20648,6 +22506,7 @@
           <w:rFonts w:ascii="Times New Roman" w:hAnsi="Times New Roman" w:cs="Times New Roman"/>
           <w:szCs w:val="22"/>
         </w:rPr>
+        <w:lastRenderedPageBreak/>
         <w:t xml:space="preserve">G. J. </w:t>
       </w:r>
       <w:proofErr w:type="spellStart"/>
@@ -20680,7 +22539,23 @@
           <w:rFonts w:ascii="Times New Roman" w:hAnsi="Times New Roman" w:cs="Times New Roman"/>
           <w:szCs w:val="22"/>
         </w:rPr>
-        <w:t>, and R. Cipolla, “Semantic object classes in video: A high-definition ground truth database,” Pattern Recognition Letters, vol. 30, no. 2, pp. 88–97, Jan. 2009.</w:t>
+        <w:t xml:space="preserve">, and R. </w:t>
+      </w:r>
+      <w:proofErr w:type="spellStart"/>
+      <w:r>
+        <w:rPr>
+          <w:rFonts w:ascii="Times New Roman" w:hAnsi="Times New Roman" w:cs="Times New Roman"/>
+          <w:szCs w:val="22"/>
+        </w:rPr>
+        <w:t>Cipolla</w:t>
+      </w:r>
+      <w:proofErr w:type="spellEnd"/>
+      <w:r>
+        <w:rPr>
+          <w:rFonts w:ascii="Times New Roman" w:hAnsi="Times New Roman" w:cs="Times New Roman"/>
+          <w:szCs w:val="22"/>
+        </w:rPr>
+        <w:t>, “Semantic object classes in video: A high-definition ground truth database,” Pattern Recognition Letters, vol. 30, no. 2, pp. 88–97, Jan. 2009.</w:t>
       </w:r>
     </w:p>
     <w:p>
@@ -20702,7 +22577,71 @@
           <w:rFonts w:ascii="Times New Roman" w:hAnsi="Times New Roman" w:cs="Times New Roman"/>
           <w:szCs w:val="22"/>
         </w:rPr>
-        <w:t>M. Cordts, M. Omran, S. Ramos, T. Rehfeld, M. Enzweiler, R. Benenson, U. Franke, S. Roth, and B. Schiele, “The cityscapes dataset for semantic urban scene understanding,” in 2016 IEEE Conference on Computer Vision and Pattern Recognition (CVPR), 2016, pp. 3213–3223.</w:t>
+        <w:t xml:space="preserve">Z. Chen, K. Han, Z. Yu, A. Feng, Y. </w:t>
+      </w:r>
+      <w:proofErr w:type="spellStart"/>
+      <w:r>
+        <w:rPr>
+          <w:rFonts w:ascii="Times New Roman" w:hAnsi="Times New Roman" w:cs="Times New Roman"/>
+          <w:szCs w:val="22"/>
+        </w:rPr>
+        <w:t>Hou</w:t>
+      </w:r>
+      <w:proofErr w:type="spellEnd"/>
+      <w:r>
+        <w:rPr>
+          <w:rFonts w:ascii="Times New Roman" w:hAnsi="Times New Roman" w:cs="Times New Roman"/>
+          <w:szCs w:val="22"/>
+        </w:rPr>
+        <w:t xml:space="preserve">, S. You, and L. </w:t>
+      </w:r>
+      <w:proofErr w:type="spellStart"/>
+      <w:r>
+        <w:rPr>
+          <w:rFonts w:ascii="Times New Roman" w:hAnsi="Times New Roman" w:cs="Times New Roman"/>
+          <w:szCs w:val="22"/>
+        </w:rPr>
+        <w:t>Soibelman</w:t>
+      </w:r>
+      <w:proofErr w:type="spellEnd"/>
+      <w:r>
+        <w:rPr>
+          <w:rFonts w:ascii="Times New Roman" w:hAnsi="Times New Roman" w:cs="Times New Roman"/>
+          <w:szCs w:val="22"/>
+        </w:rPr>
+        <w:t xml:space="preserve">, </w:t>
+      </w:r>
+      <w:r>
+        <w:rPr>
+          <w:rFonts w:ascii="Times New Roman" w:hAnsi="Times New Roman" w:cs="Times New Roman"/>
+          <w:i/>
+          <w:iCs/>
+          <w:szCs w:val="22"/>
+        </w:rPr>
+        <w:t>“An Aerial Photogrammetry Benchmark Dataset for Point Cloud Segmentation and Style Translation,”</w:t>
+      </w:r>
+      <w:r>
+        <w:rPr>
+          <w:rFonts w:ascii="Times New Roman" w:hAnsi="Times New Roman" w:cs="Times New Roman"/>
+          <w:szCs w:val="22"/>
+        </w:rPr>
+        <w:t xml:space="preserve"> </w:t>
+      </w:r>
+      <w:r>
+        <w:rPr>
+          <w:rFonts w:ascii="Times New Roman" w:hAnsi="Times New Roman" w:cs="Times New Roman"/>
+          <w:b/>
+          <w:bCs/>
+          <w:szCs w:val="22"/>
+        </w:rPr>
+        <w:t>Remote Sensing</w:t>
+      </w:r>
+      <w:r>
+        <w:rPr>
+          <w:rFonts w:ascii="Times New Roman" w:hAnsi="Times New Roman" w:cs="Times New Roman"/>
+          <w:szCs w:val="22"/>
+        </w:rPr>
+        <w:t>, vol. 16(22), p. 4240, 2024.</w:t>
       </w:r>
     </w:p>
     <w:p>
@@ -20724,7 +22663,39 @@
           <w:rFonts w:ascii="Times New Roman" w:hAnsi="Times New Roman" w:cs="Times New Roman"/>
           <w:szCs w:val="22"/>
         </w:rPr>
-        <w:t xml:space="preserve">A. Prest, C. Leistner, J. </w:t>
+        <w:t xml:space="preserve">A. </w:t>
+      </w:r>
+      <w:proofErr w:type="spellStart"/>
+      <w:r>
+        <w:rPr>
+          <w:rFonts w:ascii="Times New Roman" w:hAnsi="Times New Roman" w:cs="Times New Roman"/>
+          <w:szCs w:val="22"/>
+        </w:rPr>
+        <w:t>Prest</w:t>
+      </w:r>
+      <w:proofErr w:type="spellEnd"/>
+      <w:r>
+        <w:rPr>
+          <w:rFonts w:ascii="Times New Roman" w:hAnsi="Times New Roman" w:cs="Times New Roman"/>
+          <w:szCs w:val="22"/>
+        </w:rPr>
+        <w:t xml:space="preserve">, C. </w:t>
+      </w:r>
+      <w:proofErr w:type="spellStart"/>
+      <w:r>
+        <w:rPr>
+          <w:rFonts w:ascii="Times New Roman" w:hAnsi="Times New Roman" w:cs="Times New Roman"/>
+          <w:szCs w:val="22"/>
+        </w:rPr>
+        <w:t>Leistner</w:t>
+      </w:r>
+      <w:proofErr w:type="spellEnd"/>
+      <w:r>
+        <w:rPr>
+          <w:rFonts w:ascii="Times New Roman" w:hAnsi="Times New Roman" w:cs="Times New Roman"/>
+          <w:szCs w:val="22"/>
+        </w:rPr>
+        <w:t xml:space="preserve">, J. </w:t>
       </w:r>
       <w:proofErr w:type="spellStart"/>
       <w:r>
@@ -20740,7 +22711,23 @@
           <w:rFonts w:ascii="Times New Roman" w:hAnsi="Times New Roman" w:cs="Times New Roman"/>
           <w:szCs w:val="22"/>
         </w:rPr>
-        <w:t>, C. Schmid, and V. Ferrari, “Learning object class detectors from weakly annotated video,” in 2012 IEEE Conference on Computer Vision and Pattern Recognition, 2012, pp. 3282–3289.</w:t>
+        <w:t xml:space="preserve">, C. </w:t>
+      </w:r>
+      <w:proofErr w:type="spellStart"/>
+      <w:r>
+        <w:rPr>
+          <w:rFonts w:ascii="Times New Roman" w:hAnsi="Times New Roman" w:cs="Times New Roman"/>
+          <w:szCs w:val="22"/>
+        </w:rPr>
+        <w:t>Schmid</w:t>
+      </w:r>
+      <w:proofErr w:type="spellEnd"/>
+      <w:r>
+        <w:rPr>
+          <w:rFonts w:ascii="Times New Roman" w:hAnsi="Times New Roman" w:cs="Times New Roman"/>
+          <w:szCs w:val="22"/>
+        </w:rPr>
+        <w:t>, and V. Ferrari, “Learning object class detectors from weakly annotated video,” in 2012 IEEE Conference on Computer Vision and Pattern Recognition, 2012, pp. 3282–3289.</w:t>
       </w:r>
     </w:p>
     <w:p>
@@ -20762,8 +22749,39 @@
           <w:rFonts w:ascii="Times New Roman" w:hAnsi="Times New Roman" w:cs="Times New Roman"/>
           <w:szCs w:val="22"/>
         </w:rPr>
-        <w:lastRenderedPageBreak/>
-        <w:t>S. Bell, P. Upchurch, N. Snavely, and K. Bala, “Material recognition in the wild with the materials in c</w:t>
+        <w:t xml:space="preserve">S. Bell, P. Upchurch, N. </w:t>
+      </w:r>
+      <w:proofErr w:type="spellStart"/>
+      <w:r>
+        <w:rPr>
+          <w:rFonts w:ascii="Times New Roman" w:hAnsi="Times New Roman" w:cs="Times New Roman"/>
+          <w:szCs w:val="22"/>
+        </w:rPr>
+        <w:t>Snavely</w:t>
+      </w:r>
+      <w:proofErr w:type="spellEnd"/>
+      <w:r>
+        <w:rPr>
+          <w:rFonts w:ascii="Times New Roman" w:hAnsi="Times New Roman" w:cs="Times New Roman"/>
+          <w:szCs w:val="22"/>
+        </w:rPr>
+        <w:t xml:space="preserve">, and K. </w:t>
+      </w:r>
+      <w:proofErr w:type="spellStart"/>
+      <w:r>
+        <w:rPr>
+          <w:rFonts w:ascii="Times New Roman" w:hAnsi="Times New Roman" w:cs="Times New Roman"/>
+          <w:szCs w:val="22"/>
+        </w:rPr>
+        <w:t>Bala</w:t>
+      </w:r>
+      <w:proofErr w:type="spellEnd"/>
+      <w:r>
+        <w:rPr>
+          <w:rFonts w:ascii="Times New Roman" w:hAnsi="Times New Roman" w:cs="Times New Roman"/>
+          <w:szCs w:val="22"/>
+        </w:rPr>
+        <w:t>, “Material recognition in the wild with the materials in c</w:t>
       </w:r>
       <w:r>
         <w:rPr>
@@ -20792,23 +22810,55 @@
           <w:rFonts w:ascii="Times New Roman" w:hAnsi="Times New Roman" w:cs="Times New Roman"/>
           <w:szCs w:val="22"/>
         </w:rPr>
-        <w:t xml:space="preserve">A. Geiger, P. Lenz, and R. Urtasun, “Are we ready for autonomous driving? the </w:t>
-      </w:r>
-      <w:proofErr w:type="spellStart"/>
-      <w:r>
-        <w:rPr>
-          <w:rFonts w:ascii="Times New Roman" w:hAnsi="Times New Roman" w:cs="Times New Roman"/>
-          <w:szCs w:val="22"/>
-        </w:rPr>
-        <w:t>kitti</w:t>
-      </w:r>
-      <w:proofErr w:type="spellEnd"/>
-      <w:r>
-        <w:rPr>
-          <w:rFonts w:ascii="Times New Roman" w:hAnsi="Times New Roman" w:cs="Times New Roman"/>
-          <w:szCs w:val="22"/>
-        </w:rPr>
-        <w:t xml:space="preserve"> vision benchmark suite,” in 2012 IEEE Conference on Computer Vision and Pattern Recognition, 2012, pp. 3354–3361.</w:t>
+        <w:t xml:space="preserve">P.-T. Jiang, Y. Yang, Y. Cao, Q. </w:t>
+      </w:r>
+      <w:proofErr w:type="spellStart"/>
+      <w:r>
+        <w:rPr>
+          <w:rFonts w:ascii="Times New Roman" w:hAnsi="Times New Roman" w:cs="Times New Roman"/>
+          <w:szCs w:val="22"/>
+        </w:rPr>
+        <w:t>Hou</w:t>
+      </w:r>
+      <w:proofErr w:type="spellEnd"/>
+      <w:r>
+        <w:rPr>
+          <w:rFonts w:ascii="Times New Roman" w:hAnsi="Times New Roman" w:cs="Times New Roman"/>
+          <w:szCs w:val="22"/>
+        </w:rPr>
+        <w:t xml:space="preserve">, M.-M. Cheng, and C. Shen, </w:t>
+      </w:r>
+      <w:r>
+        <w:rPr>
+          <w:rFonts w:ascii="Times New Roman" w:hAnsi="Times New Roman" w:cs="Times New Roman"/>
+          <w:i/>
+          <w:iCs/>
+          <w:szCs w:val="22"/>
+        </w:rPr>
+        <w:t>“Traffic Scene Parsing through the TSP6K Dataset,”</w:t>
+      </w:r>
+      <w:r>
+        <w:rPr>
+          <w:rFonts w:ascii="Times New Roman" w:hAnsi="Times New Roman" w:cs="Times New Roman"/>
+          <w:szCs w:val="22"/>
+        </w:rPr>
+        <w:t xml:space="preserve"> in </w:t>
+      </w:r>
+      <w:r>
+        <w:rPr>
+          <w:rFonts w:ascii="Times New Roman" w:hAnsi="Times New Roman" w:cs="Times New Roman"/>
+          <w:b/>
+          <w:bCs/>
+          <w:szCs w:val="22"/>
+        </w:rPr>
+        <w:t>Proc. IEEE/CVF Conference on Computer Vision and Pattern Recognition (CVPR)</w:t>
+      </w:r>
+      <w:r>
+        <w:rPr>
+          <w:rFonts w:ascii="Times New Roman" w:hAnsi="Times New Roman" w:cs="Times New Roman"/>
+          <w:szCs w:val="22"/>
+        </w:rPr>
+        <w:t>, 2024, pp. 21874–21885.</w:t>
       </w:r>
     </w:p>
     <w:p>
@@ -20932,7 +22982,39 @@
           <w:rFonts w:ascii="Times New Roman" w:hAnsi="Times New Roman" w:cs="Times New Roman"/>
           <w:szCs w:val="22"/>
         </w:rPr>
-        <w:t xml:space="preserve">, J. Pont-Tuset, B. McWilliams, L. Van Gool, M. Gross, and A. </w:t>
+        <w:t>, J. Pont-</w:t>
+      </w:r>
+      <w:proofErr w:type="spellStart"/>
+      <w:r>
+        <w:rPr>
+          <w:rFonts w:ascii="Times New Roman" w:hAnsi="Times New Roman" w:cs="Times New Roman"/>
+          <w:szCs w:val="22"/>
+        </w:rPr>
+        <w:t>Tuset</w:t>
+      </w:r>
+      <w:proofErr w:type="spellEnd"/>
+      <w:r>
+        <w:rPr>
+          <w:rFonts w:ascii="Times New Roman" w:hAnsi="Times New Roman" w:cs="Times New Roman"/>
+          <w:szCs w:val="22"/>
+        </w:rPr>
+        <w:t xml:space="preserve">, B. McWilliams, L. Van </w:t>
+      </w:r>
+      <w:proofErr w:type="spellStart"/>
+      <w:r>
+        <w:rPr>
+          <w:rFonts w:ascii="Times New Roman" w:hAnsi="Times New Roman" w:cs="Times New Roman"/>
+          <w:szCs w:val="22"/>
+        </w:rPr>
+        <w:t>Gool</w:t>
+      </w:r>
+      <w:proofErr w:type="spellEnd"/>
+      <w:r>
+        <w:rPr>
+          <w:rFonts w:ascii="Times New Roman" w:hAnsi="Times New Roman" w:cs="Times New Roman"/>
+          <w:szCs w:val="22"/>
+        </w:rPr>
+        <w:t xml:space="preserve">, M. Gross, and A. </w:t>
       </w:r>
       <w:proofErr w:type="spellStart"/>
       <w:r>
@@ -20970,7 +23052,23 @@
           <w:rFonts w:ascii="Times New Roman" w:hAnsi="Times New Roman" w:cs="Times New Roman"/>
           <w:szCs w:val="22"/>
         </w:rPr>
-        <w:t>C. Liu, J. Yuen, and A. Torralba, “Sift flow: Dense correspondence across scenes and its applications,” IEEE Transactions on Pattern Analysis and Machine Intelligence, vol. 33, no. 5, pp. 978–994, 2011.</w:t>
+        <w:t xml:space="preserve">C. Liu, J. Yuen, and A. </w:t>
+      </w:r>
+      <w:proofErr w:type="spellStart"/>
+      <w:r>
+        <w:rPr>
+          <w:rFonts w:ascii="Times New Roman" w:hAnsi="Times New Roman" w:cs="Times New Roman"/>
+          <w:szCs w:val="22"/>
+        </w:rPr>
+        <w:t>Torralba</w:t>
+      </w:r>
+      <w:proofErr w:type="spellEnd"/>
+      <w:r>
+        <w:rPr>
+          <w:rFonts w:ascii="Times New Roman" w:hAnsi="Times New Roman" w:cs="Times New Roman"/>
+          <w:szCs w:val="22"/>
+        </w:rPr>
+        <w:t>, “Sift flow: Dense correspondence across scenes and its applications,” IEEE Transactions on Pattern Analysis and Machine Intelligence, vol. 33, no. 5, pp. 978–994, 2011.</w:t>
       </w:r>
     </w:p>
     <w:p>
@@ -21046,7 +23144,23 @@
           <w:rFonts w:ascii="Times New Roman" w:hAnsi="Times New Roman" w:cs="Times New Roman"/>
           <w:szCs w:val="22"/>
         </w:rPr>
-        <w:t>S. Gould, R. Fulton, and D. Koller, “Decomposing a scene into geometric and semantically consistent regions,” 2009 IEEE 12th International Conference on Computer Vision, pp. 1–8, 2009.</w:t>
+        <w:t xml:space="preserve">S. Gould, R. Fulton, and D. </w:t>
+      </w:r>
+      <w:proofErr w:type="spellStart"/>
+      <w:r>
+        <w:rPr>
+          <w:rFonts w:ascii="Times New Roman" w:hAnsi="Times New Roman" w:cs="Times New Roman"/>
+          <w:szCs w:val="22"/>
+        </w:rPr>
+        <w:t>Koller</w:t>
+      </w:r>
+      <w:proofErr w:type="spellEnd"/>
+      <w:r>
+        <w:rPr>
+          <w:rFonts w:ascii="Times New Roman" w:hAnsi="Times New Roman" w:cs="Times New Roman"/>
+          <w:szCs w:val="22"/>
+        </w:rPr>
+        <w:t>, “Decomposing a scene into geometric and semantically consistent regions,” 2009 IEEE 12th International Conference on Computer Vision, pp. 1–8, 2009.</w:t>
       </w:r>
     </w:p>
     <w:p>
@@ -21106,7 +23220,23 @@
           <w:rFonts w:ascii="Times New Roman" w:hAnsi="Times New Roman" w:cs="Times New Roman"/>
           <w:szCs w:val="22"/>
         </w:rPr>
-        <w:t xml:space="preserve">T.-Y. Lin, P. Goyal, R. </w:t>
+        <w:t xml:space="preserve">T.-Y. Lin, P. </w:t>
+      </w:r>
+      <w:proofErr w:type="spellStart"/>
+      <w:r>
+        <w:rPr>
+          <w:rFonts w:ascii="Times New Roman" w:hAnsi="Times New Roman" w:cs="Times New Roman"/>
+          <w:szCs w:val="22"/>
+        </w:rPr>
+        <w:t>Goyal</w:t>
+      </w:r>
+      <w:proofErr w:type="spellEnd"/>
+      <w:r>
+        <w:rPr>
+          <w:rFonts w:ascii="Times New Roman" w:hAnsi="Times New Roman" w:cs="Times New Roman"/>
+          <w:szCs w:val="22"/>
+        </w:rPr>
+        <w:t xml:space="preserve">, R. </w:t>
       </w:r>
       <w:proofErr w:type="spellStart"/>
       <w:r>
@@ -21160,7 +23290,23 @@
           <w:rFonts w:ascii="Times New Roman" w:hAnsi="Times New Roman" w:cs="Times New Roman"/>
           <w:szCs w:val="22"/>
         </w:rPr>
-        <w:t>, P. Fischer, and T. Brox, “U-net: Convolutional networks for biomedical image segmentation,” 2015.</w:t>
+        <w:t xml:space="preserve">, P. Fischer, and T. </w:t>
+      </w:r>
+      <w:proofErr w:type="spellStart"/>
+      <w:r>
+        <w:rPr>
+          <w:rFonts w:ascii="Times New Roman" w:hAnsi="Times New Roman" w:cs="Times New Roman"/>
+          <w:szCs w:val="22"/>
+        </w:rPr>
+        <w:t>Brox</w:t>
+      </w:r>
+      <w:proofErr w:type="spellEnd"/>
+      <w:r>
+        <w:rPr>
+          <w:rFonts w:ascii="Times New Roman" w:hAnsi="Times New Roman" w:cs="Times New Roman"/>
+          <w:szCs w:val="22"/>
+        </w:rPr>
+        <w:t>, “U-net: Convolutional networks for biomedical image segmentation,” 2015.</w:t>
       </w:r>
     </w:p>
     <w:p>
@@ -21236,71 +23382,41 @@
           <w:rFonts w:ascii="Times New Roman" w:hAnsi="Times New Roman" w:cs="Times New Roman"/>
           <w:szCs w:val="22"/>
         </w:rPr>
-        <w:t xml:space="preserve">L.-C. Chen, G. Papandreou, I. Kokkinos, K. Murphy, and A. L. </w:t>
-      </w:r>
-      <w:proofErr w:type="spellStart"/>
-      <w:r>
-        <w:rPr>
-          <w:rFonts w:ascii="Times New Roman" w:hAnsi="Times New Roman" w:cs="Times New Roman"/>
-          <w:szCs w:val="22"/>
-        </w:rPr>
-        <w:t>Yuille</w:t>
-      </w:r>
-      <w:proofErr w:type="spellEnd"/>
-      <w:r>
-        <w:rPr>
-          <w:rFonts w:ascii="Times New Roman" w:hAnsi="Times New Roman" w:cs="Times New Roman"/>
-          <w:szCs w:val="22"/>
-        </w:rPr>
-        <w:t>, “</w:t>
-      </w:r>
-      <w:proofErr w:type="spellStart"/>
-      <w:r>
-        <w:rPr>
-          <w:rFonts w:ascii="Times New Roman" w:hAnsi="Times New Roman" w:cs="Times New Roman"/>
-          <w:szCs w:val="22"/>
-        </w:rPr>
-        <w:t>Deeplab</w:t>
-      </w:r>
-      <w:proofErr w:type="spellEnd"/>
-      <w:r>
-        <w:rPr>
-          <w:rFonts w:ascii="Times New Roman" w:hAnsi="Times New Roman" w:cs="Times New Roman"/>
-          <w:szCs w:val="22"/>
-        </w:rPr>
-        <w:t xml:space="preserve">: Semantic image segmentation with deep convolutional nets, </w:t>
-      </w:r>
-      <w:proofErr w:type="spellStart"/>
-      <w:r>
-        <w:rPr>
-          <w:rFonts w:ascii="Times New Roman" w:hAnsi="Times New Roman" w:cs="Times New Roman"/>
-          <w:szCs w:val="22"/>
-        </w:rPr>
-        <w:t>atrous</w:t>
-      </w:r>
-      <w:proofErr w:type="spellEnd"/>
-      <w:r>
-        <w:rPr>
-          <w:rFonts w:ascii="Times New Roman" w:hAnsi="Times New Roman" w:cs="Times New Roman"/>
-          <w:szCs w:val="22"/>
-        </w:rPr>
-        <w:t xml:space="preserve"> convolution, and fully connected </w:t>
-      </w:r>
-      <w:proofErr w:type="spellStart"/>
-      <w:r>
-        <w:rPr>
-          <w:rFonts w:ascii="Times New Roman" w:hAnsi="Times New Roman" w:cs="Times New Roman"/>
-          <w:szCs w:val="22"/>
-        </w:rPr>
-        <w:t>crfs</w:t>
-      </w:r>
-      <w:proofErr w:type="spellEnd"/>
-      <w:r>
-        <w:rPr>
-          <w:rFonts w:ascii="Times New Roman" w:hAnsi="Times New Roman" w:cs="Times New Roman"/>
-          <w:szCs w:val="22"/>
-        </w:rPr>
-        <w:t xml:space="preserve">,” IEEE Transactions on Pattern Analysis and Machine Intelligence, vol. 40, no. 4, pp. 834–848, 2018. </w:t>
+        <w:t xml:space="preserve">W. Chen, Z. Miao, Y. Qu, et al., </w:t>
+      </w:r>
+      <w:r>
+        <w:rPr>
+          <w:rFonts w:ascii="Times New Roman" w:hAnsi="Times New Roman" w:cs="Times New Roman"/>
+          <w:i/>
+          <w:iCs/>
+          <w:szCs w:val="22"/>
+        </w:rPr>
+        <w:t>“</w:t>
+      </w:r>
+      <w:proofErr w:type="spellStart"/>
+      <w:r>
+        <w:rPr>
+          <w:rFonts w:ascii="Times New Roman" w:hAnsi="Times New Roman" w:cs="Times New Roman"/>
+          <w:iCs/>
+          <w:szCs w:val="22"/>
+        </w:rPr>
+        <w:t>HRDLNet</w:t>
+      </w:r>
+      <w:proofErr w:type="spellEnd"/>
+      <w:r>
+        <w:rPr>
+          <w:rFonts w:ascii="Times New Roman" w:hAnsi="Times New Roman" w:cs="Times New Roman"/>
+          <w:iCs/>
+          <w:szCs w:val="22"/>
+        </w:rPr>
+        <w:t>: a semantic segmentation network with high resolution representation for urban street view images,”</w:t>
+      </w:r>
+      <w:r>
+        <w:rPr>
+          <w:rFonts w:ascii="Times New Roman" w:hAnsi="Times New Roman" w:cs="Times New Roman"/>
+          <w:szCs w:val="22"/>
+        </w:rPr>
+        <w:t xml:space="preserve"> Complex &amp; Intelligent Systems, 2024.</w:t>
       </w:r>
     </w:p>
     <w:p>
@@ -21415,23 +23531,39 @@
           <w:rFonts w:ascii="Times New Roman" w:hAnsi="Times New Roman" w:cs="Times New Roman"/>
           <w:szCs w:val="22"/>
         </w:rPr>
-        <w:t xml:space="preserve">O. </w:t>
-      </w:r>
-      <w:proofErr w:type="spellStart"/>
-      <w:r>
-        <w:rPr>
-          <w:rFonts w:ascii="Times New Roman" w:hAnsi="Times New Roman" w:cs="Times New Roman"/>
-          <w:szCs w:val="22"/>
-        </w:rPr>
-        <w:t>Ronneberger</w:t>
-      </w:r>
-      <w:proofErr w:type="spellEnd"/>
-      <w:r>
-        <w:rPr>
-          <w:rFonts w:ascii="Times New Roman" w:hAnsi="Times New Roman" w:cs="Times New Roman"/>
-          <w:szCs w:val="22"/>
-        </w:rPr>
-        <w:t>, P. Fischer, and T. Brox, “U-net: Convolutional networks for biomedical image segmentation,” 2015.</w:t>
+        <w:t xml:space="preserve">Y. Gao, Y. Jiang, Y. Peng, F. Yuan, X. Zhang, and J. Wang, </w:t>
+      </w:r>
+      <w:r>
+        <w:rPr>
+          <w:rFonts w:ascii="Times New Roman" w:hAnsi="Times New Roman" w:cs="Times New Roman"/>
+          <w:i/>
+          <w:iCs/>
+          <w:szCs w:val="22"/>
+        </w:rPr>
+        <w:t>“Medical Image Segmentation: A Comprehensive Review of Deep Learning-Based Methods,”</w:t>
+      </w:r>
+      <w:r>
+        <w:rPr>
+          <w:rFonts w:ascii="Times New Roman" w:hAnsi="Times New Roman" w:cs="Times New Roman"/>
+          <w:szCs w:val="22"/>
+        </w:rPr>
+        <w:t xml:space="preserve"> </w:t>
+      </w:r>
+      <w:r>
+        <w:rPr>
+          <w:rFonts w:ascii="Times New Roman" w:hAnsi="Times New Roman" w:cs="Times New Roman"/>
+          <w:b/>
+          <w:bCs/>
+          <w:szCs w:val="22"/>
+        </w:rPr>
+        <w:t>Tomography</w:t>
+      </w:r>
+      <w:r>
+        <w:rPr>
+          <w:rFonts w:ascii="Times New Roman" w:hAnsi="Times New Roman" w:cs="Times New Roman"/>
+          <w:szCs w:val="22"/>
+        </w:rPr>
+        <w:t xml:space="preserve">, vol. 11, no. 5, p. 52, 2025. </w:t>
       </w:r>
     </w:p>
     <w:p>
@@ -21453,7 +23585,23 @@
           <w:rFonts w:ascii="Times New Roman" w:hAnsi="Times New Roman" w:cs="Times New Roman"/>
           <w:szCs w:val="22"/>
         </w:rPr>
-        <w:t xml:space="preserve">K. He, H. Fan, Y. Wu, S. Xie, and R. </w:t>
+        <w:t xml:space="preserve">K. He, H. Fan, Y. Wu, S. </w:t>
+      </w:r>
+      <w:proofErr w:type="spellStart"/>
+      <w:r>
+        <w:rPr>
+          <w:rFonts w:ascii="Times New Roman" w:hAnsi="Times New Roman" w:cs="Times New Roman"/>
+          <w:szCs w:val="22"/>
+        </w:rPr>
+        <w:t>Xie</w:t>
+      </w:r>
+      <w:proofErr w:type="spellEnd"/>
+      <w:r>
+        <w:rPr>
+          <w:rFonts w:ascii="Times New Roman" w:hAnsi="Times New Roman" w:cs="Times New Roman"/>
+          <w:szCs w:val="22"/>
+        </w:rPr>
+        <w:t xml:space="preserve">, and R. </w:t>
       </w:r>
       <w:proofErr w:type="spellStart"/>
       <w:r>
@@ -21491,7 +23639,39 @@
           <w:rFonts w:ascii="Times New Roman" w:hAnsi="Times New Roman" w:cs="Times New Roman"/>
           <w:szCs w:val="22"/>
         </w:rPr>
-        <w:t xml:space="preserve">N. D. Lane, S. Bhattacharya, A. Mathur, P. Georgiev, C. </w:t>
+        <w:t xml:space="preserve">N. D. Lane, S. Bhattacharya, A. </w:t>
+      </w:r>
+      <w:proofErr w:type="spellStart"/>
+      <w:r>
+        <w:rPr>
+          <w:rFonts w:ascii="Times New Roman" w:hAnsi="Times New Roman" w:cs="Times New Roman"/>
+          <w:szCs w:val="22"/>
+        </w:rPr>
+        <w:t>Mathur</w:t>
+      </w:r>
+      <w:proofErr w:type="spellEnd"/>
+      <w:r>
+        <w:rPr>
+          <w:rFonts w:ascii="Times New Roman" w:hAnsi="Times New Roman" w:cs="Times New Roman"/>
+          <w:szCs w:val="22"/>
+        </w:rPr>
+        <w:t xml:space="preserve">, P. </w:t>
+      </w:r>
+      <w:proofErr w:type="spellStart"/>
+      <w:r>
+        <w:rPr>
+          <w:rFonts w:ascii="Times New Roman" w:hAnsi="Times New Roman" w:cs="Times New Roman"/>
+          <w:szCs w:val="22"/>
+        </w:rPr>
+        <w:t>Georgiev</w:t>
+      </w:r>
+      <w:proofErr w:type="spellEnd"/>
+      <w:r>
+        <w:rPr>
+          <w:rFonts w:ascii="Times New Roman" w:hAnsi="Times New Roman" w:cs="Times New Roman"/>
+          <w:szCs w:val="22"/>
+        </w:rPr>
+        <w:t xml:space="preserve">, C. </w:t>
       </w:r>
       <w:proofErr w:type="spellStart"/>
       <w:r>
@@ -21507,7 +23687,23 @@
           <w:rFonts w:ascii="Times New Roman" w:hAnsi="Times New Roman" w:cs="Times New Roman"/>
           <w:szCs w:val="22"/>
         </w:rPr>
-        <w:t>, and F. Kawsar, “Squeezing deep learning into mobile and embedded devices,” IEEE Pervasive Compu</w:t>
+        <w:t xml:space="preserve">, and F. </w:t>
+      </w:r>
+      <w:proofErr w:type="spellStart"/>
+      <w:r>
+        <w:rPr>
+          <w:rFonts w:ascii="Times New Roman" w:hAnsi="Times New Roman" w:cs="Times New Roman"/>
+          <w:szCs w:val="22"/>
+        </w:rPr>
+        <w:t>Kawsar</w:t>
+      </w:r>
+      <w:proofErr w:type="spellEnd"/>
+      <w:r>
+        <w:rPr>
+          <w:rFonts w:ascii="Times New Roman" w:hAnsi="Times New Roman" w:cs="Times New Roman"/>
+          <w:szCs w:val="22"/>
+        </w:rPr>
+        <w:t>, “Squeezing deep learning into mobile and embedded devices,” IEEE Pervasive Compu</w:t>
       </w:r>
       <w:r>
         <w:rPr>
@@ -21590,6 +23786,7 @@
           <w:rFonts w:ascii="Times New Roman" w:hAnsi="Times New Roman" w:cs="Times New Roman"/>
           <w:szCs w:val="22"/>
         </w:rPr>
+        <w:lastRenderedPageBreak/>
         <w:t xml:space="preserve">Y. Chen, W. Li, C. </w:t>
       </w:r>
       <w:proofErr w:type="spellStart"/>
@@ -21606,7 +23803,23 @@
           <w:rFonts w:ascii="Times New Roman" w:hAnsi="Times New Roman" w:cs="Times New Roman"/>
           <w:szCs w:val="22"/>
         </w:rPr>
-        <w:t>, D. Dai, and L. V. Gool, “Domain adaptive faster r-</w:t>
+        <w:t xml:space="preserve">, D. Dai, and L. V. </w:t>
+      </w:r>
+      <w:proofErr w:type="spellStart"/>
+      <w:r>
+        <w:rPr>
+          <w:rFonts w:ascii="Times New Roman" w:hAnsi="Times New Roman" w:cs="Times New Roman"/>
+          <w:szCs w:val="22"/>
+        </w:rPr>
+        <w:t>Gool</w:t>
+      </w:r>
+      <w:proofErr w:type="spellEnd"/>
+      <w:r>
+        <w:rPr>
+          <w:rFonts w:ascii="Times New Roman" w:hAnsi="Times New Roman" w:cs="Times New Roman"/>
+          <w:szCs w:val="22"/>
+        </w:rPr>
+        <w:t>, “Domain adaptive faster r-</w:t>
       </w:r>
       <w:proofErr w:type="spellStart"/>
       <w:r>
@@ -21752,7 +23965,6 @@
           <w:rFonts w:ascii="Times New Roman" w:hAnsi="Times New Roman" w:cs="Times New Roman"/>
           <w:szCs w:val="22"/>
         </w:rPr>
-        <w:lastRenderedPageBreak/>
         <w:t>Semantic ima</w:t>
       </w:r>
       <w:r>
@@ -21837,7 +24049,23 @@
           <w:rFonts w:ascii="Times New Roman" w:hAnsi="Times New Roman" w:cs="Times New Roman"/>
           <w:szCs w:val="22"/>
         </w:rPr>
-        <w:t>F. Yu and V. Koltun, “Multi-scale context aggregation by dilated</w:t>
+        <w:t xml:space="preserve">F. Yu and V. </w:t>
+      </w:r>
+      <w:proofErr w:type="spellStart"/>
+      <w:r>
+        <w:rPr>
+          <w:rFonts w:ascii="Times New Roman" w:hAnsi="Times New Roman" w:cs="Times New Roman"/>
+          <w:szCs w:val="22"/>
+        </w:rPr>
+        <w:t>Koltun</w:t>
+      </w:r>
+      <w:proofErr w:type="spellEnd"/>
+      <w:r>
+        <w:rPr>
+          <w:rFonts w:ascii="Times New Roman" w:hAnsi="Times New Roman" w:cs="Times New Roman"/>
+          <w:szCs w:val="22"/>
+        </w:rPr>
+        <w:t>, “Multi-scale context aggregation by dilated</w:t>
       </w:r>
       <w:r>
         <w:rPr>
@@ -21905,7 +24133,55 @@
           <w:rFonts w:ascii="Times New Roman" w:hAnsi="Times New Roman" w:cs="Times New Roman"/>
           <w:szCs w:val="22"/>
         </w:rPr>
-        <w:t>, B. Romera-Paredes, V. Vineet, Z. Su, D. Du, C. Huang, and P. H. Torr, “Conditional random fields as recurrent neural networks,” in Proceedings of the IEEE International Conference on Computer Vision, 2015, pp. 1529–1537.</w:t>
+        <w:t xml:space="preserve">, B. </w:t>
+      </w:r>
+      <w:proofErr w:type="spellStart"/>
+      <w:r>
+        <w:rPr>
+          <w:rFonts w:ascii="Times New Roman" w:hAnsi="Times New Roman" w:cs="Times New Roman"/>
+          <w:szCs w:val="22"/>
+        </w:rPr>
+        <w:t>Romera</w:t>
+      </w:r>
+      <w:proofErr w:type="spellEnd"/>
+      <w:r>
+        <w:rPr>
+          <w:rFonts w:ascii="Times New Roman" w:hAnsi="Times New Roman" w:cs="Times New Roman"/>
+          <w:szCs w:val="22"/>
+        </w:rPr>
+        <w:t xml:space="preserve">-Paredes, V. </w:t>
+      </w:r>
+      <w:proofErr w:type="spellStart"/>
+      <w:r>
+        <w:rPr>
+          <w:rFonts w:ascii="Times New Roman" w:hAnsi="Times New Roman" w:cs="Times New Roman"/>
+          <w:szCs w:val="22"/>
+        </w:rPr>
+        <w:t>Vineet</w:t>
+      </w:r>
+      <w:proofErr w:type="spellEnd"/>
+      <w:r>
+        <w:rPr>
+          <w:rFonts w:ascii="Times New Roman" w:hAnsi="Times New Roman" w:cs="Times New Roman"/>
+          <w:szCs w:val="22"/>
+        </w:rPr>
+        <w:t xml:space="preserve">, Z. Su, D. Du, C. Huang, and P. H. </w:t>
+      </w:r>
+      <w:proofErr w:type="spellStart"/>
+      <w:r>
+        <w:rPr>
+          <w:rFonts w:ascii="Times New Roman" w:hAnsi="Times New Roman" w:cs="Times New Roman"/>
+          <w:szCs w:val="22"/>
+        </w:rPr>
+        <w:t>Torr</w:t>
+      </w:r>
+      <w:proofErr w:type="spellEnd"/>
+      <w:r>
+        <w:rPr>
+          <w:rFonts w:ascii="Times New Roman" w:hAnsi="Times New Roman" w:cs="Times New Roman"/>
+          <w:szCs w:val="22"/>
+        </w:rPr>
+        <w:t>, “Conditional random fields as recurrent neural networks,” in Proceedings of the IEEE International Conference on Computer Vision, 2015, pp. 1529–1537.</w:t>
       </w:r>
     </w:p>
     <w:p>
@@ -21927,7 +24203,23 @@
           <w:rFonts w:ascii="Times New Roman" w:hAnsi="Times New Roman" w:cs="Times New Roman"/>
           <w:szCs w:val="22"/>
         </w:rPr>
-        <w:t>W. Liu, A. Rabinovich, and A. C. Berg, “</w:t>
+        <w:t xml:space="preserve">W. Liu, A. </w:t>
+      </w:r>
+      <w:proofErr w:type="spellStart"/>
+      <w:r>
+        <w:rPr>
+          <w:rFonts w:ascii="Times New Roman" w:hAnsi="Times New Roman" w:cs="Times New Roman"/>
+          <w:szCs w:val="22"/>
+        </w:rPr>
+        <w:t>Rabinovich</w:t>
+      </w:r>
+      <w:proofErr w:type="spellEnd"/>
+      <w:r>
+        <w:rPr>
+          <w:rFonts w:ascii="Times New Roman" w:hAnsi="Times New Roman" w:cs="Times New Roman"/>
+          <w:szCs w:val="22"/>
+        </w:rPr>
+        <w:t>, and A. C. Berg, “</w:t>
       </w:r>
       <w:proofErr w:type="spellStart"/>
       <w:r>
@@ -21981,7 +24273,23 @@
           <w:rFonts w:ascii="Times New Roman" w:hAnsi="Times New Roman" w:cs="Times New Roman"/>
           <w:szCs w:val="22"/>
         </w:rPr>
-        <w:t>J. Long, E. Shelhamer, and T. Darrell, “Fully convolutional networks for semantic segmentation,” in Proceedings of the IEEE Conference on Computer Vision and Pattern Recognition, 2015, pp. 3431–3440.</w:t>
+        <w:t xml:space="preserve">J. Long, E. </w:t>
+      </w:r>
+      <w:proofErr w:type="spellStart"/>
+      <w:r>
+        <w:rPr>
+          <w:rFonts w:ascii="Times New Roman" w:hAnsi="Times New Roman" w:cs="Times New Roman"/>
+          <w:szCs w:val="22"/>
+        </w:rPr>
+        <w:t>Shelhamer</w:t>
+      </w:r>
+      <w:proofErr w:type="spellEnd"/>
+      <w:r>
+        <w:rPr>
+          <w:rFonts w:ascii="Times New Roman" w:hAnsi="Times New Roman" w:cs="Times New Roman"/>
+          <w:szCs w:val="22"/>
+        </w:rPr>
+        <w:t>, and T. Darrell, “Fully convolutional networks for semantic segmentation,” in Proceedings of the IEEE Conference on Computer Vision and Pattern Recognition, 2015, pp. 3431–3440.</w:t>
       </w:r>
     </w:p>
     <w:p>
@@ -22003,7 +24311,23 @@
           <w:rFonts w:ascii="Times New Roman" w:hAnsi="Times New Roman" w:cs="Times New Roman"/>
           <w:szCs w:val="22"/>
         </w:rPr>
-        <w:t xml:space="preserve">A. Kendall, V. Badrinarayanan, and R. </w:t>
+        <w:t xml:space="preserve">A. Kendall, V. </w:t>
+      </w:r>
+      <w:proofErr w:type="spellStart"/>
+      <w:r>
+        <w:rPr>
+          <w:rFonts w:ascii="Times New Roman" w:hAnsi="Times New Roman" w:cs="Times New Roman"/>
+          <w:szCs w:val="22"/>
+        </w:rPr>
+        <w:t>Badrinarayanan</w:t>
+      </w:r>
+      <w:proofErr w:type="spellEnd"/>
+      <w:r>
+        <w:rPr>
+          <w:rFonts w:ascii="Times New Roman" w:hAnsi="Times New Roman" w:cs="Times New Roman"/>
+          <w:szCs w:val="22"/>
+        </w:rPr>
+        <w:t xml:space="preserve">, and R. </w:t>
       </w:r>
       <w:proofErr w:type="spellStart"/>
       <w:r>
@@ -22089,7 +24413,39 @@
           <w:rFonts w:ascii="Times New Roman" w:hAnsi="Times New Roman" w:cs="Times New Roman"/>
           <w:szCs w:val="22"/>
         </w:rPr>
-        <w:t xml:space="preserve">B. Shuai, Z. Zuo, G. Wang, and B. Wang, “Dag-recurrent neural networks for scene labeling,” </w:t>
+        <w:t xml:space="preserve">B. </w:t>
+      </w:r>
+      <w:proofErr w:type="spellStart"/>
+      <w:r>
+        <w:rPr>
+          <w:rFonts w:ascii="Times New Roman" w:hAnsi="Times New Roman" w:cs="Times New Roman"/>
+          <w:szCs w:val="22"/>
+        </w:rPr>
+        <w:t>Shuai</w:t>
+      </w:r>
+      <w:proofErr w:type="spellEnd"/>
+      <w:r>
+        <w:rPr>
+          <w:rFonts w:ascii="Times New Roman" w:hAnsi="Times New Roman" w:cs="Times New Roman"/>
+          <w:szCs w:val="22"/>
+        </w:rPr>
+        <w:t xml:space="preserve">, Z. </w:t>
+      </w:r>
+      <w:proofErr w:type="spellStart"/>
+      <w:r>
+        <w:rPr>
+          <w:rFonts w:ascii="Times New Roman" w:hAnsi="Times New Roman" w:cs="Times New Roman"/>
+          <w:szCs w:val="22"/>
+        </w:rPr>
+        <w:t>Zuo</w:t>
+      </w:r>
+      <w:proofErr w:type="spellEnd"/>
+      <w:r>
+        <w:rPr>
+          <w:rFonts w:ascii="Times New Roman" w:hAnsi="Times New Roman" w:cs="Times New Roman"/>
+          <w:szCs w:val="22"/>
+        </w:rPr>
+        <w:t xml:space="preserve">, G. Wang, and B. Wang, “Dag-recurrent neural networks for scene labeling,” </w:t>
       </w:r>
       <w:proofErr w:type="spellStart"/>
       <w:r>
@@ -22134,7 +24490,23 @@
           <w:rFonts w:ascii="Times New Roman" w:hAnsi="Times New Roman" w:cs="Times New Roman"/>
           <w:szCs w:val="22"/>
         </w:rPr>
-        <w:t xml:space="preserve">P. H. Pinheiro and R. </w:t>
+        <w:t xml:space="preserve">P. H. </w:t>
+      </w:r>
+      <w:proofErr w:type="spellStart"/>
+      <w:r>
+        <w:rPr>
+          <w:rFonts w:ascii="Times New Roman" w:hAnsi="Times New Roman" w:cs="Times New Roman"/>
+          <w:szCs w:val="22"/>
+        </w:rPr>
+        <w:t>Pinheiro</w:t>
+      </w:r>
+      <w:proofErr w:type="spellEnd"/>
+      <w:r>
+        <w:rPr>
+          <w:rFonts w:ascii="Times New Roman" w:hAnsi="Times New Roman" w:cs="Times New Roman"/>
+          <w:szCs w:val="22"/>
+        </w:rPr>
+        <w:t xml:space="preserve"> and R. </w:t>
       </w:r>
       <w:proofErr w:type="spellStart"/>
       <w:r>
@@ -22172,7 +24544,23 @@
           <w:rFonts w:ascii="Times New Roman" w:hAnsi="Times New Roman" w:cs="Times New Roman"/>
           <w:szCs w:val="22"/>
         </w:rPr>
-        <w:t xml:space="preserve">W. Byeon, T. M. </w:t>
+        <w:t xml:space="preserve">W. </w:t>
+      </w:r>
+      <w:proofErr w:type="spellStart"/>
+      <w:r>
+        <w:rPr>
+          <w:rFonts w:ascii="Times New Roman" w:hAnsi="Times New Roman" w:cs="Times New Roman"/>
+          <w:szCs w:val="22"/>
+        </w:rPr>
+        <w:t>Byeon</w:t>
+      </w:r>
+      <w:proofErr w:type="spellEnd"/>
+      <w:r>
+        <w:rPr>
+          <w:rFonts w:ascii="Times New Roman" w:hAnsi="Times New Roman" w:cs="Times New Roman"/>
+          <w:szCs w:val="22"/>
+        </w:rPr>
+        <w:t xml:space="preserve">, T. M. </w:t>
       </w:r>
       <w:proofErr w:type="spellStart"/>
       <w:r>
@@ -22188,7 +24576,23 @@
           <w:rFonts w:ascii="Times New Roman" w:hAnsi="Times New Roman" w:cs="Times New Roman"/>
           <w:szCs w:val="22"/>
         </w:rPr>
-        <w:t xml:space="preserve">, F. Raue, and M. </w:t>
+        <w:t xml:space="preserve">, F. </w:t>
+      </w:r>
+      <w:proofErr w:type="spellStart"/>
+      <w:r>
+        <w:rPr>
+          <w:rFonts w:ascii="Times New Roman" w:hAnsi="Times New Roman" w:cs="Times New Roman"/>
+          <w:szCs w:val="22"/>
+        </w:rPr>
+        <w:t>Raue</w:t>
+      </w:r>
+      <w:proofErr w:type="spellEnd"/>
+      <w:r>
+        <w:rPr>
+          <w:rFonts w:ascii="Times New Roman" w:hAnsi="Times New Roman" w:cs="Times New Roman"/>
+          <w:szCs w:val="22"/>
+        </w:rPr>
+        <w:t xml:space="preserve">, and M. </w:t>
       </w:r>
       <w:proofErr w:type="spellStart"/>
       <w:r>
@@ -22242,7 +24646,23 @@
           <w:rFonts w:ascii="Times New Roman" w:hAnsi="Times New Roman" w:cs="Times New Roman"/>
           <w:szCs w:val="22"/>
         </w:rPr>
-        <w:t xml:space="preserve">V. Badrinarayanan, A. Kendall, and R. </w:t>
+        <w:t xml:space="preserve">V. </w:t>
+      </w:r>
+      <w:proofErr w:type="spellStart"/>
+      <w:r>
+        <w:rPr>
+          <w:rFonts w:ascii="Times New Roman" w:hAnsi="Times New Roman" w:cs="Times New Roman"/>
+          <w:szCs w:val="22"/>
+        </w:rPr>
+        <w:t>Badrinarayanan</w:t>
+      </w:r>
+      <w:proofErr w:type="spellEnd"/>
+      <w:r>
+        <w:rPr>
+          <w:rFonts w:ascii="Times New Roman" w:hAnsi="Times New Roman" w:cs="Times New Roman"/>
+          <w:szCs w:val="22"/>
+        </w:rPr>
+        <w:t xml:space="preserve">, A. Kendall, and R. </w:t>
       </w:r>
       <w:proofErr w:type="spellStart"/>
       <w:r>
@@ -22328,7 +24748,39 @@
           <w:rFonts w:ascii="Times New Roman" w:hAnsi="Times New Roman" w:cs="Times New Roman"/>
           <w:szCs w:val="22"/>
         </w:rPr>
-        <w:t xml:space="preserve">, M. Ciccone, A. Romero, K. Kastner, K. Cho, Y. </w:t>
+        <w:t xml:space="preserve">, M. </w:t>
+      </w:r>
+      <w:proofErr w:type="spellStart"/>
+      <w:r>
+        <w:rPr>
+          <w:rFonts w:ascii="Times New Roman" w:hAnsi="Times New Roman" w:cs="Times New Roman"/>
+          <w:szCs w:val="22"/>
+        </w:rPr>
+        <w:t>Ciccone</w:t>
+      </w:r>
+      <w:proofErr w:type="spellEnd"/>
+      <w:r>
+        <w:rPr>
+          <w:rFonts w:ascii="Times New Roman" w:hAnsi="Times New Roman" w:cs="Times New Roman"/>
+          <w:szCs w:val="22"/>
+        </w:rPr>
+        <w:t xml:space="preserve">, A. Romero, K. </w:t>
+      </w:r>
+      <w:proofErr w:type="spellStart"/>
+      <w:r>
+        <w:rPr>
+          <w:rFonts w:ascii="Times New Roman" w:hAnsi="Times New Roman" w:cs="Times New Roman"/>
+          <w:szCs w:val="22"/>
+        </w:rPr>
+        <w:t>Kastner</w:t>
+      </w:r>
+      <w:proofErr w:type="spellEnd"/>
+      <w:r>
+        <w:rPr>
+          <w:rFonts w:ascii="Times New Roman" w:hAnsi="Times New Roman" w:cs="Times New Roman"/>
+          <w:szCs w:val="22"/>
+        </w:rPr>
+        <w:t xml:space="preserve">, K. Cho, Y. </w:t>
       </w:r>
       <w:proofErr w:type="spellStart"/>
       <w:r>
@@ -22344,7 +24796,23 @@
           <w:rFonts w:ascii="Times New Roman" w:hAnsi="Times New Roman" w:cs="Times New Roman"/>
           <w:szCs w:val="22"/>
         </w:rPr>
-        <w:t xml:space="preserve">, M. Matteucci, and A. </w:t>
+        <w:t xml:space="preserve">, M. </w:t>
+      </w:r>
+      <w:proofErr w:type="spellStart"/>
+      <w:r>
+        <w:rPr>
+          <w:rFonts w:ascii="Times New Roman" w:hAnsi="Times New Roman" w:cs="Times New Roman"/>
+          <w:szCs w:val="22"/>
+        </w:rPr>
+        <w:t>Matteucci</w:t>
+      </w:r>
+      <w:proofErr w:type="spellEnd"/>
+      <w:r>
+        <w:rPr>
+          <w:rFonts w:ascii="Times New Roman" w:hAnsi="Times New Roman" w:cs="Times New Roman"/>
+          <w:szCs w:val="22"/>
+        </w:rPr>
+        <w:t xml:space="preserve">, and A. </w:t>
       </w:r>
       <w:proofErr w:type="spellStart"/>
       <w:r>
@@ -22414,7 +24882,23 @@
           <w:rFonts w:ascii="Times New Roman" w:hAnsi="Times New Roman" w:cs="Times New Roman"/>
           <w:szCs w:val="22"/>
         </w:rPr>
-        <w:t xml:space="preserve">, A. Chaurasia, S. Kim, and E. </w:t>
+        <w:t xml:space="preserve">, A. </w:t>
+      </w:r>
+      <w:proofErr w:type="spellStart"/>
+      <w:r>
+        <w:rPr>
+          <w:rFonts w:ascii="Times New Roman" w:hAnsi="Times New Roman" w:cs="Times New Roman"/>
+          <w:szCs w:val="22"/>
+        </w:rPr>
+        <w:t>Chaurasia</w:t>
+      </w:r>
+      <w:proofErr w:type="spellEnd"/>
+      <w:r>
+        <w:rPr>
+          <w:rFonts w:ascii="Times New Roman" w:hAnsi="Times New Roman" w:cs="Times New Roman"/>
+          <w:szCs w:val="22"/>
+        </w:rPr>
+        <w:t xml:space="preserve">, S. Kim, and E. </w:t>
       </w:r>
       <w:proofErr w:type="spellStart"/>
       <w:r>
@@ -22464,91 +24948,12 @@
         </w:rPr>
         <w:t xml:space="preserve"> preprint arXiv:1606.02147, 201</w:t>
       </w:r>
-    </w:p>
-    <w:p>
-      <w:pPr>
-        <w:pStyle w:val="ListParagraph"/>
-        <w:numPr>
-          <w:ilvl w:val="0"/>
-          <w:numId w:val="2"/>
-        </w:numPr>
-        <w:ind w:left="360"/>
-        <w:jc w:val="both"/>
-        <w:rPr>
-          <w:rFonts w:ascii="Times New Roman" w:hAnsi="Times New Roman" w:cs="Times New Roman"/>
-          <w:szCs w:val="22"/>
-        </w:rPr>
-      </w:pPr>
-      <w:r>
-        <w:rPr>
-          <w:rFonts w:ascii="Times New Roman" w:hAnsi="Times New Roman" w:cs="Times New Roman"/>
-          <w:szCs w:val="22"/>
-        </w:rPr>
-        <w:t xml:space="preserve">L. Chen, G. Papandreou, I. Kokkinos, K. Murphy, and A. L. </w:t>
-      </w:r>
-      <w:proofErr w:type="spellStart"/>
-      <w:r>
-        <w:rPr>
-          <w:rFonts w:ascii="Times New Roman" w:hAnsi="Times New Roman" w:cs="Times New Roman"/>
-          <w:szCs w:val="22"/>
-        </w:rPr>
-        <w:t>Yuille</w:t>
-      </w:r>
-      <w:proofErr w:type="spellEnd"/>
-      <w:r>
-        <w:rPr>
-          <w:rFonts w:ascii="Times New Roman" w:hAnsi="Times New Roman" w:cs="Times New Roman"/>
-          <w:szCs w:val="22"/>
-        </w:rPr>
-        <w:t>, “</w:t>
-      </w:r>
-      <w:proofErr w:type="spellStart"/>
-      <w:r>
-        <w:rPr>
-          <w:rFonts w:ascii="Times New Roman" w:hAnsi="Times New Roman" w:cs="Times New Roman"/>
-          <w:szCs w:val="22"/>
-        </w:rPr>
-        <w:t>DeepLab</w:t>
-      </w:r>
-      <w:proofErr w:type="spellEnd"/>
-      <w:r>
-        <w:rPr>
-          <w:rFonts w:ascii="Times New Roman" w:hAnsi="Times New Roman" w:cs="Times New Roman"/>
-          <w:szCs w:val="22"/>
-        </w:rPr>
-        <w:t xml:space="preserve">: Semantic image segmentation with deep convolutional nets, </w:t>
-      </w:r>
-      <w:proofErr w:type="spellStart"/>
-      <w:r>
-        <w:rPr>
-          <w:rFonts w:ascii="Times New Roman" w:hAnsi="Times New Roman" w:cs="Times New Roman"/>
-          <w:szCs w:val="22"/>
-        </w:rPr>
-        <w:t>atrous</w:t>
-      </w:r>
-      <w:proofErr w:type="spellEnd"/>
-      <w:r>
-        <w:rPr>
-          <w:rFonts w:ascii="Times New Roman" w:hAnsi="Times New Roman" w:cs="Times New Roman"/>
-          <w:szCs w:val="22"/>
-        </w:rPr>
-        <w:t xml:space="preserve"> convolution, and fully connected CRFs,” </w:t>
-      </w:r>
-      <w:proofErr w:type="spellStart"/>
-      <w:r>
-        <w:rPr>
-          <w:rFonts w:ascii="Times New Roman" w:hAnsi="Times New Roman" w:cs="Times New Roman"/>
-          <w:szCs w:val="22"/>
-        </w:rPr>
-        <w:t>arXiv</w:t>
-      </w:r>
-      <w:proofErr w:type="spellEnd"/>
-      <w:r>
-        <w:rPr>
-          <w:rFonts w:ascii="Times New Roman" w:hAnsi="Times New Roman" w:cs="Times New Roman"/>
-          <w:szCs w:val="22"/>
-        </w:rPr>
-        <w:t xml:space="preserve">, vol. 1606.00915, 2017. </w:t>
+      <w:r>
+        <w:rPr>
+          <w:rFonts w:ascii="Times New Roman" w:hAnsi="Times New Roman" w:cs="Times New Roman"/>
+          <w:szCs w:val="22"/>
+        </w:rPr>
+        <w:t xml:space="preserve"> </w:t>
       </w:r>
     </w:p>
     <w:sectPr>
@@ -22608,7 +25013,7 @@
       <w:rPr>
         <w:noProof/>
       </w:rPr>
-      <w:t>21</w:t>
+      <w:t>34</w:t>
     </w:r>
     <w:r>
       <w:rPr>
@@ -26212,7 +28617,7 @@
 </file>
 
 <file path=customXml/itemProps1.xml><?xml version="1.0" encoding="utf-8"?>
-<ds:datastoreItem xmlns:ds="http://schemas.openxmlformats.org/officeDocument/2006/customXml" ds:itemID="{186C1A78-1190-448A-9254-0F1A9BF334C6}">
+<ds:datastoreItem xmlns:ds="http://schemas.openxmlformats.org/officeDocument/2006/customXml" ds:itemID="{07E1AA15-7991-4A29-9949-23443356F140}">
   <ds:schemaRefs>
     <ds:schemaRef ds:uri="http://schemas.openxmlformats.org/officeDocument/2006/bibliography"/>
   </ds:schemaRefs>

</xml_diff>